<commit_message>
feat: Ban Mong - 16.912 tam pin theo bang Revit CT-BP, vat tu be pin, hop 40x60 gia cuong tai neo tren 6 ban ve khung
- So tam pin tung be theo bang cac to CT-BP-01..06 (BO TRI BE PIN HO BAN MONG.pdf, 30/10): 16.912 tam; store v22.
  Tinh lai catalogue, thuyet minh, bang tinh, ban ve neo, thong ke neo, vat tu neo: BE 6 152,1 kN PES-48.
- Hop 40x60 gia cuong tai neo ve tren 6 to khung CT-KC-BE (buildHuoiVanhRaftReinforcement.py --lake=ban-mong,
  goc xoay bam truc khung): 315 cum, 599 thanh, 8.911 m; DWG khung co gia cuong + so do GC-01.
- Bang thong ke vat tu be pin 6 be (buildBanMongRaftBOQ.py): tam pin / phao / inverter / phao do cap theo bang Revit,
  C52 va hop do tren CAD khop bang to khung.
- Dinh kem web muc 1-20 cung thu tu Huoi Vanh.

Co-Authored-By: Claude Opus 5.5 <noreply@anthropic.com>
</commit_message>
<xml_diff>
--- a/docs/mat-bang-neo-ban-mong/THUYET_MINH_TINH_TOAN.docx
+++ b/docs/mat-bang-neo-ban-mong/THUYET_MINH_TINH_TOAN.docx
@@ -386,7 +386,7 @@
           <w:szCs w:val="24"/>
           <w:lang w:val="vi-VN"/>
         </w:rPr>
-        <w:t xml:space="preserve">Diện tích đón gió của pin: A = số tấm × diện tích tấm × sin(nghiêng) = 4.177 × 3,106 × sin 10° = 2.253 m².</w:t>
+        <w:t xml:space="preserve">Diện tích đón gió của pin: A = số tấm × diện tích tấm × sin(nghiêng) = 4.200 × 3,106 × sin 10° = 2.265 m².</w:t>
       </w:r>
     </w:p>
     <w:p>
@@ -448,7 +448,7 @@
           <w:szCs w:val="24"/>
           <w:lang w:val="vi-VN"/>
         </w:rPr>
-        <w:t xml:space="preserve"> × A × hệ số che chắn = 250 × 1,15 × 2.253 × 0,55 = 356,2 kN.</w:t>
+        <w:t xml:space="preserve"> × A × hệ số che chắn = 250 × 1,15 × 2.265 × 0,55 = 358,2 kN.</w:t>
       </w:r>
     </w:p>
     <w:p>
@@ -489,7 +489,7 @@
           <w:szCs w:val="24"/>
           <w:lang w:val="vi-VN"/>
         </w:rPr>
-        <w:t xml:space="preserve"> = 17,7 kN. Tổng gió: 374,0 kN.</w:t>
+        <w:t xml:space="preserve"> = 17,7 kN. Tổng gió: 375,9 kN.</w:t>
       </w:r>
     </w:p>
     <w:p>
@@ -509,7 +509,7 @@
           <w:szCs w:val="24"/>
           <w:lang w:val="vi-VN"/>
         </w:rPr>
-        <w:t xml:space="preserve">Tổng lực môi trường: F = 374,0 × 1,05 = 392,7 kN.</w:t>
+        <w:t xml:space="preserve">Tổng lực môi trường: F = 375,9 × 1,05 = 394,7 kN.</w:t>
       </w:r>
     </w:p>
     <w:p>
@@ -693,7 +693,7 @@
           <w:szCs w:val="24"/>
           <w:lang w:val="vi-VN"/>
         </w:rPr>
-        <w:t xml:space="preserve"> là chiều dài dây lúc vừa căng. Cáp PES-40: EA = 15 × 475 = 7.125 kN. Dây càng ngắn (L</w:t>
+        <w:t xml:space="preserve"> là chiều dài dây lúc vừa căng. Cáp PES-48: EA = 15 × 688 = 10.320 kN. Dây càng ngắn (L</w:t>
       </w:r>
       <w:r>
         <w:rPr>
@@ -775,7 +775,7 @@
           <w:szCs w:val="24"/>
           <w:lang w:val="vi-VN"/>
         </w:rPr>
-        <w:t xml:space="preserve">BÈ 6 (bè có lực dây lớn nhất): F = 392,7 kN; chi phối ở mực nước 649,50 m, tải đẩy về hướng 300°, dây B6-D06 chịu 145,4 kN, 28 dây cùng căng; bè trôi 0,49 m. Mất dây B6-D06: dây lớn nhất còn lại 128,6 kN.</w:t>
+        <w:t xml:space="preserve">BÈ 6 (bè có lực dây lớn nhất): F = 394,7 kN; chi phối ở mực nước 649,50 m, tải đẩy về hướng 300°, dây B6-D06 chịu 147,1 kN, 28 dây cùng căng; bè trôi 0,34 m. Mất dây B6-D06: dây lớn nhất còn lại 130,3 kN.</w:t>
       </w:r>
     </w:p>
     <w:p>
@@ -795,7 +795,7 @@
           <w:szCs w:val="24"/>
           <w:lang w:val="vi-VN"/>
         </w:rPr>
-        <w:t xml:space="preserve">Lực dây thiết kế của BÈ 6: T = 150,4 kN (đã cộng lực căng trước 5 kN; không nhỏ hơn F / (n × cos α) = 80,6 kN); khi đứt một dây: 133,6 kN. Cáp và cọc bờ của bè kiểm tra với lực này; mỗi đế vít xoắn kiểm tra với lực lớn nhất của chính (các) dây nối vào nó (bao mọi hướng, mọi mực nước).</w:t>
+        <w:t xml:space="preserve">Lực dây thiết kế của BÈ 6: T = 152,1 kN (đã cộng lực căng trước 5 kN; không nhỏ hơn F / (n × cos α) = 81,0 kN); khi đứt một dây: 135,3 kN. Cáp và cọc bờ của bè kiểm tra với lực này; mỗi đế vít xoắn kiểm tra với lực lớn nhất của chính (các) dây nối vào nó (bao mọi hướng, mọi mực nước).</w:t>
       </w:r>
     </w:p>
     <w:p>
@@ -815,7 +815,7 @@
           <w:szCs w:val="24"/>
           <w:lang w:val="vi-VN"/>
         </w:rPr>
-        <w:t xml:space="preserve">Cáp PES-40, lực đứt 475 kN: hệ số an toàn MBL / T = 475 / 150,4 = 3,16 (yêu cầu ≥ 3,0); khi đứt một dây 475 / 133,6 = 3,56 (yêu cầu ≥ 2,0).</w:t>
+        <w:t xml:space="preserve">Cáp PES-48, lực đứt 688 kN: hệ số an toàn MBL / T = 688 / 152,1 = 4,52 (yêu cầu ≥ 3,0); khi đứt một dây 688 / 135,3 = 5,09 (yêu cầu ≥ 2,0).</w:t>
       </w:r>
     </w:p>
     <w:p>
@@ -875,7 +875,7 @@
           <w:szCs w:val="24"/>
           <w:lang w:val="vi-VN"/>
         </w:rPr>
-        <w:t xml:space="preserve">Độ trôi bè lớn nhất (mọi hướng, mọi mực nước): 0,5 – 0,8 m tùy bè (kiểm tra C12: ≤ nửa khoảng hở nhỏ nhất tới bè bên cạnh).</w:t>
+        <w:t xml:space="preserve">Độ trôi bè lớn nhất (mọi hướng, mọi mực nước): 0,4 – 0,8 m tùy bè (kiểm tra C12: ≤ nửa khoảng hở nhỏ nhất tới bè bên cạnh).</w:t>
       </w:r>
     </w:p>
     <w:p>
@@ -1164,7 +1164,7 @@
           <w:szCs w:val="24"/>
           <w:lang w:val="vi-VN"/>
         </w:rPr>
-        <w:t xml:space="preserve"> / 2,5 = 116,1 kN ≥ T = 150,4 kN; mức sử dụng = 150,4 / 116,1 = 0,64.</w:t>
+        <w:t xml:space="preserve"> / 2,5 = 116,1 kN ≥ T = 152,1 kN; mức sử dụng = 152,1 / 116,1 = 0,65.</w:t>
       </w:r>
     </w:p>
     <w:p>
@@ -1205,7 +1205,7 @@
           <w:szCs w:val="24"/>
           <w:lang w:val="vi-VN"/>
         </w:rPr>
-        <w:t xml:space="preserve"> = P × (e + 1,5D + 0,5 × P / p) = 150,4 × (0,10 + 0,525 + 0,5 × 150,4 / 126,0) = 69,0 kNm.</w:t>
+        <w:t xml:space="preserve"> = P × (e + 1,5D + 0,5 × P / p) = 152,1 × (0,10 + 0,525 + 0,5 × 152,1 / 126,0) = 69,7 kNm.</w:t>
       </w:r>
     </w:p>
     <w:p>
@@ -1329,7 +1329,7 @@
           <w:szCs w:val="24"/>
           <w:lang w:val="vi-VN"/>
         </w:rPr>
-        <w:t xml:space="preserve"> = 1,2 × 69,0 = 82,7 kNm ≤ M</w:t>
+        <w:t xml:space="preserve"> = 1,2 × 69,7 = 83,6 kNm ≤ M</w:t>
       </w:r>
       <w:r>
         <w:rPr>
@@ -1350,7 +1350,7 @@
           <w:szCs w:val="24"/>
           <w:lang w:val="vi-VN"/>
         </w:rPr>
-        <w:t xml:space="preserve"> = 93,3 kNm; mức sử dụng 0,89 (1,2 là hệ số tải trọng khi kiểm tra uốn).</w:t>
+        <w:t xml:space="preserve"> = 93,3 kNm; mức sử dụng 0,90 (1,2 là hệ số tải trọng khi kiểm tra uốn).</w:t>
       </w:r>
     </w:p>
     <w:p>
@@ -1370,7 +1370,7 @@
           <w:szCs w:val="24"/>
           <w:lang w:val="vi-VN"/>
         </w:rPr>
-        <w:t xml:space="preserve">Cọc ĐƠN theo lực của chính dây (như đế neo đáy): ở BÈ 5 27/27 điểm, BÈ 6 45/45 điểm, lực lớn nhất của CHÍNH dây (mọi mực nước, mọi hướng gió, cộng lực căng trước) không quá 77,2 kN (BÈ 5), 74,8 kN (BÈ 6) nên dùng một cọc 6Φ28 CB400-V, L</w:t>
+        <w:t xml:space="preserve">Cọc ĐƠN theo lực của chính dây (như đế neo đáy): ở BÈ 5 27/27 điểm, BÈ 6 45/45 điểm, lực lớn nhất của CHÍNH dây (mọi mực nước, mọi hướng gió, cộng lực căng trước) không quá 77,0 kN (BÈ 5), 75,4 kN (BÈ 6) nên dùng một cọc 6Φ28 CB400-V, L</w:t>
       </w:r>
       <w:r>
         <w:rPr>
@@ -1391,7 +1391,7 @@
           <w:szCs w:val="24"/>
           <w:lang w:val="vi-VN"/>
         </w:rPr>
-        <w:t xml:space="preserve"> 6,5 m (BP-1 0,67 / 0,64, BP-2 0,93 / 0,89); chỉ các dây lực lớn hơn mới dùng cọc của bè. Lực bè T ở trên là lực bất lợi nhất của bè, có sàn F/(6 cos 30°).</w:t>
+        <w:t xml:space="preserve"> 6,5 m (BP-1 0,66 / 0,65, BP-2 0,92 / 0,90); chỉ các dây lực lớn hơn mới dùng cọc của bè. Lực bè T ở trên là lực bất lợi nhất của bè, có sàn F/(6 cos 30°).</w:t>
       </w:r>
     </w:p>
     <w:p>
@@ -1430,7 +1430,7 @@
           <w:szCs w:val="26"/>
           <w:lang w:val="vi-VN"/>
         </w:rPr>
-        <w:t xml:space="preserve">6. Đế BTCT + vít xoắn (ví dụ BM-DV023, đế làm việc nặng nhất)</w:t>
+        <w:t xml:space="preserve">6. Đế BTCT + vít xoắn (ví dụ BM-DV003, đế làm việc nặng nhất)</w:t>
       </w:r>
     </w:p>
     <w:p>
@@ -1596,7 +1596,7 @@
           <w:szCs w:val="24"/>
           <w:lang w:val="vi-VN"/>
         </w:rPr>
-        <w:t xml:space="preserve">Đế BM-DV023 giữ hai dây B4-D05 (BÈ 4, T = 61,5 kN, dài 15,56 m) và B5-D11 (BÈ 5, T = 54,2 kN, dài 15,57 m). Bích bè cao hơn mặt nước 0,35 m.</w:t>
+        <w:t xml:space="preserve">Đế BM-DV003 giữ hai dây B1-D12 (BÈ 1, T = 51,1 kN, dài 15,66 m) và B2-D26 (BÈ 2, T = 53,5 kN, dài 15,68 m). Bích bè cao hơn mặt nước 0,35 m.</w:t>
       </w:r>
     </w:p>
     <w:p>
@@ -1699,7 +1699,7 @@
           <w:szCs w:val="24"/>
           <w:lang w:val="vi-VN"/>
         </w:rPr>
-        <w:t xml:space="preserve"> = 93,3 kN (hai dây cộng lại), lực ngang T</w:t>
+        <w:t xml:space="preserve"> = 83,5 kN (hai dây cộng lại), lực ngang T</w:t>
       </w:r>
       <w:r>
         <w:rPr>
@@ -1720,7 +1720,7 @@
           <w:szCs w:val="24"/>
           <w:lang w:val="vi-VN"/>
         </w:rPr>
-        <w:t xml:space="preserve"> = 4,3 kN (cộng véc-tơ).</w:t>
+        <w:t xml:space="preserve"> = 1,5 kN (cộng véc-tơ).</w:t>
       </w:r>
     </w:p>
     <w:p>
@@ -1740,7 +1740,7 @@
           <w:szCs w:val="24"/>
           <w:lang w:val="vi-VN"/>
         </w:rPr>
-        <w:t xml:space="preserve">Đế 3,25 × 3,25 × 0,5 m: thể tích 5,28 m³, nặng 132,0 kN trên cạn, W' = 5,28 × (25 − 10) = 79,2 kN trong nước (đã trừ lực đẩy nổi).</w:t>
+        <w:t xml:space="preserve">Đế 3,25 × 3,25 × 0,4 m: thể tích 4,23 m³, nặng 105,6 kN trên cạn, W' = 4,23 × (25 − 10) = 63,4 kN trong nước (đã trừ lực đẩy nổi).</w:t>
       </w:r>
     </w:p>
     <w:p>
@@ -1802,7 +1802,7 @@
           <w:szCs w:val="24"/>
           <w:lang w:val="vi-VN"/>
         </w:rPr>
-        <w:t xml:space="preserve"> = 103,0 kN; mức sử dụng 0,91.</w:t>
+        <w:t xml:space="preserve"> = 88,7 kN; mức sử dụng 0,94.</w:t>
       </w:r>
     </w:p>
     <w:p>
@@ -1948,7 +1948,7 @@
           <w:szCs w:val="24"/>
           <w:lang w:val="vi-VN"/>
         </w:rPr>
-        <w:t xml:space="preserve"> một vít = 15,0 kN (Broms, đầu tự do ở mặt bùn). 1,5 × 4,3 = 6,4 ≤ 79,7 kN; mức sử dụng 0,45.</w:t>
+        <w:t xml:space="preserve"> một vít = 15,0 kN (Broms, đầu tự do ở mặt bùn). 1,5 × 1,5 = 2,2 ≤ 79,7 kN; mức sử dụng 0,39.</w:t>
       </w:r>
     </w:p>
     <w:p>
@@ -2052,7 +2052,7 @@
           <w:szCs w:val="24"/>
           <w:lang w:val="vi-VN"/>
         </w:rPr>
-        <w:t xml:space="preserve"> × B / 2 = 4,3 × (0,5 + 0,15) + 93,3 × 3,25 / 2 = 154,4 kNm; M</w:t>
+        <w:t xml:space="preserve"> × B / 2 = 1,5 × (0,4 + 0,15) + 83,5 × 3,25 / 2 = 136,5 kNm; M</w:t>
       </w:r>
       <w:r>
         <w:rPr>
@@ -2115,7 +2115,7 @@
           <w:szCs w:val="24"/>
           <w:lang w:val="vi-VN"/>
         </w:rPr>
-        <w:t xml:space="preserve"> × c = 231,6 kNm (c = 0,15 m từ mép đế tới tim lỗ vít). 1,5 × 154,4 = 231,6 ≤ 231,6 kNm; mức sử dụng 1,00.</w:t>
+        <w:t xml:space="preserve"> × c = 205,9 kNm (c = 0,15 m từ mép đế tới tim lỗ vít). 1,5 × 136,5 = 204,8 ≤ 205,9 kNm; mức sử dụng 0,99.</w:t>
       </w:r>
     </w:p>
     <w:p>
@@ -2198,7 +2198,7 @@
           <w:szCs w:val="24"/>
           <w:lang w:val="vi-VN"/>
         </w:rPr>
-        <w:t xml:space="preserve"> − 0,9 × W' × B / 2) / (B − c) / (n/2)] = 6,2 kN ≤ Q</w:t>
+        <w:t xml:space="preserve"> − 0,9 × W' × B / 2) / (B − c) / (n/2)] = 7,1 kN ≤ Q</w:t>
       </w:r>
       <w:r>
         <w:rPr>
@@ -2219,7 +2219,7 @@
           <w:szCs w:val="24"/>
           <w:lang w:val="vi-VN"/>
         </w:rPr>
-        <w:t xml:space="preserve"> = 7,9 kN; mức sử dụng 0,79.</w:t>
+        <w:t xml:space="preserve"> = 7,9 kN; mức sử dụng 0,89.</w:t>
       </w:r>
     </w:p>
     <w:p>
@@ -2239,7 +2239,7 @@
           <w:szCs w:val="24"/>
           <w:lang w:val="vi-VN"/>
         </w:rPr>
-        <w:t xml:space="preserve">SV-5 áp lực lên nền bùn: W' / B² = 7,5 kPa ≤ 5,14 × c</w:t>
+        <w:t xml:space="preserve">SV-5 áp lực lên nền bùn: W' / B² = 6,0 kPa ≤ 5,14 × c</w:t>
       </w:r>
       <w:r>
         <w:rPr>
@@ -2260,7 +2260,7 @@
           <w:szCs w:val="24"/>
           <w:lang w:val="vi-VN"/>
         </w:rPr>
-        <w:t xml:space="preserve"> / 2,5 = 41,1 kPa (sức chịu tải giới hạn của nền sét mềm); mức sử dụng 0,18.</w:t>
+        <w:t xml:space="preserve"> / 2,5 = 41,1 kPa (sức chịu tải giới hạn của nền sét mềm); mức sử dụng 0,15.</w:t>
       </w:r>
     </w:p>
     <w:p>
@@ -2364,7 +2364,7 @@
           <w:szCs w:val="24"/>
           <w:lang w:val="vi-VN"/>
         </w:rPr>
-        <w:t xml:space="preserve">) = 136 mm²/m, tối thiểu 0,1% = 450 mm²/m; bố trí lưới Ø12 a200 hai lớp = 565 mm²/m; mức sử dụng 0,80.</w:t>
+        <w:t xml:space="preserve">) = 175 mm²/m, tối thiểu 0,1% = 350 mm²/m; bố trí lưới Ø12 a200 hai lớp = 565 mm²/m; mức sử dụng 0,62.</w:t>
       </w:r>
     </w:p>
     <w:p>
@@ -2384,7 +2384,7 @@
           <w:szCs w:val="24"/>
           <w:lang w:val="vi-VN"/>
         </w:rPr>
-        <w:t xml:space="preserve">Cả hệ: 35 đế (10 đế 2,50 m, 1 đế 2,75 m, 5 đế 3,00 m, 6 đế 3,25 m, 3 đế 3,50 m, 2 đế 3,75 m, 6 đế 4,00 m, 1 đế 4,75 m, 1 đế 5,25 m), 173,3 m³ bê tông, 7,2 tấn thép bản, 140 vít (523 m), đế nặng nhất khi cẩu 35,1 tấn.</w:t>
+        <w:t xml:space="preserve">Cả hệ: 35 đế (10 đế 2,50 m, 1 đế 2,75 m, 6 đế 3,00 m, 5 đế 3,25 m, 3 đế 3,50 m, 1 đế 3,75 m, 6 đế 4,00 m, 1 đế 4,25 m, 1 đế 4,75 m, 1 đế 5,25 m), 173,6 m³ bê tông, 7,3 tấn thép bản, 140 vít (523 m), đế nặng nhất khi cẩu 35,1 tấn.</w:t>
       </w:r>
     </w:p>
     <w:p>
@@ -2404,7 +2404,7 @@
           <w:szCs w:val="24"/>
           <w:lang w:val="vi-VN"/>
         </w:rPr>
-        <w:t xml:space="preserve">Tổng lực nhổ lên 35 đế 2.692 kN, tổng sức chống nhổ 3.457 kN. Mức sử dụng lớn nhất: nhổ 0,96, trượt 0,82, lật 1,00, một vít 0,96.</w:t>
+        <w:t xml:space="preserve">Tổng lực nhổ lên 35 đế 2.693 kN, tổng sức chống nhổ 3.461 kN. Mức sử dụng lớn nhất: nhổ 0,96, trượt 0,82, lật 0,99, một vít 0,96.</w:t>
       </w:r>
     </w:p>
     <w:p>
@@ -2522,7 +2522,7 @@
           <w:szCs w:val="24"/>
           <w:lang w:val="vi-VN"/>
         </w:rPr>
-        <w:t xml:space="preserve">Nếu khóa của thiết bị bù KHÔNG khóa kịp, đối trọng chỉ giữ lực căng 5 kN và hành trình dư 3 m mỗi chiều: bè trôi 4,3–6,7 m (tới hết hành trình rồi dây mới căng) và lực dây vọt tới 91–359 kN (hệ số an toàn cáp chỉ 1,3–3,4; đế và cọc không được tính cho lực này). Đối trọng treo tự do KHÔNG đủ giữ bè: cần bộ khóa / phanh chủ động, dự phòng, kiểm tra định kỳ.</w:t>
+        <w:t xml:space="preserve">Nếu khóa của thiết bị bù KHÔNG khóa kịp, đối trọng chỉ giữ lực căng 5 kN và hành trình dư 3 m mỗi chiều: bè trôi 4,3–6,7 m (tới hết hành trình rồi dây mới căng) và lực dây vọt tới 89–379 kN (hệ số an toàn cáp chỉ 1,6–3,4; đế và cọc không được tính cho lực này). Đối trọng treo tự do KHÔNG đủ giữ bè: cần bộ khóa / phanh chủ động, dự phòng, kiểm tra định kỳ.</w:t>
       </w:r>
     </w:p>
     <w:p>
@@ -2928,7 +2928,7 @@
           <w:szCs w:val="24"/>
           <w:lang w:val="vi-VN"/>
         </w:rPr>
-        <w:t xml:space="preserve"> là lực lớn nhất một dây phải chịu (mô hình cân bằng, đã cộng lực căng trước); [SF] = 3 khi đủ dây. Kết quả BÈ 6: ĐẠT: giá trị 3,16, yêu cầu 3, mức sử dụng 0,95.</w:t>
+        <w:t xml:space="preserve"> là lực lớn nhất một dây phải chịu (mô hình cân bằng, đã cộng lực căng trước); [SF] = 3 khi đủ dây. Kết quả BÈ 6: ĐẠT: giá trị 4,52, yêu cầu 3, mức sử dụng 0,66.</w:t>
       </w:r>
     </w:p>
     <w:p>
@@ -3239,7 +3239,7 @@
           <w:szCs w:val="24"/>
           <w:lang w:val="vi-VN"/>
         </w:rPr>
-        <w:t xml:space="preserve">,dam là lực lớn nhất trong các dây còn lại khi dây chịu lực lớn nhất bị đứt (tính lại ở mọi mực nước); [SF] = 2. Kết quả BÈ 6: ĐẠT: giá trị 3,56, yêu cầu 2, mức sử dụng 0,56.</w:t>
+        <w:t xml:space="preserve">,dam là lực lớn nhất trong các dây còn lại khi dây chịu lực lớn nhất bị đứt (tính lại ở mọi mực nước); [SF] = 2. Kết quả BÈ 6: ĐẠT: giá trị 5,09, yêu cầu 2, mức sử dụng 0,39.</w:t>
       </w:r>
     </w:p>
     <w:p>
@@ -3529,7 +3529,7 @@
           <w:szCs w:val="24"/>
           <w:lang w:val="vi-VN"/>
         </w:rPr>
-        <w:t xml:space="preserve"> là độ trôi ngang lớn nhất của bè trong mô hình cân bằng (mọi hướng, mọi mực nước); hai bè cạnh nhau có thể cùng trôi về phía nhau nên mỗi bè chỉ được trôi nửa khe hở. Kết quả BÈ 6: ĐẠT: giá trị 0,59 m, yêu cầu ≤ 18,63 m, mức sử dụng 0,03.</w:t>
+        <w:t xml:space="preserve"> là độ trôi ngang lớn nhất của bè trong mô hình cân bằng (mọi hướng, mọi mực nước); hai bè cạnh nhau có thể cùng trôi về phía nhau nên mỗi bè chỉ được trôi nửa khe hở. Kết quả BÈ 6: ĐẠT: giá trị 0,41 m, yêu cầu ≤ 18,63 m, mức sử dụng 0,02.</w:t>
       </w:r>
     </w:p>
     <w:p>
@@ -3946,7 +3946,7 @@
           <w:szCs w:val="24"/>
           <w:lang w:val="vi-VN"/>
         </w:rPr>
-        <w:t xml:space="preserve"> là sức chịu ngang giới hạn theo Broms (mục 5). Kết quả BÈ 6: ĐẠT: giá trị 0,720, yêu cầu ≤ 1,0, mức sử dụng 0,72.</w:t>
+        <w:t xml:space="preserve"> là sức chịu ngang giới hạn theo Broms (mục 5). Kết quả BÈ 6: ĐẠT: giá trị 0,728, yêu cầu ≤ 1,0, mức sử dụng 0,73.</w:t>
       </w:r>
     </w:p>
     <w:p>
@@ -4050,7 +4050,7 @@
           <w:szCs w:val="24"/>
           <w:lang w:val="vi-VN"/>
         </w:rPr>
-        <w:t xml:space="preserve"> là khả năng chịu uốn của lồng thép theo TCVN 5574:2018 (mục 5). Kết quả BÈ 6: ĐẠT: giá trị 0,827, yêu cầu ≤ 1,0, mức sử dụng 0,83.</w:t>
+        <w:t xml:space="preserve"> là khả năng chịu uốn của lồng thép theo TCVN 5574:2018 (mục 5). Kết quả BÈ 6: ĐẠT: giá trị 0,840, yêu cầu ≤ 1,0, mức sử dụng 0,84.</w:t>
       </w:r>
     </w:p>
     <w:p>
@@ -4361,7 +4361,7 @@
           <w:szCs w:val="24"/>
           <w:lang w:val="vi-VN"/>
         </w:rPr>
-        <w:t xml:space="preserve"> là sức chịu nhổ cho phép của các vít (mục 6). Kết quả BÈ 6: ĐẠT: giá trị 0,681, yêu cầu ≤ 1,0, mức sử dụng 0,68.</w:t>
+        <w:t xml:space="preserve"> là sức chịu nhổ cho phép của các vít (mục 6). Kết quả BÈ 6: ĐẠT: giá trị 0,688, yêu cầu ≤ 1,0, mức sử dụng 0,69.</w:t>
       </w:r>
     </w:p>
     <w:p>
@@ -4528,7 +4528,7 @@
           <w:szCs w:val="24"/>
           <w:lang w:val="vi-VN"/>
         </w:rPr>
-        <w:t xml:space="preserve"> (mục 6). Kết quả BÈ 6: ĐẠT: giá trị 0,661, yêu cầu ≤ 1,0, mức sử dụng 0,66.</w:t>
+        <w:t xml:space="preserve"> (mục 6). Kết quả BÈ 6: ĐẠT: giá trị 0,669, yêu cầu ≤ 1,0, mức sử dụng 0,67.</w:t>
       </w:r>
     </w:p>
     <w:p>
@@ -4632,7 +4632,7 @@
           <w:szCs w:val="24"/>
           <w:lang w:val="vi-VN"/>
         </w:rPr>
-        <w:t xml:space="preserve"> là mô-men giữ do trọng lượng đế và các vít (mục 6). Kết quả BÈ 6: ĐẠT: giá trị 0,950, yêu cầu ≤ 1,0, mức sử dụng 0,95.</w:t>
+        <w:t xml:space="preserve"> là mô-men giữ do trọng lượng đế và các vít (mục 6). Kết quả BÈ 6: ĐẠT: giá trị 0,961, yêu cầu ≤ 1,0, mức sử dụng 0,96.</w:t>
       </w:r>
     </w:p>
     <w:p>
@@ -4736,7 +4736,7 @@
           <w:szCs w:val="24"/>
           <w:lang w:val="vi-VN"/>
         </w:rPr>
-        <w:t xml:space="preserve"> là sức chịu nhổ cho phép của một vít (mục 6). Kết quả BÈ 6: ĐẠT: giá trị 0,005, yêu cầu ≤ 1,0, mức sử dụng 0,00.</w:t>
+        <w:t xml:space="preserve"> là sức chịu nhổ cho phép của một vít (mục 6). Kết quả BÈ 6: ĐẠT: giá trị 0,055, yêu cầu ≤ 1,0, mức sử dụng 0,06.</w:t>
       </w:r>
     </w:p>
     <w:p>
@@ -5285,7 +5285,7 @@
                 <w:szCs w:val="18"/>
                 <w:lang w:val="vi-VN"/>
               </w:rPr>
-              <w:t xml:space="preserve">276,2</w:t>
+              <w:t xml:space="preserve">276,0</w:t>
             </w:r>
           </w:p>
         </w:tc>
@@ -5537,26 +5537,26 @@
                 <w:szCs w:val="18"/>
                 <w:lang w:val="vi-VN"/>
               </w:rPr>
-              <w:t xml:space="preserve">395,5</w:t>
-            </w:r>
-          </w:p>
-        </w:tc>
-        <w:tc>
-          <w:p>
-            <w:pPr>
-              <w:jc w:val="center"/>
-            </w:pPr>
-            <w:r>
-              <w:rPr>
-                <w:rFonts w:ascii="Times New Roman" w:cs="Times New Roman" w:eastAsia="Times New Roman" w:hAnsi="Times New Roman"/>
-                <w:b w:val="false"/>
-                <w:bCs w:val="false"/>
-                <w:noProof/>
-                <w:sz w:val="18"/>
-                <w:szCs w:val="18"/>
-                <w:lang w:val="vi-VN"/>
-              </w:rPr>
-              <w:t xml:space="preserve">81,1</w:t>
+              <w:t xml:space="preserve">396,3</w:t>
+            </w:r>
+          </w:p>
+        </w:tc>
+        <w:tc>
+          <w:p>
+            <w:pPr>
+              <w:jc w:val="center"/>
+            </w:pPr>
+            <w:r>
+              <w:rPr>
+                <w:rFonts w:ascii="Times New Roman" w:cs="Times New Roman" w:eastAsia="Times New Roman" w:hAnsi="Times New Roman"/>
+                <w:b w:val="false"/>
+                <w:bCs w:val="false"/>
+                <w:noProof/>
+                <w:sz w:val="18"/>
+                <w:szCs w:val="18"/>
+                <w:lang w:val="vi-VN"/>
+              </w:rPr>
+              <w:t xml:space="preserve">81,3</w:t>
             </w:r>
           </w:p>
         </w:tc>
@@ -5594,7 +5594,7 @@
                 <w:szCs w:val="18"/>
                 <w:lang w:val="vi-VN"/>
               </w:rPr>
-              <w:t xml:space="preserve">3,76</w:t>
+              <w:t xml:space="preserve">3,75</w:t>
             </w:r>
           </w:p>
         </w:tc>
@@ -5789,26 +5789,26 @@
                 <w:szCs w:val="18"/>
                 <w:lang w:val="vi-VN"/>
               </w:rPr>
-              <w:t xml:space="preserve">70,8</w:t>
-            </w:r>
-          </w:p>
-        </w:tc>
-        <w:tc>
-          <w:p>
-            <w:pPr>
-              <w:jc w:val="center"/>
-            </w:pPr>
-            <w:r>
-              <w:rPr>
-                <w:rFonts w:ascii="Times New Roman" w:cs="Times New Roman" w:eastAsia="Times New Roman" w:hAnsi="Times New Roman"/>
-                <w:b w:val="false"/>
-                <w:bCs w:val="false"/>
-                <w:noProof/>
-                <w:sz w:val="18"/>
-                <w:szCs w:val="18"/>
-                <w:lang w:val="vi-VN"/>
-              </w:rPr>
-              <w:t xml:space="preserve">77,6</w:t>
+              <w:t xml:space="preserve">69,6</w:t>
+            </w:r>
+          </w:p>
+        </w:tc>
+        <w:tc>
+          <w:p>
+            <w:pPr>
+              <w:jc w:val="center"/>
+            </w:pPr>
+            <w:r>
+              <w:rPr>
+                <w:rFonts w:ascii="Times New Roman" w:cs="Times New Roman" w:eastAsia="Times New Roman" w:hAnsi="Times New Roman"/>
+                <w:b w:val="false"/>
+                <w:bCs w:val="false"/>
+                <w:noProof/>
+                <w:sz w:val="18"/>
+                <w:szCs w:val="18"/>
+                <w:lang w:val="vi-VN"/>
+              </w:rPr>
+              <w:t xml:space="preserve">76,5</w:t>
             </w:r>
           </w:p>
         </w:tc>
@@ -5846,7 +5846,7 @@
                 <w:szCs w:val="18"/>
                 <w:lang w:val="vi-VN"/>
               </w:rPr>
-              <w:t xml:space="preserve">3,93</w:t>
+              <w:t xml:space="preserve">3,99</w:t>
             </w:r>
           </w:p>
         </w:tc>
@@ -5941,26 +5941,26 @@
                 <w:szCs w:val="18"/>
                 <w:lang w:val="vi-VN"/>
               </w:rPr>
-              <w:t xml:space="preserve">0,67</w:t>
-            </w:r>
-          </w:p>
-        </w:tc>
-        <w:tc>
-          <w:p>
-            <w:pPr>
-              <w:jc w:val="center"/>
-            </w:pPr>
-            <w:r>
-              <w:rPr>
-                <w:rFonts w:ascii="Times New Roman" w:cs="Times New Roman" w:eastAsia="Times New Roman" w:hAnsi="Times New Roman"/>
-                <w:b w:val="false"/>
-                <w:bCs w:val="false"/>
-                <w:noProof/>
-                <w:sz w:val="18"/>
-                <w:szCs w:val="18"/>
-                <w:lang w:val="vi-VN"/>
-              </w:rPr>
-              <w:t xml:space="preserve">0,93</w:t>
+              <w:t xml:space="preserve">0,66</w:t>
+            </w:r>
+          </w:p>
+        </w:tc>
+        <w:tc>
+          <w:p>
+            <w:pPr>
+              <w:jc w:val="center"/>
+            </w:pPr>
+            <w:r>
+              <w:rPr>
+                <w:rFonts w:ascii="Times New Roman" w:cs="Times New Roman" w:eastAsia="Times New Roman" w:hAnsi="Times New Roman"/>
+                <w:b w:val="false"/>
+                <w:bCs w:val="false"/>
+                <w:noProof/>
+                <w:sz w:val="18"/>
+                <w:szCs w:val="18"/>
+                <w:lang w:val="vi-VN"/>
+              </w:rPr>
+              <w:t xml:space="preserve">0,91</w:t>
             </w:r>
           </w:p>
         </w:tc>
@@ -6041,26 +6041,26 @@
                 <w:szCs w:val="18"/>
                 <w:lang w:val="vi-VN"/>
               </w:rPr>
-              <w:t xml:space="preserve">200,1</w:t>
-            </w:r>
-          </w:p>
-        </w:tc>
-        <w:tc>
-          <w:p>
-            <w:pPr>
-              <w:jc w:val="center"/>
-            </w:pPr>
-            <w:r>
-              <w:rPr>
-                <w:rFonts w:ascii="Times New Roman" w:cs="Times New Roman" w:eastAsia="Times New Roman" w:hAnsi="Times New Roman"/>
-                <w:b w:val="false"/>
-                <w:bCs w:val="false"/>
-                <w:noProof/>
-                <w:sz w:val="18"/>
-                <w:szCs w:val="18"/>
-                <w:lang w:val="vi-VN"/>
-              </w:rPr>
-              <w:t xml:space="preserve">82,6</w:t>
+              <w:t xml:space="preserve">200,5</w:t>
+            </w:r>
+          </w:p>
+        </w:tc>
+        <w:tc>
+          <w:p>
+            <w:pPr>
+              <w:jc w:val="center"/>
+            </w:pPr>
+            <w:r>
+              <w:rPr>
+                <w:rFonts w:ascii="Times New Roman" w:cs="Times New Roman" w:eastAsia="Times New Roman" w:hAnsi="Times New Roman"/>
+                <w:b w:val="false"/>
+                <w:bCs w:val="false"/>
+                <w:noProof/>
+                <w:sz w:val="18"/>
+                <w:szCs w:val="18"/>
+                <w:lang w:val="vi-VN"/>
+              </w:rPr>
+              <w:t xml:space="preserve">82,8</w:t>
             </w:r>
           </w:p>
         </w:tc>
@@ -6212,7 +6212,7 @@
                 <w:szCs w:val="18"/>
                 <w:lang w:val="vi-VN"/>
               </w:rPr>
-              <w:t xml:space="preserve">0,81</w:t>
+              <w:t xml:space="preserve">0,82</w:t>
             </w:r>
           </w:p>
         </w:tc>
@@ -6293,26 +6293,26 @@
                 <w:szCs w:val="18"/>
                 <w:lang w:val="vi-VN"/>
               </w:rPr>
-              <w:t xml:space="preserve">264,6</w:t>
-            </w:r>
-          </w:p>
-        </w:tc>
-        <w:tc>
-          <w:p>
-            <w:pPr>
-              <w:jc w:val="center"/>
-            </w:pPr>
-            <w:r>
-              <w:rPr>
-                <w:rFonts w:ascii="Times New Roman" w:cs="Times New Roman" w:eastAsia="Times New Roman" w:hAnsi="Times New Roman"/>
-                <w:b w:val="false"/>
-                <w:bCs w:val="false"/>
-                <w:noProof/>
-                <w:sz w:val="18"/>
-                <w:szCs w:val="18"/>
-                <w:lang w:val="vi-VN"/>
-              </w:rPr>
-              <w:t xml:space="preserve">106,2</w:t>
+              <w:t xml:space="preserve">263,8</w:t>
+            </w:r>
+          </w:p>
+        </w:tc>
+        <w:tc>
+          <w:p>
+            <w:pPr>
+              <w:jc w:val="center"/>
+            </w:pPr>
+            <w:r>
+              <w:rPr>
+                <w:rFonts w:ascii="Times New Roman" w:cs="Times New Roman" w:eastAsia="Times New Roman" w:hAnsi="Times New Roman"/>
+                <w:b w:val="false"/>
+                <w:bCs w:val="false"/>
+                <w:noProof/>
+                <w:sz w:val="18"/>
+                <w:szCs w:val="18"/>
+                <w:lang w:val="vi-VN"/>
+              </w:rPr>
+              <w:t xml:space="preserve">105,9</w:t>
             </w:r>
           </w:p>
         </w:tc>
@@ -6350,7 +6350,7 @@
                 <w:szCs w:val="18"/>
                 <w:lang w:val="vi-VN"/>
               </w:rPr>
-              <w:t xml:space="preserve">3,62</w:t>
+              <w:t xml:space="preserve">3,63</w:t>
             </w:r>
           </w:p>
         </w:tc>
@@ -6445,26 +6445,26 @@
                 <w:szCs w:val="18"/>
                 <w:lang w:val="vi-VN"/>
               </w:rPr>
-              <w:t xml:space="preserve">0,67</w:t>
-            </w:r>
-          </w:p>
-        </w:tc>
-        <w:tc>
-          <w:p>
-            <w:pPr>
-              <w:jc w:val="center"/>
-            </w:pPr>
-            <w:r>
-              <w:rPr>
-                <w:rFonts w:ascii="Times New Roman" w:cs="Times New Roman" w:eastAsia="Times New Roman" w:hAnsi="Times New Roman"/>
-                <w:b w:val="false"/>
-                <w:bCs w:val="false"/>
-                <w:noProof/>
-                <w:sz w:val="18"/>
-                <w:szCs w:val="18"/>
-                <w:lang w:val="vi-VN"/>
-              </w:rPr>
-              <w:t xml:space="preserve">0,93</w:t>
+              <w:t xml:space="preserve">0,66</w:t>
+            </w:r>
+          </w:p>
+        </w:tc>
+        <w:tc>
+          <w:p>
+            <w:pPr>
+              <w:jc w:val="center"/>
+            </w:pPr>
+            <w:r>
+              <w:rPr>
+                <w:rFonts w:ascii="Times New Roman" w:cs="Times New Roman" w:eastAsia="Times New Roman" w:hAnsi="Times New Roman"/>
+                <w:b w:val="false"/>
+                <w:bCs w:val="false"/>
+                <w:noProof/>
+                <w:sz w:val="18"/>
+                <w:szCs w:val="18"/>
+                <w:lang w:val="vi-VN"/>
+              </w:rPr>
+              <w:t xml:space="preserve">0,92</w:t>
             </w:r>
           </w:p>
         </w:tc>
@@ -6545,64 +6545,64 @@
                 <w:szCs w:val="18"/>
                 <w:lang w:val="vi-VN"/>
               </w:rPr>
-              <w:t xml:space="preserve">392,7</w:t>
-            </w:r>
-          </w:p>
-        </w:tc>
-        <w:tc>
-          <w:p>
-            <w:pPr>
-              <w:jc w:val="center"/>
-            </w:pPr>
-            <w:r>
-              <w:rPr>
-                <w:rFonts w:ascii="Times New Roman" w:cs="Times New Roman" w:eastAsia="Times New Roman" w:hAnsi="Times New Roman"/>
-                <w:b w:val="false"/>
-                <w:bCs w:val="false"/>
-                <w:noProof/>
-                <w:sz w:val="18"/>
-                <w:szCs w:val="18"/>
-                <w:lang w:val="vi-VN"/>
-              </w:rPr>
-              <w:t xml:space="preserve">150,4</w:t>
-            </w:r>
-          </w:p>
-        </w:tc>
-        <w:tc>
-          <w:p>
-            <w:pPr>
-              <w:jc w:val="center"/>
-            </w:pPr>
-            <w:r>
-              <w:rPr>
-                <w:rFonts w:ascii="Times New Roman" w:cs="Times New Roman" w:eastAsia="Times New Roman" w:hAnsi="Times New Roman"/>
-                <w:b w:val="false"/>
-                <w:bCs w:val="false"/>
-                <w:noProof/>
-                <w:sz w:val="18"/>
-                <w:szCs w:val="18"/>
-                <w:lang w:val="vi-VN"/>
-              </w:rPr>
-              <w:t xml:space="preserve">PES-40</w:t>
-            </w:r>
-          </w:p>
-        </w:tc>
-        <w:tc>
-          <w:p>
-            <w:pPr>
-              <w:jc w:val="center"/>
-            </w:pPr>
-            <w:r>
-              <w:rPr>
-                <w:rFonts w:ascii="Times New Roman" w:cs="Times New Roman" w:eastAsia="Times New Roman" w:hAnsi="Times New Roman"/>
-                <w:b w:val="false"/>
-                <w:bCs w:val="false"/>
-                <w:noProof/>
-                <w:sz w:val="18"/>
-                <w:szCs w:val="18"/>
-                <w:lang w:val="vi-VN"/>
-              </w:rPr>
-              <w:t xml:space="preserve">3,16</w:t>
+              <w:t xml:space="preserve">394,7</w:t>
+            </w:r>
+          </w:p>
+        </w:tc>
+        <w:tc>
+          <w:p>
+            <w:pPr>
+              <w:jc w:val="center"/>
+            </w:pPr>
+            <w:r>
+              <w:rPr>
+                <w:rFonts w:ascii="Times New Roman" w:cs="Times New Roman" w:eastAsia="Times New Roman" w:hAnsi="Times New Roman"/>
+                <w:b w:val="false"/>
+                <w:bCs w:val="false"/>
+                <w:noProof/>
+                <w:sz w:val="18"/>
+                <w:szCs w:val="18"/>
+                <w:lang w:val="vi-VN"/>
+              </w:rPr>
+              <w:t xml:space="preserve">152,1</w:t>
+            </w:r>
+          </w:p>
+        </w:tc>
+        <w:tc>
+          <w:p>
+            <w:pPr>
+              <w:jc w:val="center"/>
+            </w:pPr>
+            <w:r>
+              <w:rPr>
+                <w:rFonts w:ascii="Times New Roman" w:cs="Times New Roman" w:eastAsia="Times New Roman" w:hAnsi="Times New Roman"/>
+                <w:b w:val="false"/>
+                <w:bCs w:val="false"/>
+                <w:noProof/>
+                <w:sz w:val="18"/>
+                <w:szCs w:val="18"/>
+                <w:lang w:val="vi-VN"/>
+              </w:rPr>
+              <w:t xml:space="preserve">PES-48</w:t>
+            </w:r>
+          </w:p>
+        </w:tc>
+        <w:tc>
+          <w:p>
+            <w:pPr>
+              <w:jc w:val="center"/>
+            </w:pPr>
+            <w:r>
+              <w:rPr>
+                <w:rFonts w:ascii="Times New Roman" w:cs="Times New Roman" w:eastAsia="Times New Roman" w:hAnsi="Times New Roman"/>
+                <w:b w:val="false"/>
+                <w:bCs w:val="false"/>
+                <w:noProof/>
+                <w:sz w:val="18"/>
+                <w:szCs w:val="18"/>
+                <w:lang w:val="vi-VN"/>
+              </w:rPr>
+              <w:t xml:space="preserve">4,52</w:t>
             </w:r>
           </w:p>
         </w:tc>
@@ -6697,26 +6697,26 @@
                 <w:szCs w:val="18"/>
                 <w:lang w:val="vi-VN"/>
               </w:rPr>
-              <w:t xml:space="preserve">0,64</w:t>
-            </w:r>
-          </w:p>
-        </w:tc>
-        <w:tc>
-          <w:p>
-            <w:pPr>
-              <w:jc w:val="center"/>
-            </w:pPr>
-            <w:r>
-              <w:rPr>
-                <w:rFonts w:ascii="Times New Roman" w:cs="Times New Roman" w:eastAsia="Times New Roman" w:hAnsi="Times New Roman"/>
-                <w:b w:val="false"/>
-                <w:bCs w:val="false"/>
-                <w:noProof/>
-                <w:sz w:val="18"/>
-                <w:szCs w:val="18"/>
-                <w:lang w:val="vi-VN"/>
-              </w:rPr>
-              <w:t xml:space="preserve">0,89</w:t>
+              <w:t xml:space="preserve">0,65</w:t>
+            </w:r>
+          </w:p>
+        </w:tc>
+        <w:tc>
+          <w:p>
+            <w:pPr>
+              <w:jc w:val="center"/>
+            </w:pPr>
+            <w:r>
+              <w:rPr>
+                <w:rFonts w:ascii="Times New Roman" w:cs="Times New Roman" w:eastAsia="Times New Roman" w:hAnsi="Times New Roman"/>
+                <w:b w:val="false"/>
+                <w:bCs w:val="false"/>
+                <w:noProof/>
+                <w:sz w:val="18"/>
+                <w:szCs w:val="18"/>
+                <w:lang w:val="vi-VN"/>
+              </w:rPr>
+              <w:t xml:space="preserve">0,90</w:t>
             </w:r>
           </w:p>
         </w:tc>
@@ -8181,7 +8181,7 @@
                 <w:szCs w:val="18"/>
                 <w:lang w:val="vi-VN"/>
               </w:rPr>
-              <w:t xml:space="preserve">0,44</w:t>
+              <w:t xml:space="preserve">0,45</w:t>
             </w:r>
           </w:p>
         </w:tc>
@@ -8376,7 +8376,7 @@
                 <w:szCs w:val="18"/>
                 <w:lang w:val="vi-VN"/>
               </w:rPr>
-              <w:t xml:space="preserve">67,3</w:t>
+              <w:t xml:space="preserve">67,2</w:t>
             </w:r>
           </w:p>
         </w:tc>
@@ -8609,7 +8609,7 @@
                 <w:szCs w:val="18"/>
                 <w:lang w:val="vi-VN"/>
               </w:rPr>
-              <w:t xml:space="preserve">76,4</w:t>
+              <w:t xml:space="preserve">76,5</w:t>
             </w:r>
           </w:p>
         </w:tc>
@@ -8842,7 +8842,7 @@
                 <w:szCs w:val="18"/>
                 <w:lang w:val="vi-VN"/>
               </w:rPr>
-              <w:t xml:space="preserve">80,8</w:t>
+              <w:t xml:space="preserve">80,9</w:t>
             </w:r>
           </w:p>
         </w:tc>
@@ -8880,7 +8880,7 @@
                 <w:szCs w:val="18"/>
                 <w:lang w:val="vi-VN"/>
               </w:rPr>
-              <w:t xml:space="preserve">0,37</w:t>
+              <w:t xml:space="preserve">0,38</w:t>
             </w:r>
           </w:p>
         </w:tc>
@@ -8918,7 +8918,7 @@
                 <w:szCs w:val="18"/>
                 <w:lang w:val="vi-VN"/>
               </w:rPr>
-              <w:t xml:space="preserve">0,82</w:t>
+              <w:t xml:space="preserve">0,83</w:t>
             </w:r>
           </w:p>
         </w:tc>
@@ -9075,7 +9075,7 @@
                 <w:szCs w:val="18"/>
                 <w:lang w:val="vi-VN"/>
               </w:rPr>
-              <w:t xml:space="preserve">76,8</w:t>
+              <w:t xml:space="preserve">76,9</w:t>
             </w:r>
           </w:p>
         </w:tc>
@@ -9113,7 +9113,7 @@
                 <w:szCs w:val="18"/>
                 <w:lang w:val="vi-VN"/>
               </w:rPr>
-              <w:t xml:space="preserve">0,37</w:t>
+              <w:t xml:space="preserve">0,38</w:t>
             </w:r>
           </w:p>
         </w:tc>
@@ -9308,7 +9308,7 @@
                 <w:szCs w:val="18"/>
                 <w:lang w:val="vi-VN"/>
               </w:rPr>
-              <w:t xml:space="preserve">67,3</w:t>
+              <w:t xml:space="preserve">67,2</w:t>
             </w:r>
           </w:p>
         </w:tc>
@@ -9541,7 +9541,7 @@
                 <w:szCs w:val="18"/>
                 <w:lang w:val="vi-VN"/>
               </w:rPr>
-              <w:t xml:space="preserve">102,4</w:t>
+              <w:t xml:space="preserve">102,6</w:t>
             </w:r>
           </w:p>
         </w:tc>
@@ -9617,7 +9617,7 @@
                 <w:szCs w:val="18"/>
                 <w:lang w:val="vi-VN"/>
               </w:rPr>
-              <w:t xml:space="preserve">0,54</w:t>
+              <w:t xml:space="preserve">0,55</w:t>
             </w:r>
           </w:p>
         </w:tc>
@@ -9774,7 +9774,7 @@
                 <w:szCs w:val="18"/>
                 <w:lang w:val="vi-VN"/>
               </w:rPr>
-              <w:t xml:space="preserve">113,1</w:t>
+              <w:t xml:space="preserve">113,3</w:t>
             </w:r>
           </w:p>
         </w:tc>
@@ -9812,7 +9812,7 @@
                 <w:szCs w:val="18"/>
                 <w:lang w:val="vi-VN"/>
               </w:rPr>
-              <w:t xml:space="preserve">0,42</w:t>
+              <w:t xml:space="preserve">0,43</w:t>
             </w:r>
           </w:p>
         </w:tc>
@@ -10240,7 +10240,7 @@
                 <w:szCs w:val="18"/>
                 <w:lang w:val="vi-VN"/>
               </w:rPr>
-              <w:t xml:space="preserve">133,8</w:t>
+              <w:t xml:space="preserve">133,1</w:t>
             </w:r>
           </w:p>
         </w:tc>
@@ -10297,26 +10297,26 @@
                 <w:szCs w:val="18"/>
                 <w:lang w:val="vi-VN"/>
               </w:rPr>
-              <w:t xml:space="preserve">0,98</w:t>
-            </w:r>
-          </w:p>
-        </w:tc>
-        <w:tc>
-          <w:p>
-            <w:pPr>
-              <w:jc w:val="center"/>
-            </w:pPr>
-            <w:r>
-              <w:rPr>
-                <w:rFonts w:ascii="Times New Roman" w:cs="Times New Roman" w:eastAsia="Times New Roman" w:hAnsi="Times New Roman"/>
-                <w:b w:val="false"/>
-                <w:bCs w:val="false"/>
-                <w:noProof/>
-                <w:sz w:val="18"/>
-                <w:szCs w:val="18"/>
-                <w:lang w:val="vi-VN"/>
-              </w:rPr>
-              <w:t xml:space="preserve">0,18</w:t>
+              <w:t xml:space="preserve">0,97</w:t>
+            </w:r>
+          </w:p>
+        </w:tc>
+        <w:tc>
+          <w:p>
+            <w:pPr>
+              <w:jc w:val="center"/>
+            </w:pPr>
+            <w:r>
+              <w:rPr>
+                <w:rFonts w:ascii="Times New Roman" w:cs="Times New Roman" w:eastAsia="Times New Roman" w:hAnsi="Times New Roman"/>
+                <w:b w:val="false"/>
+                <w:bCs w:val="false"/>
+                <w:noProof/>
+                <w:sz w:val="18"/>
+                <w:szCs w:val="18"/>
+                <w:lang w:val="vi-VN"/>
+              </w:rPr>
+              <w:t xml:space="preserve">0,16</w:t>
             </w:r>
           </w:p>
         </w:tc>
@@ -10473,26 +10473,26 @@
                 <w:szCs w:val="18"/>
                 <w:lang w:val="vi-VN"/>
               </w:rPr>
-              <w:t xml:space="preserve">116,6</w:t>
-            </w:r>
-          </w:p>
-        </w:tc>
-        <w:tc>
-          <w:p>
-            <w:pPr>
-              <w:jc w:val="center"/>
-            </w:pPr>
-            <w:r>
-              <w:rPr>
-                <w:rFonts w:ascii="Times New Roman" w:cs="Times New Roman" w:eastAsia="Times New Roman" w:hAnsi="Times New Roman"/>
-                <w:b w:val="false"/>
-                <w:bCs w:val="false"/>
-                <w:noProof/>
-                <w:sz w:val="18"/>
-                <w:szCs w:val="18"/>
-                <w:lang w:val="vi-VN"/>
-              </w:rPr>
-              <w:t xml:space="preserve">0,83</w:t>
+              <w:t xml:space="preserve">116,8</w:t>
+            </w:r>
+          </w:p>
+        </w:tc>
+        <w:tc>
+          <w:p>
+            <w:pPr>
+              <w:jc w:val="center"/>
+            </w:pPr>
+            <w:r>
+              <w:rPr>
+                <w:rFonts w:ascii="Times New Roman" w:cs="Times New Roman" w:eastAsia="Times New Roman" w:hAnsi="Times New Roman"/>
+                <w:b w:val="false"/>
+                <w:bCs w:val="false"/>
+                <w:noProof/>
+                <w:sz w:val="18"/>
+                <w:szCs w:val="18"/>
+                <w:lang w:val="vi-VN"/>
+              </w:rPr>
+              <w:t xml:space="preserve">0,84</w:t>
             </w:r>
           </w:p>
         </w:tc>
@@ -10530,26 +10530,26 @@
                 <w:szCs w:val="18"/>
                 <w:lang w:val="vi-VN"/>
               </w:rPr>
-              <w:t xml:space="preserve">0,98</w:t>
-            </w:r>
-          </w:p>
-        </w:tc>
-        <w:tc>
-          <w:p>
-            <w:pPr>
-              <w:jc w:val="center"/>
-            </w:pPr>
-            <w:r>
-              <w:rPr>
-                <w:rFonts w:ascii="Times New Roman" w:cs="Times New Roman" w:eastAsia="Times New Roman" w:hAnsi="Times New Roman"/>
-                <w:b w:val="false"/>
-                <w:bCs w:val="false"/>
-                <w:noProof/>
-                <w:sz w:val="18"/>
-                <w:szCs w:val="18"/>
-                <w:lang w:val="vi-VN"/>
-              </w:rPr>
-              <w:t xml:space="preserve">0,40</w:t>
+              <w:t xml:space="preserve">0,99</w:t>
+            </w:r>
+          </w:p>
+        </w:tc>
+        <w:tc>
+          <w:p>
+            <w:pPr>
+              <w:jc w:val="center"/>
+            </w:pPr>
+            <w:r>
+              <w:rPr>
+                <w:rFonts w:ascii="Times New Roman" w:cs="Times New Roman" w:eastAsia="Times New Roman" w:hAnsi="Times New Roman"/>
+                <w:b w:val="false"/>
+                <w:bCs w:val="false"/>
+                <w:noProof/>
+                <w:sz w:val="18"/>
+                <w:szCs w:val="18"/>
+                <w:lang w:val="vi-VN"/>
+              </w:rPr>
+              <w:t xml:space="preserve">0,41</w:t>
             </w:r>
           </w:p>
         </w:tc>
@@ -10939,7 +10939,7 @@
                 <w:szCs w:val="18"/>
                 <w:lang w:val="vi-VN"/>
               </w:rPr>
-              <w:t xml:space="preserve">77,3</w:t>
+              <w:t xml:space="preserve">77,5</w:t>
             </w:r>
           </w:p>
         </w:tc>
@@ -11015,7 +11015,7 @@
                 <w:szCs w:val="18"/>
                 <w:lang w:val="vi-VN"/>
               </w:rPr>
-              <w:t xml:space="preserve">0,70</w:t>
+              <w:t xml:space="preserve">0,71</w:t>
             </w:r>
           </w:p>
         </w:tc>
@@ -11172,7 +11172,7 @@
                 <w:szCs w:val="18"/>
                 <w:lang w:val="vi-VN"/>
               </w:rPr>
-              <w:t xml:space="preserve">59,0</w:t>
+              <w:t xml:space="preserve">59,1</w:t>
             </w:r>
           </w:p>
         </w:tc>
@@ -11405,7 +11405,7 @@
                 <w:szCs w:val="18"/>
                 <w:lang w:val="vi-VN"/>
               </w:rPr>
-              <w:t xml:space="preserve">117,6</w:t>
+              <w:t xml:space="preserve">116,7</w:t>
             </w:r>
           </w:p>
         </w:tc>
@@ -11443,45 +11443,45 @@
                 <w:szCs w:val="18"/>
                 <w:lang w:val="vi-VN"/>
               </w:rPr>
-              <w:t xml:space="preserve">0,45</w:t>
-            </w:r>
-          </w:p>
-        </w:tc>
-        <w:tc>
-          <w:p>
-            <w:pPr>
-              <w:jc w:val="center"/>
-            </w:pPr>
-            <w:r>
-              <w:rPr>
-                <w:rFonts w:ascii="Times New Roman" w:cs="Times New Roman" w:eastAsia="Times New Roman" w:hAnsi="Times New Roman"/>
-                <w:b w:val="false"/>
-                <w:bCs w:val="false"/>
-                <w:noProof/>
-                <w:sz w:val="18"/>
-                <w:szCs w:val="18"/>
-                <w:lang w:val="vi-VN"/>
-              </w:rPr>
-              <w:t xml:space="preserve">0,99</w:t>
-            </w:r>
-          </w:p>
-        </w:tc>
-        <w:tc>
-          <w:p>
-            <w:pPr>
-              <w:jc w:val="center"/>
-            </w:pPr>
-            <w:r>
-              <w:rPr>
-                <w:rFonts w:ascii="Times New Roman" w:cs="Times New Roman" w:eastAsia="Times New Roman" w:hAnsi="Times New Roman"/>
-                <w:b w:val="false"/>
-                <w:bCs w:val="false"/>
-                <w:noProof/>
-                <w:sz w:val="18"/>
-                <w:szCs w:val="18"/>
-                <w:lang w:val="vi-VN"/>
-              </w:rPr>
-              <w:t xml:space="preserve">0,43</w:t>
+              <w:t xml:space="preserve">0,44</w:t>
+            </w:r>
+          </w:p>
+        </w:tc>
+        <w:tc>
+          <w:p>
+            <w:pPr>
+              <w:jc w:val="center"/>
+            </w:pPr>
+            <w:r>
+              <w:rPr>
+                <w:rFonts w:ascii="Times New Roman" w:cs="Times New Roman" w:eastAsia="Times New Roman" w:hAnsi="Times New Roman"/>
+                <w:b w:val="false"/>
+                <w:bCs w:val="false"/>
+                <w:noProof/>
+                <w:sz w:val="18"/>
+                <w:szCs w:val="18"/>
+                <w:lang w:val="vi-VN"/>
+              </w:rPr>
+              <w:t xml:space="preserve">0,98</w:t>
+            </w:r>
+          </w:p>
+        </w:tc>
+        <w:tc>
+          <w:p>
+            <w:pPr>
+              <w:jc w:val="center"/>
+            </w:pPr>
+            <w:r>
+              <w:rPr>
+                <w:rFonts w:ascii="Times New Roman" w:cs="Times New Roman" w:eastAsia="Times New Roman" w:hAnsi="Times New Roman"/>
+                <w:b w:val="false"/>
+                <w:bCs w:val="false"/>
+                <w:noProof/>
+                <w:sz w:val="18"/>
+                <w:szCs w:val="18"/>
+                <w:lang w:val="vi-VN"/>
+              </w:rPr>
+              <w:t xml:space="preserve">0,39</w:t>
             </w:r>
           </w:p>
         </w:tc>
@@ -11638,7 +11638,7 @@
                 <w:szCs w:val="18"/>
                 <w:lang w:val="vi-VN"/>
               </w:rPr>
-              <w:t xml:space="preserve">134,1</w:t>
+              <w:t xml:space="preserve">134,4</w:t>
             </w:r>
           </w:p>
         </w:tc>
@@ -11714,7 +11714,7 @@
                 <w:szCs w:val="18"/>
                 <w:lang w:val="vi-VN"/>
               </w:rPr>
-              <w:t xml:space="preserve">0,19</w:t>
+              <w:t xml:space="preserve">0,20</w:t>
             </w:r>
           </w:p>
         </w:tc>
@@ -11871,26 +11871,26 @@
                 <w:szCs w:val="18"/>
                 <w:lang w:val="vi-VN"/>
               </w:rPr>
-              <w:t xml:space="preserve">19,3</w:t>
-            </w:r>
-          </w:p>
-        </w:tc>
-        <w:tc>
-          <w:p>
-            <w:pPr>
-              <w:jc w:val="center"/>
-            </w:pPr>
-            <w:r>
-              <w:rPr>
-                <w:rFonts w:ascii="Times New Roman" w:cs="Times New Roman" w:eastAsia="Times New Roman" w:hAnsi="Times New Roman"/>
-                <w:b w:val="false"/>
-                <w:bCs w:val="false"/>
-                <w:noProof/>
-                <w:sz w:val="18"/>
-                <w:szCs w:val="18"/>
-                <w:lang w:val="vi-VN"/>
-              </w:rPr>
-              <w:t xml:space="preserve">0,30</w:t>
+              <w:t xml:space="preserve">19,1</w:t>
+            </w:r>
+          </w:p>
+        </w:tc>
+        <w:tc>
+          <w:p>
+            <w:pPr>
+              <w:jc w:val="center"/>
+            </w:pPr>
+            <w:r>
+              <w:rPr>
+                <w:rFonts w:ascii="Times New Roman" w:cs="Times New Roman" w:eastAsia="Times New Roman" w:hAnsi="Times New Roman"/>
+                <w:b w:val="false"/>
+                <w:bCs w:val="false"/>
+                <w:noProof/>
+                <w:sz w:val="18"/>
+                <w:szCs w:val="18"/>
+                <w:lang w:val="vi-VN"/>
+              </w:rPr>
+              <w:t xml:space="preserve">0,29</w:t>
             </w:r>
           </w:p>
         </w:tc>
@@ -12104,83 +12104,83 @@
                 <w:szCs w:val="18"/>
                 <w:lang w:val="vi-VN"/>
               </w:rPr>
-              <w:t xml:space="preserve">38,4</w:t>
-            </w:r>
-          </w:p>
-        </w:tc>
-        <w:tc>
-          <w:p>
-            <w:pPr>
-              <w:jc w:val="center"/>
-            </w:pPr>
-            <w:r>
-              <w:rPr>
-                <w:rFonts w:ascii="Times New Roman" w:cs="Times New Roman" w:eastAsia="Times New Roman" w:hAnsi="Times New Roman"/>
-                <w:b w:val="false"/>
-                <w:bCs w:val="false"/>
-                <w:noProof/>
-                <w:sz w:val="18"/>
-                <w:szCs w:val="18"/>
-                <w:lang w:val="vi-VN"/>
-              </w:rPr>
-              <w:t xml:space="preserve">0,59</w:t>
-            </w:r>
-          </w:p>
-        </w:tc>
-        <w:tc>
-          <w:p>
-            <w:pPr>
-              <w:jc w:val="center"/>
-            </w:pPr>
-            <w:r>
-              <w:rPr>
-                <w:rFonts w:ascii="Times New Roman" w:cs="Times New Roman" w:eastAsia="Times New Roman" w:hAnsi="Times New Roman"/>
-                <w:b w:val="false"/>
-                <w:bCs w:val="false"/>
-                <w:noProof/>
-                <w:sz w:val="18"/>
-                <w:szCs w:val="18"/>
-                <w:lang w:val="vi-VN"/>
-              </w:rPr>
-              <w:t xml:space="preserve">0,78</w:t>
-            </w:r>
-          </w:p>
-        </w:tc>
-        <w:tc>
-          <w:p>
-            <w:pPr>
-              <w:jc w:val="center"/>
-            </w:pPr>
-            <w:r>
-              <w:rPr>
-                <w:rFonts w:ascii="Times New Roman" w:cs="Times New Roman" w:eastAsia="Times New Roman" w:hAnsi="Times New Roman"/>
-                <w:b w:val="false"/>
-                <w:bCs w:val="false"/>
-                <w:noProof/>
-                <w:sz w:val="18"/>
-                <w:szCs w:val="18"/>
-                <w:lang w:val="vi-VN"/>
-              </w:rPr>
-              <w:t xml:space="preserve">0,82</w:t>
-            </w:r>
-          </w:p>
-        </w:tc>
-        <w:tc>
-          <w:p>
-            <w:pPr>
-              <w:jc w:val="center"/>
-            </w:pPr>
-            <w:r>
-              <w:rPr>
-                <w:rFonts w:ascii="Times New Roman" w:cs="Times New Roman" w:eastAsia="Times New Roman" w:hAnsi="Times New Roman"/>
-                <w:b w:val="false"/>
-                <w:bCs w:val="false"/>
-                <w:noProof/>
-                <w:sz w:val="18"/>
-                <w:szCs w:val="18"/>
-                <w:lang w:val="vi-VN"/>
-              </w:rPr>
-              <w:t xml:space="preserve">0,73</w:t>
+              <w:t xml:space="preserve">37,8</w:t>
+            </w:r>
+          </w:p>
+        </w:tc>
+        <w:tc>
+          <w:p>
+            <w:pPr>
+              <w:jc w:val="center"/>
+            </w:pPr>
+            <w:r>
+              <w:rPr>
+                <w:rFonts w:ascii="Times New Roman" w:cs="Times New Roman" w:eastAsia="Times New Roman" w:hAnsi="Times New Roman"/>
+                <w:b w:val="false"/>
+                <w:bCs w:val="false"/>
+                <w:noProof/>
+                <w:sz w:val="18"/>
+                <w:szCs w:val="18"/>
+                <w:lang w:val="vi-VN"/>
+              </w:rPr>
+              <w:t xml:space="preserve">0,58</w:t>
+            </w:r>
+          </w:p>
+        </w:tc>
+        <w:tc>
+          <w:p>
+            <w:pPr>
+              <w:jc w:val="center"/>
+            </w:pPr>
+            <w:r>
+              <w:rPr>
+                <w:rFonts w:ascii="Times New Roman" w:cs="Times New Roman" w:eastAsia="Times New Roman" w:hAnsi="Times New Roman"/>
+                <w:b w:val="false"/>
+                <w:bCs w:val="false"/>
+                <w:noProof/>
+                <w:sz w:val="18"/>
+                <w:szCs w:val="18"/>
+                <w:lang w:val="vi-VN"/>
+              </w:rPr>
+              <w:t xml:space="preserve">0,76</w:t>
+            </w:r>
+          </w:p>
+        </w:tc>
+        <w:tc>
+          <w:p>
+            <w:pPr>
+              <w:jc w:val="center"/>
+            </w:pPr>
+            <w:r>
+              <w:rPr>
+                <w:rFonts w:ascii="Times New Roman" w:cs="Times New Roman" w:eastAsia="Times New Roman" w:hAnsi="Times New Roman"/>
+                <w:b w:val="false"/>
+                <w:bCs w:val="false"/>
+                <w:noProof/>
+                <w:sz w:val="18"/>
+                <w:szCs w:val="18"/>
+                <w:lang w:val="vi-VN"/>
+              </w:rPr>
+              <w:t xml:space="preserve">0,81</w:t>
+            </w:r>
+          </w:p>
+        </w:tc>
+        <w:tc>
+          <w:p>
+            <w:pPr>
+              <w:jc w:val="center"/>
+            </w:pPr>
+            <w:r>
+              <w:rPr>
+                <w:rFonts w:ascii="Times New Roman" w:cs="Times New Roman" w:eastAsia="Times New Roman" w:hAnsi="Times New Roman"/>
+                <w:b w:val="false"/>
+                <w:bCs w:val="false"/>
+                <w:noProof/>
+                <w:sz w:val="18"/>
+                <w:szCs w:val="18"/>
+                <w:lang w:val="vi-VN"/>
+              </w:rPr>
+              <w:t xml:space="preserve">0,70</w:t>
             </w:r>
           </w:p>
         </w:tc>
@@ -12494,159 +12494,159 @@
                 <w:szCs w:val="18"/>
                 <w:lang w:val="vi-VN"/>
               </w:rPr>
-              <w:t xml:space="preserve">3,25</w:t>
-            </w:r>
-          </w:p>
-        </w:tc>
-        <w:tc>
-          <w:p>
-            <w:pPr>
-              <w:jc w:val="center"/>
-            </w:pPr>
-            <w:r>
-              <w:rPr>
-                <w:rFonts w:ascii="Times New Roman" w:cs="Times New Roman" w:eastAsia="Times New Roman" w:hAnsi="Times New Roman"/>
-                <w:b w:val="false"/>
-                <w:bCs w:val="false"/>
-                <w:noProof/>
-                <w:sz w:val="18"/>
-                <w:szCs w:val="18"/>
-                <w:lang w:val="vi-VN"/>
-              </w:rPr>
-              <w:t xml:space="preserve">0,5</w:t>
-            </w:r>
-          </w:p>
-        </w:tc>
-        <w:tc>
-          <w:p>
-            <w:pPr>
-              <w:jc w:val="center"/>
-            </w:pPr>
-            <w:r>
-              <w:rPr>
-                <w:rFonts w:ascii="Times New Roman" w:cs="Times New Roman" w:eastAsia="Times New Roman" w:hAnsi="Times New Roman"/>
-                <w:b w:val="false"/>
-                <w:bCs w:val="false"/>
-                <w:noProof/>
-                <w:sz w:val="18"/>
-                <w:szCs w:val="18"/>
-                <w:lang w:val="vi-VN"/>
-              </w:rPr>
-              <w:t xml:space="preserve">5,26</w:t>
-            </w:r>
-          </w:p>
-        </w:tc>
-        <w:tc>
-          <w:p>
-            <w:pPr>
-              <w:jc w:val="center"/>
-            </w:pPr>
-            <w:r>
-              <w:rPr>
-                <w:rFonts w:ascii="Times New Roman" w:cs="Times New Roman" w:eastAsia="Times New Roman" w:hAnsi="Times New Roman"/>
-                <w:b w:val="false"/>
-                <w:bCs w:val="false"/>
-                <w:noProof/>
-                <w:sz w:val="18"/>
-                <w:szCs w:val="18"/>
-                <w:lang w:val="vi-VN"/>
-              </w:rPr>
-              <w:t xml:space="preserve">13,5</w:t>
-            </w:r>
-          </w:p>
-        </w:tc>
-        <w:tc>
-          <w:p>
-            <w:pPr>
-              <w:jc w:val="center"/>
-            </w:pPr>
-            <w:r>
-              <w:rPr>
-                <w:rFonts w:ascii="Times New Roman" w:cs="Times New Roman" w:eastAsia="Times New Roman" w:hAnsi="Times New Roman"/>
-                <w:b w:val="false"/>
-                <w:bCs w:val="false"/>
-                <w:noProof/>
-                <w:sz w:val="18"/>
-                <w:szCs w:val="18"/>
-                <w:lang w:val="vi-VN"/>
-              </w:rPr>
-              <w:t xml:space="preserve">93,3</w:t>
-            </w:r>
-          </w:p>
-        </w:tc>
-        <w:tc>
-          <w:p>
-            <w:pPr>
-              <w:jc w:val="center"/>
-            </w:pPr>
-            <w:r>
-              <w:rPr>
-                <w:rFonts w:ascii="Times New Roman" w:cs="Times New Roman" w:eastAsia="Times New Roman" w:hAnsi="Times New Roman"/>
-                <w:b w:val="false"/>
-                <w:bCs w:val="false"/>
-                <w:noProof/>
-                <w:sz w:val="18"/>
-                <w:szCs w:val="18"/>
-                <w:lang w:val="vi-VN"/>
-              </w:rPr>
-              <w:t xml:space="preserve">0,91</w:t>
-            </w:r>
-          </w:p>
-        </w:tc>
-        <w:tc>
-          <w:p>
-            <w:pPr>
-              <w:jc w:val="center"/>
-            </w:pPr>
-            <w:r>
-              <w:rPr>
-                <w:rFonts w:ascii="Times New Roman" w:cs="Times New Roman" w:eastAsia="Times New Roman" w:hAnsi="Times New Roman"/>
-                <w:b w:val="false"/>
-                <w:bCs w:val="false"/>
-                <w:noProof/>
-                <w:sz w:val="18"/>
-                <w:szCs w:val="18"/>
-                <w:lang w:val="vi-VN"/>
-              </w:rPr>
-              <w:t xml:space="preserve">0,45</w:t>
-            </w:r>
-          </w:p>
-        </w:tc>
-        <w:tc>
-          <w:p>
-            <w:pPr>
-              <w:jc w:val="center"/>
-            </w:pPr>
-            <w:r>
-              <w:rPr>
-                <w:rFonts w:ascii="Times New Roman" w:cs="Times New Roman" w:eastAsia="Times New Roman" w:hAnsi="Times New Roman"/>
-                <w:b w:val="false"/>
-                <w:bCs w:val="false"/>
-                <w:noProof/>
-                <w:sz w:val="18"/>
-                <w:szCs w:val="18"/>
-                <w:lang w:val="vi-VN"/>
-              </w:rPr>
-              <w:t xml:space="preserve">1,00</w:t>
-            </w:r>
-          </w:p>
-        </w:tc>
-        <w:tc>
-          <w:p>
-            <w:pPr>
-              <w:jc w:val="center"/>
-            </w:pPr>
-            <w:r>
-              <w:rPr>
-                <w:rFonts w:ascii="Times New Roman" w:cs="Times New Roman" w:eastAsia="Times New Roman" w:hAnsi="Times New Roman"/>
-                <w:b w:val="false"/>
-                <w:bCs w:val="false"/>
-                <w:noProof/>
-                <w:sz w:val="18"/>
-                <w:szCs w:val="18"/>
-                <w:lang w:val="vi-VN"/>
-              </w:rPr>
-              <w:t xml:space="preserve">0,79</w:t>
+              <w:t xml:space="preserve">3,00</w:t>
+            </w:r>
+          </w:p>
+        </w:tc>
+        <w:tc>
+          <w:p>
+            <w:pPr>
+              <w:jc w:val="center"/>
+            </w:pPr>
+            <w:r>
+              <w:rPr>
+                <w:rFonts w:ascii="Times New Roman" w:cs="Times New Roman" w:eastAsia="Times New Roman" w:hAnsi="Times New Roman"/>
+                <w:b w:val="false"/>
+                <w:bCs w:val="false"/>
+                <w:noProof/>
+                <w:sz w:val="18"/>
+                <w:szCs w:val="18"/>
+                <w:lang w:val="vi-VN"/>
+              </w:rPr>
+              <w:t xml:space="preserve">0,6</w:t>
+            </w:r>
+          </w:p>
+        </w:tc>
+        <w:tc>
+          <w:p>
+            <w:pPr>
+              <w:jc w:val="center"/>
+            </w:pPr>
+            <w:r>
+              <w:rPr>
+                <w:rFonts w:ascii="Times New Roman" w:cs="Times New Roman" w:eastAsia="Times New Roman" w:hAnsi="Times New Roman"/>
+                <w:b w:val="false"/>
+                <w:bCs w:val="false"/>
+                <w:noProof/>
+                <w:sz w:val="18"/>
+                <w:szCs w:val="18"/>
+                <w:lang w:val="vi-VN"/>
+              </w:rPr>
+              <w:t xml:space="preserve">5,37</w:t>
+            </w:r>
+          </w:p>
+        </w:tc>
+        <w:tc>
+          <w:p>
+            <w:pPr>
+              <w:jc w:val="center"/>
+            </w:pPr>
+            <w:r>
+              <w:rPr>
+                <w:rFonts w:ascii="Times New Roman" w:cs="Times New Roman" w:eastAsia="Times New Roman" w:hAnsi="Times New Roman"/>
+                <w:b w:val="false"/>
+                <w:bCs w:val="false"/>
+                <w:noProof/>
+                <w:sz w:val="18"/>
+                <w:szCs w:val="18"/>
+                <w:lang w:val="vi-VN"/>
+              </w:rPr>
+              <w:t xml:space="preserve">13,8</w:t>
+            </w:r>
+          </w:p>
+        </w:tc>
+        <w:tc>
+          <w:p>
+            <w:pPr>
+              <w:jc w:val="center"/>
+            </w:pPr>
+            <w:r>
+              <w:rPr>
+                <w:rFonts w:ascii="Times New Roman" w:cs="Times New Roman" w:eastAsia="Times New Roman" w:hAnsi="Times New Roman"/>
+                <w:b w:val="false"/>
+                <w:bCs w:val="false"/>
+                <w:noProof/>
+                <w:sz w:val="18"/>
+                <w:szCs w:val="18"/>
+                <w:lang w:val="vi-VN"/>
+              </w:rPr>
+              <w:t xml:space="preserve">93,1</w:t>
+            </w:r>
+          </w:p>
+        </w:tc>
+        <w:tc>
+          <w:p>
+            <w:pPr>
+              <w:jc w:val="center"/>
+            </w:pPr>
+            <w:r>
+              <w:rPr>
+                <w:rFonts w:ascii="Times New Roman" w:cs="Times New Roman" w:eastAsia="Times New Roman" w:hAnsi="Times New Roman"/>
+                <w:b w:val="false"/>
+                <w:bCs w:val="false"/>
+                <w:noProof/>
+                <w:sz w:val="18"/>
+                <w:szCs w:val="18"/>
+                <w:lang w:val="vi-VN"/>
+              </w:rPr>
+              <w:t xml:space="preserve">0,89</w:t>
+            </w:r>
+          </w:p>
+        </w:tc>
+        <w:tc>
+          <w:p>
+            <w:pPr>
+              <w:jc w:val="center"/>
+            </w:pPr>
+            <w:r>
+              <w:rPr>
+                <w:rFonts w:ascii="Times New Roman" w:cs="Times New Roman" w:eastAsia="Times New Roman" w:hAnsi="Times New Roman"/>
+                <w:b w:val="false"/>
+                <w:bCs w:val="false"/>
+                <w:noProof/>
+                <w:sz w:val="18"/>
+                <w:szCs w:val="18"/>
+                <w:lang w:val="vi-VN"/>
+              </w:rPr>
+              <w:t xml:space="preserve">0,50</w:t>
+            </w:r>
+          </w:p>
+        </w:tc>
+        <w:tc>
+          <w:p>
+            <w:pPr>
+              <w:jc w:val="center"/>
+            </w:pPr>
+            <w:r>
+              <w:rPr>
+                <w:rFonts w:ascii="Times New Roman" w:cs="Times New Roman" w:eastAsia="Times New Roman" w:hAnsi="Times New Roman"/>
+                <w:b w:val="false"/>
+                <w:bCs w:val="false"/>
+                <w:noProof/>
+                <w:sz w:val="18"/>
+                <w:szCs w:val="18"/>
+                <w:lang w:val="vi-VN"/>
+              </w:rPr>
+              <w:t xml:space="preserve">0,99</w:t>
+            </w:r>
+          </w:p>
+        </w:tc>
+        <w:tc>
+          <w:p>
+            <w:pPr>
+              <w:jc w:val="center"/>
+            </w:pPr>
+            <w:r>
+              <w:rPr>
+                <w:rFonts w:ascii="Times New Roman" w:cs="Times New Roman" w:eastAsia="Times New Roman" w:hAnsi="Times New Roman"/>
+                <w:b w:val="false"/>
+                <w:bCs w:val="false"/>
+                <w:noProof/>
+                <w:sz w:val="18"/>
+                <w:szCs w:val="18"/>
+                <w:lang w:val="vi-VN"/>
+              </w:rPr>
+              <w:t xml:space="preserve">0,75</w:t>
             </w:r>
           </w:p>
         </w:tc>
@@ -12803,7 +12803,7 @@
                 <w:szCs w:val="18"/>
                 <w:lang w:val="vi-VN"/>
               </w:rPr>
-              <w:t xml:space="preserve">60,9</w:t>
+              <w:t xml:space="preserve">60,8</w:t>
             </w:r>
           </w:p>
         </w:tc>
@@ -12879,7 +12879,7 @@
                 <w:szCs w:val="18"/>
                 <w:lang w:val="vi-VN"/>
               </w:rPr>
-              <w:t xml:space="preserve">0,92</w:t>
+              <w:t xml:space="preserve">0,93</w:t>
             </w:r>
           </w:p>
         </w:tc>
@@ -13074,7 +13074,7 @@
                 <w:szCs w:val="18"/>
                 <w:lang w:val="vi-VN"/>
               </w:rPr>
-              <w:t xml:space="preserve">0,45</w:t>
+              <w:t xml:space="preserve">0,46</w:t>
             </w:r>
           </w:p>
         </w:tc>
@@ -13269,7 +13269,7 @@
                 <w:szCs w:val="18"/>
                 <w:lang w:val="vi-VN"/>
               </w:rPr>
-              <w:t xml:space="preserve">74,9</w:t>
+              <w:t xml:space="preserve">74,8</w:t>
             </w:r>
           </w:p>
         </w:tc>
@@ -13345,7 +13345,7 @@
                 <w:szCs w:val="18"/>
                 <w:lang w:val="vi-VN"/>
               </w:rPr>
-              <w:t xml:space="preserve">0,78</w:t>
+              <w:t xml:space="preserve">0,77</w:t>
             </w:r>
           </w:p>
         </w:tc>
@@ -13578,7 +13578,7 @@
                 <w:szCs w:val="18"/>
                 <w:lang w:val="vi-VN"/>
               </w:rPr>
-              <w:t xml:space="preserve">0,84</w:t>
+              <w:t xml:space="preserve">0,83</w:t>
             </w:r>
           </w:p>
         </w:tc>
@@ -13773,7 +13773,7 @@
                 <w:szCs w:val="18"/>
                 <w:lang w:val="vi-VN"/>
               </w:rPr>
-              <w:t xml:space="preserve">0,36</w:t>
+              <w:t xml:space="preserve">0,35</w:t>
             </w:r>
           </w:p>
         </w:tc>
@@ -14006,7 +14006,7 @@
                 <w:szCs w:val="18"/>
                 <w:lang w:val="vi-VN"/>
               </w:rPr>
-              <w:t xml:space="preserve">0,39</w:t>
+              <w:t xml:space="preserve">0,38</w:t>
             </w:r>
           </w:p>
         </w:tc>
@@ -14201,7 +14201,7 @@
                 <w:szCs w:val="18"/>
                 <w:lang w:val="vi-VN"/>
               </w:rPr>
-              <w:t xml:space="preserve">41,0</w:t>
+              <w:t xml:space="preserve">40,9</w:t>
             </w:r>
           </w:p>
         </w:tc>
@@ -14434,64 +14434,64 @@
                 <w:szCs w:val="18"/>
                 <w:lang w:val="vi-VN"/>
               </w:rPr>
-              <w:t xml:space="preserve">168,5</w:t>
-            </w:r>
-          </w:p>
-        </w:tc>
-        <w:tc>
-          <w:p>
-            <w:pPr>
-              <w:jc w:val="center"/>
-            </w:pPr>
-            <w:r>
-              <w:rPr>
-                <w:rFonts w:ascii="Times New Roman" w:cs="Times New Roman" w:eastAsia="Times New Roman" w:hAnsi="Times New Roman"/>
-                <w:b w:val="false"/>
-                <w:bCs w:val="false"/>
-                <w:noProof/>
-                <w:sz w:val="18"/>
-                <w:szCs w:val="18"/>
-                <w:lang w:val="vi-VN"/>
-              </w:rPr>
-              <w:t xml:space="preserve">0,77</w:t>
-            </w:r>
-          </w:p>
-        </w:tc>
-        <w:tc>
-          <w:p>
-            <w:pPr>
-              <w:jc w:val="center"/>
-            </w:pPr>
-            <w:r>
-              <w:rPr>
-                <w:rFonts w:ascii="Times New Roman" w:cs="Times New Roman" w:eastAsia="Times New Roman" w:hAnsi="Times New Roman"/>
-                <w:b w:val="false"/>
-                <w:bCs w:val="false"/>
-                <w:noProof/>
-                <w:sz w:val="18"/>
-                <w:szCs w:val="18"/>
-                <w:lang w:val="vi-VN"/>
-              </w:rPr>
-              <w:t xml:space="preserve">0,59</w:t>
-            </w:r>
-          </w:p>
-        </w:tc>
-        <w:tc>
-          <w:p>
-            <w:pPr>
-              <w:jc w:val="center"/>
-            </w:pPr>
-            <w:r>
-              <w:rPr>
-                <w:rFonts w:ascii="Times New Roman" w:cs="Times New Roman" w:eastAsia="Times New Roman" w:hAnsi="Times New Roman"/>
-                <w:b w:val="false"/>
-                <w:bCs w:val="false"/>
-                <w:noProof/>
-                <w:sz w:val="18"/>
-                <w:szCs w:val="18"/>
-                <w:lang w:val="vi-VN"/>
-              </w:rPr>
-              <w:t xml:space="preserve">0,98</w:t>
+              <w:t xml:space="preserve">169,4</w:t>
+            </w:r>
+          </w:p>
+        </w:tc>
+        <w:tc>
+          <w:p>
+            <w:pPr>
+              <w:jc w:val="center"/>
+            </w:pPr>
+            <w:r>
+              <w:rPr>
+                <w:rFonts w:ascii="Times New Roman" w:cs="Times New Roman" w:eastAsia="Times New Roman" w:hAnsi="Times New Roman"/>
+                <w:b w:val="false"/>
+                <w:bCs w:val="false"/>
+                <w:noProof/>
+                <w:sz w:val="18"/>
+                <w:szCs w:val="18"/>
+                <w:lang w:val="vi-VN"/>
+              </w:rPr>
+              <w:t xml:space="preserve">0,78</w:t>
+            </w:r>
+          </w:p>
+        </w:tc>
+        <w:tc>
+          <w:p>
+            <w:pPr>
+              <w:jc w:val="center"/>
+            </w:pPr>
+            <w:r>
+              <w:rPr>
+                <w:rFonts w:ascii="Times New Roman" w:cs="Times New Roman" w:eastAsia="Times New Roman" w:hAnsi="Times New Roman"/>
+                <w:b w:val="false"/>
+                <w:bCs w:val="false"/>
+                <w:noProof/>
+                <w:sz w:val="18"/>
+                <w:szCs w:val="18"/>
+                <w:lang w:val="vi-VN"/>
+              </w:rPr>
+              <w:t xml:space="preserve">0,60</w:t>
+            </w:r>
+          </w:p>
+        </w:tc>
+        <w:tc>
+          <w:p>
+            <w:pPr>
+              <w:jc w:val="center"/>
+            </w:pPr>
+            <w:r>
+              <w:rPr>
+                <w:rFonts w:ascii="Times New Roman" w:cs="Times New Roman" w:eastAsia="Times New Roman" w:hAnsi="Times New Roman"/>
+                <w:b w:val="false"/>
+                <w:bCs w:val="false"/>
+                <w:noProof/>
+                <w:sz w:val="18"/>
+                <w:szCs w:val="18"/>
+                <w:lang w:val="vi-VN"/>
+              </w:rPr>
+              <w:t xml:space="preserve">0,99</w:t>
             </w:r>
           </w:p>
         </w:tc>
@@ -14667,83 +14667,83 @@
                 <w:szCs w:val="18"/>
                 <w:lang w:val="vi-VN"/>
               </w:rPr>
-              <w:t xml:space="preserve">84,0</w:t>
-            </w:r>
-          </w:p>
-        </w:tc>
-        <w:tc>
-          <w:p>
-            <w:pPr>
-              <w:jc w:val="center"/>
-            </w:pPr>
-            <w:r>
-              <w:rPr>
-                <w:rFonts w:ascii="Times New Roman" w:cs="Times New Roman" w:eastAsia="Times New Roman" w:hAnsi="Times New Roman"/>
-                <w:b w:val="false"/>
-                <w:bCs w:val="false"/>
-                <w:noProof/>
-                <w:sz w:val="18"/>
-                <w:szCs w:val="18"/>
-                <w:lang w:val="vi-VN"/>
-              </w:rPr>
-              <w:t xml:space="preserve">0,71</w:t>
-            </w:r>
-          </w:p>
-        </w:tc>
-        <w:tc>
-          <w:p>
-            <w:pPr>
-              <w:jc w:val="center"/>
-            </w:pPr>
-            <w:r>
-              <w:rPr>
-                <w:rFonts w:ascii="Times New Roman" w:cs="Times New Roman" w:eastAsia="Times New Roman" w:hAnsi="Times New Roman"/>
-                <w:b w:val="false"/>
-                <w:bCs w:val="false"/>
-                <w:noProof/>
-                <w:sz w:val="18"/>
-                <w:szCs w:val="18"/>
-                <w:lang w:val="vi-VN"/>
-              </w:rPr>
-              <w:t xml:space="preserve">0,67</w:t>
-            </w:r>
-          </w:p>
-        </w:tc>
-        <w:tc>
-          <w:p>
-            <w:pPr>
-              <w:jc w:val="center"/>
-            </w:pPr>
-            <w:r>
-              <w:rPr>
-                <w:rFonts w:ascii="Times New Roman" w:cs="Times New Roman" w:eastAsia="Times New Roman" w:hAnsi="Times New Roman"/>
-                <w:b w:val="false"/>
-                <w:bCs w:val="false"/>
-                <w:noProof/>
-                <w:sz w:val="18"/>
-                <w:szCs w:val="18"/>
-                <w:lang w:val="vi-VN"/>
-              </w:rPr>
-              <w:t xml:space="preserve">0,97</w:t>
-            </w:r>
-          </w:p>
-        </w:tc>
-        <w:tc>
-          <w:p>
-            <w:pPr>
-              <w:jc w:val="center"/>
-            </w:pPr>
-            <w:r>
-              <w:rPr>
-                <w:rFonts w:ascii="Times New Roman" w:cs="Times New Roman" w:eastAsia="Times New Roman" w:hAnsi="Times New Roman"/>
-                <w:b w:val="false"/>
-                <w:bCs w:val="false"/>
-                <w:noProof/>
-                <w:sz w:val="18"/>
-                <w:szCs w:val="18"/>
-                <w:lang w:val="vi-VN"/>
-              </w:rPr>
-              <w:t xml:space="preserve">0,56</w:t>
+              <w:t xml:space="preserve">84,7</w:t>
+            </w:r>
+          </w:p>
+        </w:tc>
+        <w:tc>
+          <w:p>
+            <w:pPr>
+              <w:jc w:val="center"/>
+            </w:pPr>
+            <w:r>
+              <w:rPr>
+                <w:rFonts w:ascii="Times New Roman" w:cs="Times New Roman" w:eastAsia="Times New Roman" w:hAnsi="Times New Roman"/>
+                <w:b w:val="false"/>
+                <w:bCs w:val="false"/>
+                <w:noProof/>
+                <w:sz w:val="18"/>
+                <w:szCs w:val="18"/>
+                <w:lang w:val="vi-VN"/>
+              </w:rPr>
+              <w:t xml:space="preserve">0,72</w:t>
+            </w:r>
+          </w:p>
+        </w:tc>
+        <w:tc>
+          <w:p>
+            <w:pPr>
+              <w:jc w:val="center"/>
+            </w:pPr>
+            <w:r>
+              <w:rPr>
+                <w:rFonts w:ascii="Times New Roman" w:cs="Times New Roman" w:eastAsia="Times New Roman" w:hAnsi="Times New Roman"/>
+                <w:b w:val="false"/>
+                <w:bCs w:val="false"/>
+                <w:noProof/>
+                <w:sz w:val="18"/>
+                <w:szCs w:val="18"/>
+                <w:lang w:val="vi-VN"/>
+              </w:rPr>
+              <w:t xml:space="preserve">0,68</w:t>
+            </w:r>
+          </w:p>
+        </w:tc>
+        <w:tc>
+          <w:p>
+            <w:pPr>
+              <w:jc w:val="center"/>
+            </w:pPr>
+            <w:r>
+              <w:rPr>
+                <w:rFonts w:ascii="Times New Roman" w:cs="Times New Roman" w:eastAsia="Times New Roman" w:hAnsi="Times New Roman"/>
+                <w:b w:val="false"/>
+                <w:bCs w:val="false"/>
+                <w:noProof/>
+                <w:sz w:val="18"/>
+                <w:szCs w:val="18"/>
+                <w:lang w:val="vi-VN"/>
+              </w:rPr>
+              <w:t xml:space="preserve">0,98</w:t>
+            </w:r>
+          </w:p>
+        </w:tc>
+        <w:tc>
+          <w:p>
+            <w:pPr>
+              <w:jc w:val="center"/>
+            </w:pPr>
+            <w:r>
+              <w:rPr>
+                <w:rFonts w:ascii="Times New Roman" w:cs="Times New Roman" w:eastAsia="Times New Roman" w:hAnsi="Times New Roman"/>
+                <w:b w:val="false"/>
+                <w:bCs w:val="false"/>
+                <w:noProof/>
+                <w:sz w:val="18"/>
+                <w:szCs w:val="18"/>
+                <w:lang w:val="vi-VN"/>
+              </w:rPr>
+              <w:t xml:space="preserve">0,59</w:t>
             </w:r>
           </w:p>
         </w:tc>
@@ -14824,159 +14824,159 @@
                 <w:szCs w:val="18"/>
                 <w:lang w:val="vi-VN"/>
               </w:rPr>
-              <w:t xml:space="preserve">3,75</w:t>
-            </w:r>
-          </w:p>
-        </w:tc>
-        <w:tc>
-          <w:p>
-            <w:pPr>
-              <w:jc w:val="center"/>
-            </w:pPr>
-            <w:r>
-              <w:rPr>
-                <w:rFonts w:ascii="Times New Roman" w:cs="Times New Roman" w:eastAsia="Times New Roman" w:hAnsi="Times New Roman"/>
-                <w:b w:val="false"/>
-                <w:bCs w:val="false"/>
-                <w:noProof/>
-                <w:sz w:val="18"/>
-                <w:szCs w:val="18"/>
-                <w:lang w:val="vi-VN"/>
-              </w:rPr>
-              <w:t xml:space="preserve">0,5</w:t>
-            </w:r>
-          </w:p>
-        </w:tc>
-        <w:tc>
-          <w:p>
-            <w:pPr>
-              <w:jc w:val="center"/>
-            </w:pPr>
-            <w:r>
-              <w:rPr>
-                <w:rFonts w:ascii="Times New Roman" w:cs="Times New Roman" w:eastAsia="Times New Roman" w:hAnsi="Times New Roman"/>
-                <w:b w:val="false"/>
-                <w:bCs w:val="false"/>
-                <w:noProof/>
-                <w:sz w:val="18"/>
-                <w:szCs w:val="18"/>
-                <w:lang w:val="vi-VN"/>
-              </w:rPr>
-              <w:t xml:space="preserve">7,01</w:t>
-            </w:r>
-          </w:p>
-        </w:tc>
-        <w:tc>
-          <w:p>
-            <w:pPr>
-              <w:jc w:val="center"/>
-            </w:pPr>
-            <w:r>
-              <w:rPr>
-                <w:rFonts w:ascii="Times New Roman" w:cs="Times New Roman" w:eastAsia="Times New Roman" w:hAnsi="Times New Roman"/>
-                <w:b w:val="false"/>
-                <w:bCs w:val="false"/>
-                <w:noProof/>
-                <w:sz w:val="18"/>
-                <w:szCs w:val="18"/>
-                <w:lang w:val="vi-VN"/>
-              </w:rPr>
-              <w:t xml:space="preserve">17,9</w:t>
-            </w:r>
-          </w:p>
-        </w:tc>
-        <w:tc>
-          <w:p>
-            <w:pPr>
-              <w:jc w:val="center"/>
-            </w:pPr>
-            <w:r>
-              <w:rPr>
-                <w:rFonts w:ascii="Times New Roman" w:cs="Times New Roman" w:eastAsia="Times New Roman" w:hAnsi="Times New Roman"/>
-                <w:b w:val="false"/>
-                <w:bCs w:val="false"/>
-                <w:noProof/>
-                <w:sz w:val="18"/>
-                <w:szCs w:val="18"/>
-                <w:lang w:val="vi-VN"/>
-              </w:rPr>
-              <w:t xml:space="preserve">85,5</w:t>
-            </w:r>
-          </w:p>
-        </w:tc>
-        <w:tc>
-          <w:p>
-            <w:pPr>
-              <w:jc w:val="center"/>
-            </w:pPr>
-            <w:r>
-              <w:rPr>
-                <w:rFonts w:ascii="Times New Roman" w:cs="Times New Roman" w:eastAsia="Times New Roman" w:hAnsi="Times New Roman"/>
-                <w:b w:val="false"/>
-                <w:bCs w:val="false"/>
-                <w:noProof/>
-                <w:sz w:val="18"/>
-                <w:szCs w:val="18"/>
-                <w:lang w:val="vi-VN"/>
-              </w:rPr>
-              <w:t xml:space="preserve">0,68</w:t>
-            </w:r>
-          </w:p>
-        </w:tc>
-        <w:tc>
-          <w:p>
-            <w:pPr>
-              <w:jc w:val="center"/>
-            </w:pPr>
-            <w:r>
-              <w:rPr>
-                <w:rFonts w:ascii="Times New Roman" w:cs="Times New Roman" w:eastAsia="Times New Roman" w:hAnsi="Times New Roman"/>
-                <w:b w:val="false"/>
-                <w:bCs w:val="false"/>
-                <w:noProof/>
-                <w:sz w:val="18"/>
-                <w:szCs w:val="18"/>
-                <w:lang w:val="vi-VN"/>
-              </w:rPr>
-              <w:t xml:space="preserve">0,76</w:t>
-            </w:r>
-          </w:p>
-        </w:tc>
-        <w:tc>
-          <w:p>
-            <w:pPr>
-              <w:jc w:val="center"/>
-            </w:pPr>
-            <w:r>
-              <w:rPr>
-                <w:rFonts w:ascii="Times New Roman" w:cs="Times New Roman" w:eastAsia="Times New Roman" w:hAnsi="Times New Roman"/>
-                <w:b w:val="false"/>
-                <w:bCs w:val="false"/>
-                <w:noProof/>
-                <w:sz w:val="18"/>
-                <w:szCs w:val="18"/>
-                <w:lang w:val="vi-VN"/>
-              </w:rPr>
-              <w:t xml:space="preserve">0,99</w:t>
-            </w:r>
-          </w:p>
-        </w:tc>
-        <w:tc>
-          <w:p>
-            <w:pPr>
-              <w:jc w:val="center"/>
-            </w:pPr>
-            <w:r>
-              <w:rPr>
-                <w:rFonts w:ascii="Times New Roman" w:cs="Times New Roman" w:eastAsia="Times New Roman" w:hAnsi="Times New Roman"/>
-                <w:b w:val="false"/>
-                <w:bCs w:val="false"/>
-                <w:noProof/>
-                <w:sz w:val="18"/>
-                <w:szCs w:val="18"/>
-                <w:lang w:val="vi-VN"/>
-              </w:rPr>
-              <w:t xml:space="preserve">0,55</w:t>
+              <w:t xml:space="preserve">4,25</w:t>
+            </w:r>
+          </w:p>
+        </w:tc>
+        <w:tc>
+          <w:p>
+            <w:pPr>
+              <w:jc w:val="center"/>
+            </w:pPr>
+            <w:r>
+              <w:rPr>
+                <w:rFonts w:ascii="Times New Roman" w:cs="Times New Roman" w:eastAsia="Times New Roman" w:hAnsi="Times New Roman"/>
+                <w:b w:val="false"/>
+                <w:bCs w:val="false"/>
+                <w:noProof/>
+                <w:sz w:val="18"/>
+                <w:szCs w:val="18"/>
+                <w:lang w:val="vi-VN"/>
+              </w:rPr>
+              <w:t xml:space="preserve">0,4</w:t>
+            </w:r>
+          </w:p>
+        </w:tc>
+        <w:tc>
+          <w:p>
+            <w:pPr>
+              <w:jc w:val="center"/>
+            </w:pPr>
+            <w:r>
+              <w:rPr>
+                <w:rFonts w:ascii="Times New Roman" w:cs="Times New Roman" w:eastAsia="Times New Roman" w:hAnsi="Times New Roman"/>
+                <w:b w:val="false"/>
+                <w:bCs w:val="false"/>
+                <w:noProof/>
+                <w:sz w:val="18"/>
+                <w:szCs w:val="18"/>
+                <w:lang w:val="vi-VN"/>
+              </w:rPr>
+              <w:t xml:space="preserve">7,21</w:t>
+            </w:r>
+          </w:p>
+        </w:tc>
+        <w:tc>
+          <w:p>
+            <w:pPr>
+              <w:jc w:val="center"/>
+            </w:pPr>
+            <w:r>
+              <w:rPr>
+                <w:rFonts w:ascii="Times New Roman" w:cs="Times New Roman" w:eastAsia="Times New Roman" w:hAnsi="Times New Roman"/>
+                <w:b w:val="false"/>
+                <w:bCs w:val="false"/>
+                <w:noProof/>
+                <w:sz w:val="18"/>
+                <w:szCs w:val="18"/>
+                <w:lang w:val="vi-VN"/>
+              </w:rPr>
+              <w:t xml:space="preserve">18,4</w:t>
+            </w:r>
+          </w:p>
+        </w:tc>
+        <w:tc>
+          <w:p>
+            <w:pPr>
+              <w:jc w:val="center"/>
+            </w:pPr>
+            <w:r>
+              <w:rPr>
+                <w:rFonts w:ascii="Times New Roman" w:cs="Times New Roman" w:eastAsia="Times New Roman" w:hAnsi="Times New Roman"/>
+                <w:b w:val="false"/>
+                <w:bCs w:val="false"/>
+                <w:noProof/>
+                <w:sz w:val="18"/>
+                <w:szCs w:val="18"/>
+                <w:lang w:val="vi-VN"/>
+              </w:rPr>
+              <w:t xml:space="preserve">86,5</w:t>
+            </w:r>
+          </w:p>
+        </w:tc>
+        <w:tc>
+          <w:p>
+            <w:pPr>
+              <w:jc w:val="center"/>
+            </w:pPr>
+            <w:r>
+              <w:rPr>
+                <w:rFonts w:ascii="Times New Roman" w:cs="Times New Roman" w:eastAsia="Times New Roman" w:hAnsi="Times New Roman"/>
+                <w:b w:val="false"/>
+                <w:bCs w:val="false"/>
+                <w:noProof/>
+                <w:sz w:val="18"/>
+                <w:szCs w:val="18"/>
+                <w:lang w:val="vi-VN"/>
+              </w:rPr>
+              <w:t xml:space="preserve">0,67</w:t>
+            </w:r>
+          </w:p>
+        </w:tc>
+        <w:tc>
+          <w:p>
+            <w:pPr>
+              <w:jc w:val="center"/>
+            </w:pPr>
+            <w:r>
+              <w:rPr>
+                <w:rFonts w:ascii="Times New Roman" w:cs="Times New Roman" w:eastAsia="Times New Roman" w:hAnsi="Times New Roman"/>
+                <w:b w:val="false"/>
+                <w:bCs w:val="false"/>
+                <w:noProof/>
+                <w:sz w:val="18"/>
+                <w:szCs w:val="18"/>
+                <w:lang w:val="vi-VN"/>
+              </w:rPr>
+              <w:t xml:space="preserve">0,65</w:t>
+            </w:r>
+          </w:p>
+        </w:tc>
+        <w:tc>
+          <w:p>
+            <w:pPr>
+              <w:jc w:val="center"/>
+            </w:pPr>
+            <w:r>
+              <w:rPr>
+                <w:rFonts w:ascii="Times New Roman" w:cs="Times New Roman" w:eastAsia="Times New Roman" w:hAnsi="Times New Roman"/>
+                <w:b w:val="false"/>
+                <w:bCs w:val="false"/>
+                <w:noProof/>
+                <w:sz w:val="18"/>
+                <w:szCs w:val="18"/>
+                <w:lang w:val="vi-VN"/>
+              </w:rPr>
+              <w:t xml:space="preserve">0,93</w:t>
+            </w:r>
+          </w:p>
+        </w:tc>
+        <w:tc>
+          <w:p>
+            <w:pPr>
+              <w:jc w:val="center"/>
+            </w:pPr>
+            <w:r>
+              <w:rPr>
+                <w:rFonts w:ascii="Times New Roman" w:cs="Times New Roman" w:eastAsia="Times New Roman" w:hAnsi="Times New Roman"/>
+                <w:b w:val="false"/>
+                <w:bCs w:val="false"/>
+                <w:noProof/>
+                <w:sz w:val="18"/>
+                <w:szCs w:val="18"/>
+                <w:lang w:val="vi-VN"/>
+              </w:rPr>
+              <w:t xml:space="preserve">0,28</w:t>
             </w:r>
           </w:p>
         </w:tc>
@@ -15133,26 +15133,26 @@
                 <w:szCs w:val="18"/>
                 <w:lang w:val="vi-VN"/>
               </w:rPr>
-              <w:t xml:space="preserve">44,6</w:t>
-            </w:r>
-          </w:p>
-        </w:tc>
-        <w:tc>
-          <w:p>
-            <w:pPr>
-              <w:jc w:val="center"/>
-            </w:pPr>
-            <w:r>
-              <w:rPr>
-                <w:rFonts w:ascii="Times New Roman" w:cs="Times New Roman" w:eastAsia="Times New Roman" w:hAnsi="Times New Roman"/>
-                <w:b w:val="false"/>
-                <w:bCs w:val="false"/>
-                <w:noProof/>
-                <w:sz w:val="18"/>
-                <w:szCs w:val="18"/>
-                <w:lang w:val="vi-VN"/>
-              </w:rPr>
-              <w:t xml:space="preserve">0,61</w:t>
+              <w:t xml:space="preserve">44,8</w:t>
+            </w:r>
+          </w:p>
+        </w:tc>
+        <w:tc>
+          <w:p>
+            <w:pPr>
+              <w:jc w:val="center"/>
+            </w:pPr>
+            <w:r>
+              <w:rPr>
+                <w:rFonts w:ascii="Times New Roman" w:cs="Times New Roman" w:eastAsia="Times New Roman" w:hAnsi="Times New Roman"/>
+                <w:b w:val="false"/>
+                <w:bCs w:val="false"/>
+                <w:noProof/>
+                <w:sz w:val="18"/>
+                <w:szCs w:val="18"/>
+                <w:lang w:val="vi-VN"/>
+              </w:rPr>
+              <w:t xml:space="preserve">0,62</w:t>
             </w:r>
           </w:p>
         </w:tc>
@@ -15190,26 +15190,26 @@
                 <w:szCs w:val="18"/>
                 <w:lang w:val="vi-VN"/>
               </w:rPr>
-              <w:t xml:space="preserve">0,87</w:t>
-            </w:r>
-          </w:p>
-        </w:tc>
-        <w:tc>
-          <w:p>
-            <w:pPr>
-              <w:jc w:val="center"/>
-            </w:pPr>
-            <w:r>
-              <w:rPr>
-                <w:rFonts w:ascii="Times New Roman" w:cs="Times New Roman" w:eastAsia="Times New Roman" w:hAnsi="Times New Roman"/>
-                <w:b w:val="false"/>
-                <w:bCs w:val="false"/>
-                <w:noProof/>
-                <w:sz w:val="18"/>
-                <w:szCs w:val="18"/>
-                <w:lang w:val="vi-VN"/>
-              </w:rPr>
-              <w:t xml:space="preserve">0,75</w:t>
+              <w:t xml:space="preserve">0,88</w:t>
+            </w:r>
+          </w:p>
+        </w:tc>
+        <w:tc>
+          <w:p>
+            <w:pPr>
+              <w:jc w:val="center"/>
+            </w:pPr>
+            <w:r>
+              <w:rPr>
+                <w:rFonts w:ascii="Times New Roman" w:cs="Times New Roman" w:eastAsia="Times New Roman" w:hAnsi="Times New Roman"/>
+                <w:b w:val="false"/>
+                <w:bCs w:val="false"/>
+                <w:noProof/>
+                <w:sz w:val="18"/>
+                <w:szCs w:val="18"/>
+                <w:lang w:val="vi-VN"/>
+              </w:rPr>
+              <w:t xml:space="preserve">0,76</w:t>
             </w:r>
           </w:p>
         </w:tc>
@@ -15366,7 +15366,7 @@
                 <w:szCs w:val="18"/>
                 <w:lang w:val="vi-VN"/>
               </w:rPr>
-              <w:t xml:space="preserve">83,8</w:t>
+              <w:t xml:space="preserve">84,3</w:t>
             </w:r>
           </w:p>
         </w:tc>
@@ -15423,26 +15423,26 @@
                 <w:szCs w:val="18"/>
                 <w:lang w:val="vi-VN"/>
               </w:rPr>
-              <w:t xml:space="preserve">0,97</w:t>
-            </w:r>
-          </w:p>
-        </w:tc>
-        <w:tc>
-          <w:p>
-            <w:pPr>
-              <w:jc w:val="center"/>
-            </w:pPr>
-            <w:r>
-              <w:rPr>
-                <w:rFonts w:ascii="Times New Roman" w:cs="Times New Roman" w:eastAsia="Times New Roman" w:hAnsi="Times New Roman"/>
-                <w:b w:val="false"/>
-                <w:bCs w:val="false"/>
-                <w:noProof/>
-                <w:sz w:val="18"/>
-                <w:szCs w:val="18"/>
-                <w:lang w:val="vi-VN"/>
-              </w:rPr>
-              <w:t xml:space="preserve">0,54</w:t>
+              <w:t xml:space="preserve">0,98</w:t>
+            </w:r>
+          </w:p>
+        </w:tc>
+        <w:tc>
+          <w:p>
+            <w:pPr>
+              <w:jc w:val="center"/>
+            </w:pPr>
+            <w:r>
+              <w:rPr>
+                <w:rFonts w:ascii="Times New Roman" w:cs="Times New Roman" w:eastAsia="Times New Roman" w:hAnsi="Times New Roman"/>
+                <w:b w:val="false"/>
+                <w:bCs w:val="false"/>
+                <w:noProof/>
+                <w:sz w:val="18"/>
+                <w:szCs w:val="18"/>
+                <w:lang w:val="vi-VN"/>
+              </w:rPr>
+              <w:t xml:space="preserve">0,56</w:t>
             </w:r>
           </w:p>
         </w:tc>
@@ -15561,7 +15561,7 @@
                 <w:szCs w:val="18"/>
                 <w:lang w:val="vi-VN"/>
               </w:rPr>
-              <w:t xml:space="preserve">173,3</w:t>
+              <w:t xml:space="preserve">173,6</w:t>
             </w:r>
           </w:p>
         </w:tc>
@@ -15599,7 +15599,7 @@
                 <w:szCs w:val="18"/>
                 <w:lang w:val="vi-VN"/>
               </w:rPr>
-              <w:t xml:space="preserve">2.692</w:t>
+              <w:t xml:space="preserve">2.693</w:t>
             </w:r>
           </w:p>
         </w:tc>
@@ -15712,7 +15712,7 @@
           <w:szCs w:val="20"/>
           <w:lang w:val="vi-VN"/>
         </w:rPr>
-        <w:t xml:space="preserve">Mỗi đế có 4 vít ống Ø89×5 ren Ø105, ngàm 3 m; tổng 140 vít, 523 m. Tổng sức chống nhổ 3.457 kN. Các cột Nhổ, Trượt, Lật, 1 vít là mức sử dụng lớn nhất trên mọi tổ hợp.</w:t>
+        <w:t xml:space="preserve">Mỗi đế có 4 vít ống Ø89×5 ren Ø105, ngàm 3 m; tổng 140 vít, 523 m. Tổng sức chống nhổ 3.461 kN. Các cột Nhổ, Trượt, Lật, 1 vít là mức sử dụng lớn nhất trên mọi tổ hợp.</w:t>
       </w:r>
     </w:p>
     <w:p>
@@ -16107,7 +16107,7 @@
                 <w:szCs w:val="18"/>
                 <w:lang w:val="vi-VN"/>
               </w:rPr>
-              <w:t xml:space="preserve">173,3</w:t>
+              <w:t xml:space="preserve">173,6</w:t>
             </w:r>
           </w:p>
         </w:tc>
@@ -16245,7 +16245,7 @@
                 <w:szCs w:val="18"/>
                 <w:lang w:val="vi-VN"/>
               </w:rPr>
-              <w:t xml:space="preserve">7.248,6</w:t>
+              <w:t xml:space="preserve">7.291,8</w:t>
             </w:r>
           </w:p>
         </w:tc>

</xml_diff>

<commit_message>
feat: Ban Mong - D14 (B3-D16) len coc mui dat, D15 ra bo; noi cung ho BE 3 toi 70 do
- B3-D16 coc dat tay tren mui dat (44; 147), day 46 m, khong cat day nao (planner chi thu diem bo dau tien moi huong).
- Planner: maxArcFor (lakeConfig) noi cung ho theo tung be; BE 3 70 do (engine dat 78,7 kN PES-32, troi 0,79 m).
- B3-D18 ra bo 42 m. He neo: 215 day (188 bo + 27 day) + 14 day noi, 17 de 128 m3, 68 vit.
- Ho so tao lai.

Co-Authored-By: Claude Opus 5.5 <noreply@anthropic.com>
</commit_message>
<xml_diff>
--- a/docs/mat-bang-neo-ban-mong/THUYET_MINH_TINH_TOAN.docx
+++ b/docs/mat-bang-neo-ban-mong/THUYET_MINH_TINH_TOAN.docx
@@ -126,7 +126,7 @@
           <w:szCs w:val="24"/>
           <w:lang w:val="vi-VN"/>
         </w:rPr>
-        <w:t xml:space="preserve">Hệ neo: 215 tuyến cáp tại 205 điểm neo = 186 cọc khoan nhồi ven bờ + 19 đế đáy hồ (10 đế dùng chung hai bè).</w:t>
+        <w:t xml:space="preserve">Hệ neo: 215 tuyến cáp tại 205 điểm neo = 188 cọc khoan nhồi ven bờ + 17 đế đáy hồ (10 đế dùng chung hai bè).</w:t>
       </w:r>
     </w:p>
     <w:p>
@@ -186,7 +186,7 @@
           <w:szCs w:val="24"/>
           <w:lang w:val="vi-VN"/>
         </w:rPr>
-        <w:t xml:space="preserve">Kết quả: 6/6 bè đạt; 186/186 cọc bờ đạt; 19/19 đế đạt.</w:t>
+        <w:t xml:space="preserve">Kết quả: 6/6 bè đạt; 188/188 cọc bờ đạt; 17/17 đế đạt.</w:t>
       </w:r>
     </w:p>
     <w:p>
@@ -1432,7 +1432,7 @@
           <w:szCs w:val="24"/>
           <w:lang w:val="vi-VN"/>
         </w:rPr>
-        <w:t xml:space="preserve">Cả hệ: 186 cọc, tổng dài 1.227,6 m, 118,1 m³ bê tông, 36,2 tấn thép. Lực kiểm tra cọc là toàn bộ lực dây (không giảm theo góc xiên), thiên về an toàn.</w:t>
+        <w:t xml:space="preserve">Cả hệ: 188 cọc, tổng dài 1.240,8 m, 119,4 m³ bê tông, 36,6 tấn thép. Lực kiểm tra cọc là toàn bộ lực dây (không giảm theo góc xiên), thiên về an toàn.</w:t>
       </w:r>
     </w:p>
     <w:p>
@@ -1451,7 +1451,7 @@
           <w:szCs w:val="26"/>
           <w:lang w:val="vi-VN"/>
         </w:rPr>
-        <w:t xml:space="preserve">6. Đế BTCT + vít xoắn (ví dụ BM-DV018, đế làm việc nặng nhất)</w:t>
+        <w:t xml:space="preserve">6. Đế BTCT + vít xoắn (ví dụ BM-DV013, đế làm việc nặng nhất)</w:t>
       </w:r>
     </w:p>
     <w:p>
@@ -1617,7 +1617,7 @@
           <w:szCs w:val="24"/>
           <w:lang w:val="vi-VN"/>
         </w:rPr>
-        <w:t xml:space="preserve">Đế BM-DV018 giữ hai dây B6-D25 (BÈ 6, T = 112,9 kN, dài 17,51 m). Bích bè cao hơn mặt nước 0,35 m.</w:t>
+        <w:t xml:space="preserve">Đế BM-DV013 giữ hai dây B2-D58 (BÈ 2, T = 114,1 kN, dài 9,52 m) và B3-D02 (BÈ 3, T = 78,7 kN, dài 9,52 m). Bích bè cao hơn mặt nước 0,35 m.</w:t>
       </w:r>
     </w:p>
     <w:p>
@@ -1699,7 +1699,7 @@
           <w:szCs w:val="24"/>
           <w:lang w:val="vi-VN"/>
         </w:rPr>
-        <w:t xml:space="preserve">Tổ hợp chi phối: B6-D25 căng (MN cao). Lực nhổ T</w:t>
+        <w:t xml:space="preserve">Tổ hợp chi phối: cả hai dây căng (MN cao). Lực nhổ T</w:t>
       </w:r>
       <w:r>
         <w:rPr>
@@ -1720,7 +1720,7 @@
           <w:szCs w:val="24"/>
           <w:lang w:val="vi-VN"/>
         </w:rPr>
-        <w:t xml:space="preserve"> = 85,0 kN (hai dây cộng lại), lực ngang T</w:t>
+        <w:t xml:space="preserve"> = 171,2 kN (hai dây cộng lại), lực ngang T</w:t>
       </w:r>
       <w:r>
         <w:rPr>
@@ -1741,7 +1741,7 @@
           <w:szCs w:val="24"/>
           <w:lang w:val="vi-VN"/>
         </w:rPr>
-        <w:t xml:space="preserve"> = 74,3 kN (cộng véc-tơ).</w:t>
+        <w:t xml:space="preserve"> = 16,3 kN (cộng véc-tơ).</w:t>
       </w:r>
     </w:p>
     <w:p>
@@ -1761,7 +1761,7 @@
           <w:szCs w:val="24"/>
           <w:lang w:val="vi-VN"/>
         </w:rPr>
-        <w:t xml:space="preserve">Đế 4,00 × 4,00 × 0,4 m: thể tích 6,40 m³, nặng 160,0 kN trên cạn, W' = 6,40 × (25 − 10) = 96,0 kN trong nước (đã trừ lực đẩy nổi).</w:t>
+        <w:t xml:space="preserve">Đế 5,75 × 5,75 × 0,4 m: thể tích 13,23 m³, nặng 330,6 kN trên cạn, W' = 13,23 × (25 − 10) = 198,4 kN trong nước (đã trừ lực đẩy nổi).</w:t>
       </w:r>
     </w:p>
     <w:p>
@@ -1823,7 +1823,7 @@
           <w:szCs w:val="24"/>
           <w:lang w:val="vi-VN"/>
         </w:rPr>
-        <w:t xml:space="preserve"> = 118,1 kN; mức sử dụng 0,72.</w:t>
+        <w:t xml:space="preserve"> = 210,2 kN; mức sử dụng 0,81.</w:t>
       </w:r>
     </w:p>
     <w:p>
@@ -1906,7 +1906,7 @@
           <w:szCs w:val="24"/>
           <w:lang w:val="vi-VN"/>
         </w:rPr>
-        <w:t xml:space="preserve"> × B² = 160,0 kN (lấy bằng 0 khi T</w:t>
+        <w:t xml:space="preserve"> × B² = 330,6 kN (lấy bằng 0 khi T</w:t>
       </w:r>
       <w:r>
         <w:rPr>
@@ -1948,7 +1948,7 @@
           <w:szCs w:val="24"/>
           <w:lang w:val="vi-VN"/>
         </w:rPr>
-        <w:t xml:space="preserve"> × z) = 24,3 kN; H</w:t>
+        <w:t xml:space="preserve"> × z) = 34,9 kN; H</w:t>
       </w:r>
       <w:r>
         <w:rPr>
@@ -1969,7 +1969,7 @@
           <w:szCs w:val="24"/>
           <w:lang w:val="vi-VN"/>
         </w:rPr>
-        <w:t xml:space="preserve"> một vít = 15,0 kN (Broms, đầu tự do ở mặt bùn). 1,5 × 74,3 = 111,5 ≤ 244,2 kN; mức sử dụng 0,69.</w:t>
+        <w:t xml:space="preserve"> một vít = 15,0 kN (Broms, đầu tự do ở mặt bùn). 1,5 × 16,3 = 24,5 ≤ 425,5 kN; mức sử dụng 0,38.</w:t>
       </w:r>
     </w:p>
     <w:p>
@@ -2073,7 +2073,7 @@
           <w:szCs w:val="24"/>
           <w:lang w:val="vi-VN"/>
         </w:rPr>
-        <w:t xml:space="preserve"> × B / 2 = 74,3 × (0,4 + 0,15) + 85,0 × 4,00 / 2 = 210,8 kNm; M</w:t>
+        <w:t xml:space="preserve"> × B / 2 = 16,3 × (0,4 + 0,15) + 171,2 × 5,75 / 2 = 501,0 kNm; M</w:t>
       </w:r>
       <w:r>
         <w:rPr>
@@ -2136,7 +2136,7 @@
           <w:szCs w:val="24"/>
           <w:lang w:val="vi-VN"/>
         </w:rPr>
-        <w:t xml:space="preserve"> × c = 318,7 kNm (c = 0,15 m từ mép đế tới tim lỗ vít). 1,5 × 210,8 = 316,2 ≤ 318,7 kNm; mức sử dụng 0,99.</w:t>
+        <w:t xml:space="preserve"> × c = 752,4 kNm (c = 0,15 m từ mép đế tới tim lỗ vít). 1,5 × 501,0 = 751,6 ≤ 752,4 kNm; mức sử dụng 1,00.</w:t>
       </w:r>
     </w:p>
     <w:p>
@@ -2219,7 +2219,7 @@
           <w:szCs w:val="24"/>
           <w:lang w:val="vi-VN"/>
         </w:rPr>
-        <w:t xml:space="preserve"> − 0,9 × W' × B / 2) / (B − c) / (n/2)] = 4,9 kN ≤ Q</w:t>
+        <w:t xml:space="preserve"> − 0,9 × W' × B / 2) / (B − c) / (n/2)] = 0,0 kN ≤ Q</w:t>
       </w:r>
       <w:r>
         <w:rPr>
@@ -2240,7 +2240,7 @@
           <w:szCs w:val="24"/>
           <w:lang w:val="vi-VN"/>
         </w:rPr>
-        <w:t xml:space="preserve"> = 7,9 kN; mức sử dụng 0,62.</w:t>
+        <w:t xml:space="preserve"> = 7,9 kN; mức sử dụng 0,00.</w:t>
       </w:r>
     </w:p>
     <w:p>
@@ -2322,7 +2322,7 @@
           <w:szCs w:val="24"/>
           <w:lang w:val="vi-VN"/>
         </w:rPr>
-        <w:t xml:space="preserve"> × (s/2) / B = 14,65 kNm/m (s = B − 2c); thép cần A</w:t>
+        <w:t xml:space="preserve"> × (s/2) / B = 15,01 kNm/m (s = B − 2c); thép cần A</w:t>
       </w:r>
       <w:r>
         <w:rPr>
@@ -2385,7 +2385,7 @@
           <w:szCs w:val="24"/>
           <w:lang w:val="vi-VN"/>
         </w:rPr>
-        <w:t xml:space="preserve">) = 179 mm²/m, tối thiểu 0,1% = 350 mm²/m; bố trí lưới Ø12 a200 hai lớp = 565 mm²/m; mức sử dụng 0,62.</w:t>
+        <w:t xml:space="preserve">) = 183 mm²/m, tối thiểu 0,1% = 350 mm²/m; bố trí lưới Ø12 a200 hai lớp = 565 mm²/m; mức sử dụng 0,62.</w:t>
       </w:r>
     </w:p>
     <w:p>
@@ -2405,7 +2405,7 @@
           <w:szCs w:val="24"/>
           <w:lang w:val="vi-VN"/>
         </w:rPr>
-        <w:t xml:space="preserve">Cả hệ: 19 đế (2 đế 2,50 m, 2 đế 2,75 m, 2 đế 3,50 m, 1 đế 3,75 m, 6 đế 4,00 m, 3 đế 4,25 m, 2 đế 5,75 m, 1 đế 6,00 m), 133,2 m³ bê tông, 5,9 tấn thép bản, 76 vít (283 m), đế nặng nhất khi cẩu 36,7 tấn.</w:t>
+        <w:t xml:space="preserve">Cả hệ: 17 đế (2 đế 2,75 m, 2 đế 3,50 m, 1 đế 3,75 m, 6 đế 4,00 m, 3 đế 4,25 m, 2 đế 5,75 m, 1 đế 6,00 m), 128,3 m³ bê tông, 5,6 tấn thép bản, 68 vít (253 m), đế nặng nhất khi cẩu 36,7 tấn.</w:t>
       </w:r>
     </w:p>
     <w:p>
@@ -2425,7 +2425,7 @@
           <w:szCs w:val="24"/>
           <w:lang w:val="vi-VN"/>
         </w:rPr>
-        <w:t xml:space="preserve">Tổng lực nhổ lên 19 đế 1.798 kN, tổng sức chống nhổ 2.405 kN. Mức sử dụng lớn nhất: nhổ 0,83, trượt 0,76, lật 0,99, một vít 0,78.</w:t>
+        <w:t xml:space="preserve">Tổng lực nhổ lên 17 đế 1.746 kN, tổng sức chống nhổ 2.275 kN. Mức sử dụng lớn nhất: nhổ 0,83, trượt 0,75, lật 1,00, một vít 0,78.</w:t>
       </w:r>
     </w:p>
     <w:p>
@@ -2464,7 +2464,7 @@
           <w:szCs w:val="24"/>
           <w:lang w:val="vi-VN"/>
         </w:rPr>
-        <w:t xml:space="preserve">Mỗi dây cắt đủ dài cho mực nước làm khoảng cách bích – chốt dài nhất (29 dây đáy ở MNLKT, 186 dây bờ ở MNC). Tổng chiều dài cắt: dây bờ 8.624 m, dây đáy 767 m, chưa gồm đoạn bện đầu và phụ kiện.</w:t>
+        <w:t xml:space="preserve">Mỗi dây cắt đủ dài cho mực nước làm khoảng cách bích – chốt dài nhất (27 dây đáy ở MNLKT, 188 dây bờ ở MNC). Tổng chiều dài cắt: dây bờ 8.716 m, dây đáy 720 m, chưa gồm đoạn bện đầu và phụ kiện.</w:t>
       </w:r>
     </w:p>
     <w:p>
@@ -2543,7 +2543,7 @@
           <w:szCs w:val="24"/>
           <w:lang w:val="vi-VN"/>
         </w:rPr>
-        <w:t xml:space="preserve">Nếu khóa của thiết bị bù KHÔNG khóa kịp, đối trọng chỉ giữ lực căng 5 kN và hành trình dư 3 m mỗi chiều: bè trôi 3,6–6,7 m (tới hết hành trình rồi dây mới căng) và lực dây vọt tới 89–383 kN (hệ số an toàn cáp chỉ 1,8–4,3; đế và cọc không được tính cho lực này). Đối trọng treo tự do KHÔNG đủ giữ bè: cần bộ khóa / phanh chủ động, dự phòng, kiểm tra định kỳ.</w:t>
+        <w:t xml:space="preserve">Nếu khóa của thiết bị bù KHÔNG khóa kịp, đối trọng chỉ giữ lực căng 5 kN và hành trình dư 3 m mỗi chiều: bè trôi 3,6–6,7 m (tới hết hành trình rồi dây mới căng) và lực dây vọt tới 90–383 kN (hệ số an toàn cáp chỉ 1,8–4,3; đế và cọc không được tính cho lực này). Đối trọng treo tự do KHÔNG đủ giữ bè: cần bộ khóa / phanh chủ động, dự phòng, kiểm tra định kỳ.</w:t>
       </w:r>
     </w:p>
     <w:p>
@@ -2583,7 +2583,7 @@
           <w:szCs w:val="24"/>
           <w:lang w:val="vi-VN"/>
         </w:rPr>
-        <w:t xml:space="preserve">Đế vít xoắn đặt trên mặt đất IFC tại chỗ (không phải đáy thiết kế chung như Huổi Vanh): 3/19 đế có nền cao hơn MNC (tới 654,44 m) nên lộ khô khi hồ xuống mực nước chết.</w:t>
+        <w:t xml:space="preserve">Đế vít xoắn đặt trên mặt đất IFC tại chỗ (không phải đáy thiết kế chung như Huổi Vanh): 1/17 đế có nền cao hơn MNC (tới 650,48 m) nên lộ khô khi hồ xuống mực nước chết.</w:t>
       </w:r>
     </w:p>
     <w:p>
@@ -2643,7 +2643,7 @@
           <w:szCs w:val="24"/>
           <w:lang w:val="vi-VN"/>
         </w:rPr>
-        <w:t xml:space="preserve">15/186 dây bờ lệch quá 60° so với pháp tuyến mép bè (tới 90°: B1-D06, B1-D24, B1-D38, B2-D09, B2-D11, B2-D16, B2-D49, B2-D54, B3-D05, B5-D05, B5-D18, B5-D23, B5-D29, B6-D15, B6-D26) — do ưu tiên neo bờ thay đế ở các khe giữa bè: cáp chạy xiên dọc mép, tai neo trên bè chịu lực xiên; nhà sản xuất bè cần xác nhận.</w:t>
+        <w:t xml:space="preserve">15/188 dây bờ lệch quá 60° so với pháp tuyến mép bè (tới 90°: B1-D06, B1-D24, B1-D38, B2-D09, B2-D11, B2-D16, B2-D49, B2-D54, B3-D05, B5-D05, B5-D18, B5-D23, B5-D29, B6-D15, B6-D26) — do ưu tiên neo bờ thay đế ở các khe giữa bè: cáp chạy xiên dọc mép, tai neo trên bè chịu lực xiên; nhà sản xuất bè cần xác nhận.</w:t>
       </w:r>
     </w:p>
     <w:p>
@@ -2663,7 +2663,7 @@
           <w:szCs w:val="24"/>
           <w:lang w:val="vi-VN"/>
         </w:rPr>
-        <w:t xml:space="preserve">9/19 đế vít xoắn là đế ĐƠN (một dây), ở vùng nước trống xa bờ hơn tầm dây bờ cho phép 80 m hoặc ở khe không đặt được dây đối diện: quy tắc của Huổi Vanh "đế chỉ đặt giữa hai bè" không áp dụng được cho mặt bằng này — cần Chủ đầu tư xác nhận.</w:t>
+        <w:t xml:space="preserve">7/17 đế vít xoắn là đế ĐƠN (một dây), ở vùng nước trống xa bờ hơn tầm dây bờ cho phép 80 m hoặc ở khe không đặt được dây đối diện: quy tắc của Huổi Vanh "đế chỉ đặt giữa hai bè" không áp dụng được cho mặt bằng này — cần Chủ đầu tư xác nhận.</w:t>
       </w:r>
     </w:p>
     <w:p>
@@ -2764,7 +2764,7 @@
           <w:szCs w:val="24"/>
           <w:lang w:val="vi-VN"/>
         </w:rPr>
-        <w:t xml:space="preserve">Đế đặt trên địa hình IFC tại chỗ, chưa phải khảo sát. 171/186 cọc bờ đứng ở chỗ mặt đất thấp hơn MNDB.</w:t>
+        <w:t xml:space="preserve">Đế đặt trên địa hình IFC tại chỗ, chưa phải khảo sát. 172/188 cọc bờ đứng ở chỗ mặt đất thấp hơn MNDB.</w:t>
       </w:r>
     </w:p>
     <w:p>
@@ -5849,7 +5849,7 @@
                 <w:szCs w:val="18"/>
                 <w:lang w:val="vi-VN"/>
               </w:rPr>
-              <w:t xml:space="preserve">76,5</w:t>
+              <w:t xml:space="preserve">78,7</w:t>
             </w:r>
           </w:p>
         </w:tc>
@@ -5887,26 +5887,26 @@
                 <w:szCs w:val="18"/>
                 <w:lang w:val="vi-VN"/>
               </w:rPr>
-              <w:t xml:space="preserve">3,99</w:t>
-            </w:r>
-          </w:p>
-        </w:tc>
-        <w:tc>
-          <w:p>
-            <w:pPr>
-              <w:jc w:val="center"/>
-            </w:pPr>
-            <w:r>
-              <w:rPr>
-                <w:rFonts w:ascii="Times New Roman" w:cs="Times New Roman" w:eastAsia="Times New Roman" w:hAnsi="Times New Roman"/>
-                <w:b w:val="false"/>
-                <w:bCs w:val="false"/>
-                <w:noProof/>
-                <w:sz w:val="18"/>
-                <w:szCs w:val="18"/>
-                <w:lang w:val="vi-VN"/>
-              </w:rPr>
-              <w:t xml:space="preserve">15</w:t>
+              <w:t xml:space="preserve">3,88</w:t>
+            </w:r>
+          </w:p>
+        </w:tc>
+        <w:tc>
+          <w:p>
+            <w:pPr>
+              <w:jc w:val="center"/>
+            </w:pPr>
+            <w:r>
+              <w:rPr>
+                <w:rFonts w:ascii="Times New Roman" w:cs="Times New Roman" w:eastAsia="Times New Roman" w:hAnsi="Times New Roman"/>
+                <w:b w:val="false"/>
+                <w:bCs w:val="false"/>
+                <w:noProof/>
+                <w:sz w:val="18"/>
+                <w:szCs w:val="18"/>
+                <w:lang w:val="vi-VN"/>
+              </w:rPr>
+              <w:t xml:space="preserve">17</w:t>
             </w:r>
           </w:p>
         </w:tc>
@@ -5982,26 +5982,26 @@
                 <w:szCs w:val="18"/>
                 <w:lang w:val="vi-VN"/>
               </w:rPr>
-              <w:t xml:space="preserve">0,66</w:t>
-            </w:r>
-          </w:p>
-        </w:tc>
-        <w:tc>
-          <w:p>
-            <w:pPr>
-              <w:jc w:val="center"/>
-            </w:pPr>
-            <w:r>
-              <w:rPr>
-                <w:rFonts w:ascii="Times New Roman" w:cs="Times New Roman" w:eastAsia="Times New Roman" w:hAnsi="Times New Roman"/>
-                <w:b w:val="false"/>
-                <w:bCs w:val="false"/>
-                <w:noProof/>
-                <w:sz w:val="18"/>
-                <w:szCs w:val="18"/>
-                <w:lang w:val="vi-VN"/>
-              </w:rPr>
-              <w:t xml:space="preserve">0,91</w:t>
+              <w:t xml:space="preserve">0,68</w:t>
+            </w:r>
+          </w:p>
+        </w:tc>
+        <w:tc>
+          <w:p>
+            <w:pPr>
+              <w:jc w:val="center"/>
+            </w:pPr>
+            <w:r>
+              <w:rPr>
+                <w:rFonts w:ascii="Times New Roman" w:cs="Times New Roman" w:eastAsia="Times New Roman" w:hAnsi="Times New Roman"/>
+                <w:b w:val="false"/>
+                <w:bCs w:val="false"/>
+                <w:noProof/>
+                <w:sz w:val="18"/>
+                <w:szCs w:val="18"/>
+                <w:lang w:val="vi-VN"/>
+              </w:rPr>
+              <w:t xml:space="preserve">0,95</w:t>
             </w:r>
           </w:p>
         </w:tc>
@@ -6914,7 +6914,7 @@
                 <w:szCs w:val="18"/>
                 <w:lang w:val="vi-VN"/>
               </w:rPr>
-              <w:t xml:space="preserve">186</w:t>
+              <w:t xml:space="preserve">188</w:t>
             </w:r>
           </w:p>
         </w:tc>
@@ -6971,7 +6971,7 @@
                 <w:szCs w:val="18"/>
                 <w:lang w:val="vi-VN"/>
               </w:rPr>
-              <w:t xml:space="preserve">1.227,6 m</w:t>
+              <w:t xml:space="preserve">1.240,8 m</w:t>
             </w:r>
           </w:p>
         </w:tc>
@@ -7046,7 +7046,7 @@
           <w:szCs w:val="20"/>
           <w:lang w:val="vi-VN"/>
         </w:rPr>
-        <w:t xml:space="preserve">Cọc khoan nhồi: 186 cọc, tổng dài 1.227,6 m, 118,1 m³ bê tông, 36,2 tấn thép. BP-1, BP-2 là mức sử dụng (≤ 1,00 là đạt).</w:t>
+        <w:t xml:space="preserve">Cọc khoan nhồi: 188 cọc, tổng dài 1.240,8 m, 119,4 m³ bê tông, 36,6 tấn thép. BP-1, BP-2 là mức sử dụng (≤ 1,00 là đạt).</w:t>
       </w:r>
     </w:p>
     <w:p>
@@ -7065,7 +7065,7 @@
           <w:szCs w:val="26"/>
           <w:lang w:val="vi-VN"/>
         </w:rPr>
-        <w:t xml:space="preserve">Bảng B. 19 đế BTCT + vít xoắn</w:t>
+        <w:t xml:space="preserve">Bảng B. 17 đế BTCT + vít xoắn</w:t>
       </w:r>
     </w:p>
     <w:tbl>
@@ -9815,26 +9815,26 @@
                 <w:szCs w:val="18"/>
                 <w:lang w:val="vi-VN"/>
               </w:rPr>
-              <w:t xml:space="preserve">175,1</w:t>
-            </w:r>
-          </w:p>
-        </w:tc>
-        <w:tc>
-          <w:p>
-            <w:pPr>
-              <w:jc w:val="center"/>
-            </w:pPr>
-            <w:r>
-              <w:rPr>
-                <w:rFonts w:ascii="Times New Roman" w:cs="Times New Roman" w:eastAsia="Times New Roman" w:hAnsi="Times New Roman"/>
-                <w:b w:val="false"/>
-                <w:bCs w:val="false"/>
-                <w:noProof/>
-                <w:sz w:val="18"/>
-                <w:szCs w:val="18"/>
-                <w:lang w:val="vi-VN"/>
-              </w:rPr>
-              <w:t xml:space="preserve">0,77</w:t>
+              <w:t xml:space="preserve">177,7</w:t>
+            </w:r>
+          </w:p>
+        </w:tc>
+        <w:tc>
+          <w:p>
+            <w:pPr>
+              <w:jc w:val="center"/>
+            </w:pPr>
+            <w:r>
+              <w:rPr>
+                <w:rFonts w:ascii="Times New Roman" w:cs="Times New Roman" w:eastAsia="Times New Roman" w:hAnsi="Times New Roman"/>
+                <w:b w:val="false"/>
+                <w:bCs w:val="false"/>
+                <w:noProof/>
+                <w:sz w:val="18"/>
+                <w:szCs w:val="18"/>
+                <w:lang w:val="vi-VN"/>
+              </w:rPr>
+              <w:t xml:space="preserve">0,79</w:t>
             </w:r>
           </w:p>
         </w:tc>
@@ -9872,7 +9872,7 @@
                 <w:szCs w:val="18"/>
                 <w:lang w:val="vi-VN"/>
               </w:rPr>
-              <w:t xml:space="preserve">0,96</w:t>
+              <w:t xml:space="preserve">0,97</w:t>
             </w:r>
           </w:p>
         </w:tc>
@@ -10281,7 +10281,7 @@
                 <w:szCs w:val="18"/>
                 <w:lang w:val="vi-VN"/>
               </w:rPr>
-              <w:t xml:space="preserve">169,3</w:t>
+              <w:t xml:space="preserve">171,2</w:t>
             </w:r>
           </w:p>
         </w:tc>
@@ -10338,7 +10338,7 @@
                 <w:szCs w:val="18"/>
                 <w:lang w:val="vi-VN"/>
               </w:rPr>
-              <w:t xml:space="preserve">0,99</w:t>
+              <w:t xml:space="preserve">1,00</w:t>
             </w:r>
           </w:p>
         </w:tc>
@@ -10419,26 +10419,26 @@
                 <w:szCs w:val="18"/>
                 <w:lang w:val="vi-VN"/>
               </w:rPr>
-              <w:t xml:space="preserve">B3-D16</w:t>
-            </w:r>
-          </w:p>
-        </w:tc>
-        <w:tc>
-          <w:p>
-            <w:pPr>
-              <w:jc w:val="center"/>
-            </w:pPr>
-            <w:r>
-              <w:rPr>
-                <w:rFonts w:ascii="Times New Roman" w:cs="Times New Roman" w:eastAsia="Times New Roman" w:hAnsi="Times New Roman"/>
-                <w:b w:val="false"/>
-                <w:bCs w:val="false"/>
-                <w:noProof/>
-                <w:sz w:val="18"/>
-                <w:szCs w:val="18"/>
-                <w:lang w:val="vi-VN"/>
-              </w:rPr>
-              <w:t xml:space="preserve">2,50</w:t>
+              <w:t xml:space="preserve">B5-D17 + B6-D06</w:t>
+            </w:r>
+          </w:p>
+        </w:tc>
+        <w:tc>
+          <w:p>
+            <w:pPr>
+              <w:jc w:val="center"/>
+            </w:pPr>
+            <w:r>
+              <w:rPr>
+                <w:rFonts w:ascii="Times New Roman" w:cs="Times New Roman" w:eastAsia="Times New Roman" w:hAnsi="Times New Roman"/>
+                <w:b w:val="false"/>
+                <w:bCs w:val="false"/>
+                <w:noProof/>
+                <w:sz w:val="18"/>
+                <w:szCs w:val="18"/>
+                <w:lang w:val="vi-VN"/>
+              </w:rPr>
+              <w:t xml:space="preserve">5,75</w:t>
             </w:r>
           </w:p>
         </w:tc>
@@ -10476,102 +10476,102 @@
                 <w:szCs w:val="18"/>
                 <w:lang w:val="vi-VN"/>
               </w:rPr>
-              <w:t xml:space="preserve">2,48</w:t>
-            </w:r>
-          </w:p>
-        </w:tc>
-        <w:tc>
-          <w:p>
-            <w:pPr>
-              <w:jc w:val="center"/>
-            </w:pPr>
-            <w:r>
-              <w:rPr>
-                <w:rFonts w:ascii="Times New Roman" w:cs="Times New Roman" w:eastAsia="Times New Roman" w:hAnsi="Times New Roman"/>
-                <w:b w:val="false"/>
-                <w:bCs w:val="false"/>
-                <w:noProof/>
-                <w:sz w:val="18"/>
-                <w:szCs w:val="18"/>
-                <w:lang w:val="vi-VN"/>
-              </w:rPr>
-              <w:t xml:space="preserve">6,4</w:t>
-            </w:r>
-          </w:p>
-        </w:tc>
-        <w:tc>
-          <w:p>
-            <w:pPr>
-              <w:jc w:val="center"/>
-            </w:pPr>
-            <w:r>
-              <w:rPr>
-                <w:rFonts w:ascii="Times New Roman" w:cs="Times New Roman" w:eastAsia="Times New Roman" w:hAnsi="Times New Roman"/>
-                <w:b w:val="false"/>
-                <w:bCs w:val="false"/>
-                <w:noProof/>
-                <w:sz w:val="18"/>
-                <w:szCs w:val="18"/>
-                <w:lang w:val="vi-VN"/>
-              </w:rPr>
-              <w:t xml:space="preserve">19,1</w:t>
-            </w:r>
-          </w:p>
-        </w:tc>
-        <w:tc>
-          <w:p>
-            <w:pPr>
-              <w:jc w:val="center"/>
-            </w:pPr>
-            <w:r>
-              <w:rPr>
-                <w:rFonts w:ascii="Times New Roman" w:cs="Times New Roman" w:eastAsia="Times New Roman" w:hAnsi="Times New Roman"/>
-                <w:b w:val="false"/>
-                <w:bCs w:val="false"/>
-                <w:noProof/>
-                <w:sz w:val="18"/>
-                <w:szCs w:val="18"/>
-                <w:lang w:val="vi-VN"/>
-              </w:rPr>
-              <w:t xml:space="preserve">0,29</w:t>
-            </w:r>
-          </w:p>
-        </w:tc>
-        <w:tc>
-          <w:p>
-            <w:pPr>
-              <w:jc w:val="center"/>
-            </w:pPr>
-            <w:r>
-              <w:rPr>
-                <w:rFonts w:ascii="Times New Roman" w:cs="Times New Roman" w:eastAsia="Times New Roman" w:hAnsi="Times New Roman"/>
-                <w:b w:val="false"/>
-                <w:bCs w:val="false"/>
-                <w:noProof/>
-                <w:sz w:val="18"/>
-                <w:szCs w:val="18"/>
-                <w:lang w:val="vi-VN"/>
-              </w:rPr>
-              <w:t xml:space="preserve">0,33</w:t>
-            </w:r>
-          </w:p>
-        </w:tc>
-        <w:tc>
-          <w:p>
-            <w:pPr>
-              <w:jc w:val="center"/>
-            </w:pPr>
-            <w:r>
-              <w:rPr>
-                <w:rFonts w:ascii="Times New Roman" w:cs="Times New Roman" w:eastAsia="Times New Roman" w:hAnsi="Times New Roman"/>
-                <w:b w:val="false"/>
-                <w:bCs w:val="false"/>
-                <w:noProof/>
-                <w:sz w:val="18"/>
-                <w:szCs w:val="18"/>
-                <w:lang w:val="vi-VN"/>
-              </w:rPr>
-              <w:t xml:space="preserve">0,44</w:t>
+              <w:t xml:space="preserve">13,21</w:t>
+            </w:r>
+          </w:p>
+        </w:tc>
+        <w:tc>
+          <w:p>
+            <w:pPr>
+              <w:jc w:val="center"/>
+            </w:pPr>
+            <w:r>
+              <w:rPr>
+                <w:rFonts w:ascii="Times New Roman" w:cs="Times New Roman" w:eastAsia="Times New Roman" w:hAnsi="Times New Roman"/>
+                <w:b w:val="false"/>
+                <w:bCs w:val="false"/>
+                <w:noProof/>
+                <w:sz w:val="18"/>
+                <w:szCs w:val="18"/>
+                <w:lang w:val="vi-VN"/>
+              </w:rPr>
+              <w:t xml:space="preserve">33,7</w:t>
+            </w:r>
+          </w:p>
+        </w:tc>
+        <w:tc>
+          <w:p>
+            <w:pPr>
+              <w:jc w:val="center"/>
+            </w:pPr>
+            <w:r>
+              <w:rPr>
+                <w:rFonts w:ascii="Times New Roman" w:cs="Times New Roman" w:eastAsia="Times New Roman" w:hAnsi="Times New Roman"/>
+                <w:b w:val="false"/>
+                <w:bCs w:val="false"/>
+                <w:noProof/>
+                <w:sz w:val="18"/>
+                <w:szCs w:val="18"/>
+                <w:lang w:val="vi-VN"/>
+              </w:rPr>
+              <w:t xml:space="preserve">156,6</w:t>
+            </w:r>
+          </w:p>
+        </w:tc>
+        <w:tc>
+          <w:p>
+            <w:pPr>
+              <w:jc w:val="center"/>
+            </w:pPr>
+            <w:r>
+              <w:rPr>
+                <w:rFonts w:ascii="Times New Roman" w:cs="Times New Roman" w:eastAsia="Times New Roman" w:hAnsi="Times New Roman"/>
+                <w:b w:val="false"/>
+                <w:bCs w:val="false"/>
+                <w:noProof/>
+                <w:sz w:val="18"/>
+                <w:szCs w:val="18"/>
+                <w:lang w:val="vi-VN"/>
+              </w:rPr>
+              <w:t xml:space="preserve">0,74</w:t>
+            </w:r>
+          </w:p>
+        </w:tc>
+        <w:tc>
+          <w:p>
+            <w:pPr>
+              <w:jc w:val="center"/>
+            </w:pPr>
+            <w:r>
+              <w:rPr>
+                <w:rFonts w:ascii="Times New Roman" w:cs="Times New Roman" w:eastAsia="Times New Roman" w:hAnsi="Times New Roman"/>
+                <w:b w:val="false"/>
+                <w:bCs w:val="false"/>
+                <w:noProof/>
+                <w:sz w:val="18"/>
+                <w:szCs w:val="18"/>
+                <w:lang w:val="vi-VN"/>
+              </w:rPr>
+              <w:t xml:space="preserve">0,52</w:t>
+            </w:r>
+          </w:p>
+        </w:tc>
+        <w:tc>
+          <w:p>
+            <w:pPr>
+              <w:jc w:val="center"/>
+            </w:pPr>
+            <w:r>
+              <w:rPr>
+                <w:rFonts w:ascii="Times New Roman" w:cs="Times New Roman" w:eastAsia="Times New Roman" w:hAnsi="Times New Roman"/>
+                <w:b w:val="false"/>
+                <w:bCs w:val="false"/>
+                <w:noProof/>
+                <w:sz w:val="18"/>
+                <w:szCs w:val="18"/>
+                <w:lang w:val="vi-VN"/>
+              </w:rPr>
+              <w:t xml:space="preserve">0,95</w:t>
             </w:r>
           </w:p>
         </w:tc>
@@ -10652,26 +10652,26 @@
                 <w:szCs w:val="18"/>
                 <w:lang w:val="vi-VN"/>
               </w:rPr>
-              <w:t xml:space="preserve">B3-D18</w:t>
-            </w:r>
-          </w:p>
-        </w:tc>
-        <w:tc>
-          <w:p>
-            <w:pPr>
-              <w:jc w:val="center"/>
-            </w:pPr>
-            <w:r>
-              <w:rPr>
-                <w:rFonts w:ascii="Times New Roman" w:cs="Times New Roman" w:eastAsia="Times New Roman" w:hAnsi="Times New Roman"/>
-                <w:b w:val="false"/>
-                <w:bCs w:val="false"/>
-                <w:noProof/>
-                <w:sz w:val="18"/>
-                <w:szCs w:val="18"/>
-                <w:lang w:val="vi-VN"/>
-              </w:rPr>
-              <w:t xml:space="preserve">2,50</w:t>
+              <w:t xml:space="preserve">B6-D13</w:t>
+            </w:r>
+          </w:p>
+        </w:tc>
+        <w:tc>
+          <w:p>
+            <w:pPr>
+              <w:jc w:val="center"/>
+            </w:pPr>
+            <w:r>
+              <w:rPr>
+                <w:rFonts w:ascii="Times New Roman" w:cs="Times New Roman" w:eastAsia="Times New Roman" w:hAnsi="Times New Roman"/>
+                <w:b w:val="false"/>
+                <w:bCs w:val="false"/>
+                <w:noProof/>
+                <w:sz w:val="18"/>
+                <w:szCs w:val="18"/>
+                <w:lang w:val="vi-VN"/>
+              </w:rPr>
+              <w:t xml:space="preserve">4,00</w:t>
             </w:r>
           </w:p>
         </w:tc>
@@ -10709,121 +10709,121 @@
                 <w:szCs w:val="18"/>
                 <w:lang w:val="vi-VN"/>
               </w:rPr>
-              <w:t xml:space="preserve">2,48</w:t>
-            </w:r>
-          </w:p>
-        </w:tc>
-        <w:tc>
-          <w:p>
-            <w:pPr>
-              <w:jc w:val="center"/>
-            </w:pPr>
-            <w:r>
-              <w:rPr>
-                <w:rFonts w:ascii="Times New Roman" w:cs="Times New Roman" w:eastAsia="Times New Roman" w:hAnsi="Times New Roman"/>
-                <w:b w:val="false"/>
-                <w:bCs w:val="false"/>
-                <w:noProof/>
-                <w:sz w:val="18"/>
-                <w:szCs w:val="18"/>
-                <w:lang w:val="vi-VN"/>
-              </w:rPr>
-              <w:t xml:space="preserve">6,4</w:t>
-            </w:r>
-          </w:p>
-        </w:tc>
-        <w:tc>
-          <w:p>
-            <w:pPr>
-              <w:jc w:val="center"/>
-            </w:pPr>
-            <w:r>
-              <w:rPr>
-                <w:rFonts w:ascii="Times New Roman" w:cs="Times New Roman" w:eastAsia="Times New Roman" w:hAnsi="Times New Roman"/>
-                <w:b w:val="false"/>
-                <w:bCs w:val="false"/>
-                <w:noProof/>
-                <w:sz w:val="18"/>
-                <w:szCs w:val="18"/>
-                <w:lang w:val="vi-VN"/>
-              </w:rPr>
-              <w:t xml:space="preserve">37,8</w:t>
-            </w:r>
-          </w:p>
-        </w:tc>
-        <w:tc>
-          <w:p>
-            <w:pPr>
-              <w:jc w:val="center"/>
-            </w:pPr>
-            <w:r>
-              <w:rPr>
-                <w:rFonts w:ascii="Times New Roman" w:cs="Times New Roman" w:eastAsia="Times New Roman" w:hAnsi="Times New Roman"/>
-                <w:b w:val="false"/>
-                <w:bCs w:val="false"/>
-                <w:noProof/>
-                <w:sz w:val="18"/>
-                <w:szCs w:val="18"/>
-                <w:lang w:val="vi-VN"/>
-              </w:rPr>
-              <w:t xml:space="preserve">0,58</w:t>
-            </w:r>
-          </w:p>
-        </w:tc>
-        <w:tc>
-          <w:p>
-            <w:pPr>
-              <w:jc w:val="center"/>
-            </w:pPr>
-            <w:r>
-              <w:rPr>
-                <w:rFonts w:ascii="Times New Roman" w:cs="Times New Roman" w:eastAsia="Times New Roman" w:hAnsi="Times New Roman"/>
-                <w:b w:val="false"/>
-                <w:bCs w:val="false"/>
-                <w:noProof/>
-                <w:sz w:val="18"/>
-                <w:szCs w:val="18"/>
-                <w:lang w:val="vi-VN"/>
-              </w:rPr>
-              <w:t xml:space="preserve">0,76</w:t>
-            </w:r>
-          </w:p>
-        </w:tc>
-        <w:tc>
-          <w:p>
-            <w:pPr>
-              <w:jc w:val="center"/>
-            </w:pPr>
-            <w:r>
-              <w:rPr>
-                <w:rFonts w:ascii="Times New Roman" w:cs="Times New Roman" w:eastAsia="Times New Roman" w:hAnsi="Times New Roman"/>
-                <w:b w:val="false"/>
-                <w:bCs w:val="false"/>
-                <w:noProof/>
-                <w:sz w:val="18"/>
-                <w:szCs w:val="18"/>
-                <w:lang w:val="vi-VN"/>
-              </w:rPr>
-              <w:t xml:space="preserve">0,81</w:t>
-            </w:r>
-          </w:p>
-        </w:tc>
-        <w:tc>
-          <w:p>
-            <w:pPr>
-              <w:jc w:val="center"/>
-            </w:pPr>
-            <w:r>
-              <w:rPr>
-                <w:rFonts w:ascii="Times New Roman" w:cs="Times New Roman" w:eastAsia="Times New Roman" w:hAnsi="Times New Roman"/>
-                <w:b w:val="false"/>
-                <w:bCs w:val="false"/>
-                <w:noProof/>
-                <w:sz w:val="18"/>
-                <w:szCs w:val="18"/>
-                <w:lang w:val="vi-VN"/>
-              </w:rPr>
-              <w:t xml:space="preserve">0,70</w:t>
+              <w:t xml:space="preserve">6,38</w:t>
+            </w:r>
+          </w:p>
+        </w:tc>
+        <w:tc>
+          <w:p>
+            <w:pPr>
+              <w:jc w:val="center"/>
+            </w:pPr>
+            <w:r>
+              <w:rPr>
+                <w:rFonts w:ascii="Times New Roman" w:cs="Times New Roman" w:eastAsia="Times New Roman" w:hAnsi="Times New Roman"/>
+                <w:b w:val="false"/>
+                <w:bCs w:val="false"/>
+                <w:noProof/>
+                <w:sz w:val="18"/>
+                <w:szCs w:val="18"/>
+                <w:lang w:val="vi-VN"/>
+              </w:rPr>
+              <w:t xml:space="preserve">16,3</w:t>
+            </w:r>
+          </w:p>
+        </w:tc>
+        <w:tc>
+          <w:p>
+            <w:pPr>
+              <w:jc w:val="center"/>
+            </w:pPr>
+            <w:r>
+              <w:rPr>
+                <w:rFonts w:ascii="Times New Roman" w:cs="Times New Roman" w:eastAsia="Times New Roman" w:hAnsi="Times New Roman"/>
+                <w:b w:val="false"/>
+                <w:bCs w:val="false"/>
+                <w:noProof/>
+                <w:sz w:val="18"/>
+                <w:szCs w:val="18"/>
+                <w:lang w:val="vi-VN"/>
+              </w:rPr>
+              <w:t xml:space="preserve">83,3</w:t>
+            </w:r>
+          </w:p>
+        </w:tc>
+        <w:tc>
+          <w:p>
+            <w:pPr>
+              <w:jc w:val="center"/>
+            </w:pPr>
+            <w:r>
+              <w:rPr>
+                <w:rFonts w:ascii="Times New Roman" w:cs="Times New Roman" w:eastAsia="Times New Roman" w:hAnsi="Times New Roman"/>
+                <w:b w:val="false"/>
+                <w:bCs w:val="false"/>
+                <w:noProof/>
+                <w:sz w:val="18"/>
+                <w:szCs w:val="18"/>
+                <w:lang w:val="vi-VN"/>
+              </w:rPr>
+              <w:t xml:space="preserve">0,71</w:t>
+            </w:r>
+          </w:p>
+        </w:tc>
+        <w:tc>
+          <w:p>
+            <w:pPr>
+              <w:jc w:val="center"/>
+            </w:pPr>
+            <w:r>
+              <w:rPr>
+                <w:rFonts w:ascii="Times New Roman" w:cs="Times New Roman" w:eastAsia="Times New Roman" w:hAnsi="Times New Roman"/>
+                <w:b w:val="false"/>
+                <w:bCs w:val="false"/>
+                <w:noProof/>
+                <w:sz w:val="18"/>
+                <w:szCs w:val="18"/>
+                <w:lang w:val="vi-VN"/>
+              </w:rPr>
+              <w:t xml:space="preserve">0,67</w:t>
+            </w:r>
+          </w:p>
+        </w:tc>
+        <w:tc>
+          <w:p>
+            <w:pPr>
+              <w:jc w:val="center"/>
+            </w:pPr>
+            <w:r>
+              <w:rPr>
+                <w:rFonts w:ascii="Times New Roman" w:cs="Times New Roman" w:eastAsia="Times New Roman" w:hAnsi="Times New Roman"/>
+                <w:b w:val="false"/>
+                <w:bCs w:val="false"/>
+                <w:noProof/>
+                <w:sz w:val="18"/>
+                <w:szCs w:val="18"/>
+                <w:lang w:val="vi-VN"/>
+              </w:rPr>
+              <w:t xml:space="preserve">0,97</w:t>
+            </w:r>
+          </w:p>
+        </w:tc>
+        <w:tc>
+          <w:p>
+            <w:pPr>
+              <w:jc w:val="center"/>
+            </w:pPr>
+            <w:r>
+              <w:rPr>
+                <w:rFonts w:ascii="Times New Roman" w:cs="Times New Roman" w:eastAsia="Times New Roman" w:hAnsi="Times New Roman"/>
+                <w:b w:val="false"/>
+                <w:bCs w:val="false"/>
+                <w:noProof/>
+                <w:sz w:val="18"/>
+                <w:szCs w:val="18"/>
+                <w:lang w:val="vi-VN"/>
+              </w:rPr>
+              <w:t xml:space="preserve">0,53</w:t>
             </w:r>
           </w:p>
         </w:tc>
@@ -10885,26 +10885,26 @@
                 <w:szCs w:val="18"/>
                 <w:lang w:val="vi-VN"/>
               </w:rPr>
-              <w:t xml:space="preserve">B5-D17 + B6-D06</w:t>
-            </w:r>
-          </w:p>
-        </w:tc>
-        <w:tc>
-          <w:p>
-            <w:pPr>
-              <w:jc w:val="center"/>
-            </w:pPr>
-            <w:r>
-              <w:rPr>
-                <w:rFonts w:ascii="Times New Roman" w:cs="Times New Roman" w:eastAsia="Times New Roman" w:hAnsi="Times New Roman"/>
-                <w:b w:val="false"/>
-                <w:bCs w:val="false"/>
-                <w:noProof/>
-                <w:sz w:val="18"/>
-                <w:szCs w:val="18"/>
-                <w:lang w:val="vi-VN"/>
-              </w:rPr>
-              <w:t xml:space="preserve">5,75</w:t>
+              <w:t xml:space="preserve">B6-D25</w:t>
+            </w:r>
+          </w:p>
+        </w:tc>
+        <w:tc>
+          <w:p>
+            <w:pPr>
+              <w:jc w:val="center"/>
+            </w:pPr>
+            <w:r>
+              <w:rPr>
+                <w:rFonts w:ascii="Times New Roman" w:cs="Times New Roman" w:eastAsia="Times New Roman" w:hAnsi="Times New Roman"/>
+                <w:b w:val="false"/>
+                <w:bCs w:val="false"/>
+                <w:noProof/>
+                <w:sz w:val="18"/>
+                <w:szCs w:val="18"/>
+                <w:lang w:val="vi-VN"/>
+              </w:rPr>
+              <w:t xml:space="preserve">4,00</w:t>
             </w:r>
           </w:p>
         </w:tc>
@@ -10942,121 +10942,121 @@
                 <w:szCs w:val="18"/>
                 <w:lang w:val="vi-VN"/>
               </w:rPr>
-              <w:t xml:space="preserve">13,21</w:t>
-            </w:r>
-          </w:p>
-        </w:tc>
-        <w:tc>
-          <w:p>
-            <w:pPr>
-              <w:jc w:val="center"/>
-            </w:pPr>
-            <w:r>
-              <w:rPr>
-                <w:rFonts w:ascii="Times New Roman" w:cs="Times New Roman" w:eastAsia="Times New Roman" w:hAnsi="Times New Roman"/>
-                <w:b w:val="false"/>
-                <w:bCs w:val="false"/>
-                <w:noProof/>
-                <w:sz w:val="18"/>
-                <w:szCs w:val="18"/>
-                <w:lang w:val="vi-VN"/>
-              </w:rPr>
-              <w:t xml:space="preserve">33,7</w:t>
-            </w:r>
-          </w:p>
-        </w:tc>
-        <w:tc>
-          <w:p>
-            <w:pPr>
-              <w:jc w:val="center"/>
-            </w:pPr>
-            <w:r>
-              <w:rPr>
-                <w:rFonts w:ascii="Times New Roman" w:cs="Times New Roman" w:eastAsia="Times New Roman" w:hAnsi="Times New Roman"/>
-                <w:b w:val="false"/>
-                <w:bCs w:val="false"/>
-                <w:noProof/>
-                <w:sz w:val="18"/>
-                <w:szCs w:val="18"/>
-                <w:lang w:val="vi-VN"/>
-              </w:rPr>
-              <w:t xml:space="preserve">156,6</w:t>
-            </w:r>
-          </w:p>
-        </w:tc>
-        <w:tc>
-          <w:p>
-            <w:pPr>
-              <w:jc w:val="center"/>
-            </w:pPr>
-            <w:r>
-              <w:rPr>
-                <w:rFonts w:ascii="Times New Roman" w:cs="Times New Roman" w:eastAsia="Times New Roman" w:hAnsi="Times New Roman"/>
-                <w:b w:val="false"/>
-                <w:bCs w:val="false"/>
-                <w:noProof/>
-                <w:sz w:val="18"/>
-                <w:szCs w:val="18"/>
-                <w:lang w:val="vi-VN"/>
-              </w:rPr>
-              <w:t xml:space="preserve">0,74</w:t>
-            </w:r>
-          </w:p>
-        </w:tc>
-        <w:tc>
-          <w:p>
-            <w:pPr>
-              <w:jc w:val="center"/>
-            </w:pPr>
-            <w:r>
-              <w:rPr>
-                <w:rFonts w:ascii="Times New Roman" w:cs="Times New Roman" w:eastAsia="Times New Roman" w:hAnsi="Times New Roman"/>
-                <w:b w:val="false"/>
-                <w:bCs w:val="false"/>
-                <w:noProof/>
-                <w:sz w:val="18"/>
-                <w:szCs w:val="18"/>
-                <w:lang w:val="vi-VN"/>
-              </w:rPr>
-              <w:t xml:space="preserve">0,52</w:t>
-            </w:r>
-          </w:p>
-        </w:tc>
-        <w:tc>
-          <w:p>
-            <w:pPr>
-              <w:jc w:val="center"/>
-            </w:pPr>
-            <w:r>
-              <w:rPr>
-                <w:rFonts w:ascii="Times New Roman" w:cs="Times New Roman" w:eastAsia="Times New Roman" w:hAnsi="Times New Roman"/>
-                <w:b w:val="false"/>
-                <w:bCs w:val="false"/>
-                <w:noProof/>
-                <w:sz w:val="18"/>
-                <w:szCs w:val="18"/>
-                <w:lang w:val="vi-VN"/>
-              </w:rPr>
-              <w:t xml:space="preserve">0,95</w:t>
-            </w:r>
-          </w:p>
-        </w:tc>
-        <w:tc>
-          <w:p>
-            <w:pPr>
-              <w:jc w:val="center"/>
-            </w:pPr>
-            <w:r>
-              <w:rPr>
-                <w:rFonts w:ascii="Times New Roman" w:cs="Times New Roman" w:eastAsia="Times New Roman" w:hAnsi="Times New Roman"/>
-                <w:b w:val="false"/>
-                <w:bCs w:val="false"/>
-                <w:noProof/>
-                <w:sz w:val="18"/>
-                <w:szCs w:val="18"/>
-                <w:lang w:val="vi-VN"/>
-              </w:rPr>
-              <w:t xml:space="preserve">0,00</w:t>
+              <w:t xml:space="preserve">6,38</w:t>
+            </w:r>
+          </w:p>
+        </w:tc>
+        <w:tc>
+          <w:p>
+            <w:pPr>
+              <w:jc w:val="center"/>
+            </w:pPr>
+            <w:r>
+              <w:rPr>
+                <w:rFonts w:ascii="Times New Roman" w:cs="Times New Roman" w:eastAsia="Times New Roman" w:hAnsi="Times New Roman"/>
+                <w:b w:val="false"/>
+                <w:bCs w:val="false"/>
+                <w:noProof/>
+                <w:sz w:val="18"/>
+                <w:szCs w:val="18"/>
+                <w:lang w:val="vi-VN"/>
+              </w:rPr>
+              <w:t xml:space="preserve">16,3</w:t>
+            </w:r>
+          </w:p>
+        </w:tc>
+        <w:tc>
+          <w:p>
+            <w:pPr>
+              <w:jc w:val="center"/>
+            </w:pPr>
+            <w:r>
+              <w:rPr>
+                <w:rFonts w:ascii="Times New Roman" w:cs="Times New Roman" w:eastAsia="Times New Roman" w:hAnsi="Times New Roman"/>
+                <w:b w:val="false"/>
+                <w:bCs w:val="false"/>
+                <w:noProof/>
+                <w:sz w:val="18"/>
+                <w:szCs w:val="18"/>
+                <w:lang w:val="vi-VN"/>
+              </w:rPr>
+              <w:t xml:space="preserve">85,0</w:t>
+            </w:r>
+          </w:p>
+        </w:tc>
+        <w:tc>
+          <w:p>
+            <w:pPr>
+              <w:jc w:val="center"/>
+            </w:pPr>
+            <w:r>
+              <w:rPr>
+                <w:rFonts w:ascii="Times New Roman" w:cs="Times New Roman" w:eastAsia="Times New Roman" w:hAnsi="Times New Roman"/>
+                <w:b w:val="false"/>
+                <w:bCs w:val="false"/>
+                <w:noProof/>
+                <w:sz w:val="18"/>
+                <w:szCs w:val="18"/>
+                <w:lang w:val="vi-VN"/>
+              </w:rPr>
+              <w:t xml:space="preserve">0,72</w:t>
+            </w:r>
+          </w:p>
+        </w:tc>
+        <w:tc>
+          <w:p>
+            <w:pPr>
+              <w:jc w:val="center"/>
+            </w:pPr>
+            <w:r>
+              <w:rPr>
+                <w:rFonts w:ascii="Times New Roman" w:cs="Times New Roman" w:eastAsia="Times New Roman" w:hAnsi="Times New Roman"/>
+                <w:b w:val="false"/>
+                <w:bCs w:val="false"/>
+                <w:noProof/>
+                <w:sz w:val="18"/>
+                <w:szCs w:val="18"/>
+                <w:lang w:val="vi-VN"/>
+              </w:rPr>
+              <w:t xml:space="preserve">0,69</w:t>
+            </w:r>
+          </w:p>
+        </w:tc>
+        <w:tc>
+          <w:p>
+            <w:pPr>
+              <w:jc w:val="center"/>
+            </w:pPr>
+            <w:r>
+              <w:rPr>
+                <w:rFonts w:ascii="Times New Roman" w:cs="Times New Roman" w:eastAsia="Times New Roman" w:hAnsi="Times New Roman"/>
+                <w:b w:val="false"/>
+                <w:bCs w:val="false"/>
+                <w:noProof/>
+                <w:sz w:val="18"/>
+                <w:szCs w:val="18"/>
+                <w:lang w:val="vi-VN"/>
+              </w:rPr>
+              <w:t xml:space="preserve">0,99</w:t>
+            </w:r>
+          </w:p>
+        </w:tc>
+        <w:tc>
+          <w:p>
+            <w:pPr>
+              <w:jc w:val="center"/>
+            </w:pPr>
+            <w:r>
+              <w:rPr>
+                <w:rFonts w:ascii="Times New Roman" w:cs="Times New Roman" w:eastAsia="Times New Roman" w:hAnsi="Times New Roman"/>
+                <w:b w:val="false"/>
+                <w:bCs w:val="false"/>
+                <w:noProof/>
+                <w:sz w:val="18"/>
+                <w:szCs w:val="18"/>
+                <w:lang w:val="vi-VN"/>
+              </w:rPr>
+              <w:t xml:space="preserve">0,62</w:t>
             </w:r>
           </w:p>
         </w:tc>
@@ -11118,7 +11118,7 @@
                 <w:szCs w:val="18"/>
                 <w:lang w:val="vi-VN"/>
               </w:rPr>
-              <w:t xml:space="preserve">B6-D13</w:t>
+              <w:t xml:space="preserve">B6-D46</w:t>
             </w:r>
           </w:p>
         </w:tc>
@@ -11213,7 +11213,7 @@
                 <w:szCs w:val="18"/>
                 <w:lang w:val="vi-VN"/>
               </w:rPr>
-              <w:t xml:space="preserve">83,3</w:t>
+              <w:t xml:space="preserve">83,4</w:t>
             </w:r>
           </w:p>
         </w:tc>
@@ -11251,26 +11251,26 @@
                 <w:szCs w:val="18"/>
                 <w:lang w:val="vi-VN"/>
               </w:rPr>
-              <w:t xml:space="preserve">0,67</w:t>
-            </w:r>
-          </w:p>
-        </w:tc>
-        <w:tc>
-          <w:p>
-            <w:pPr>
-              <w:jc w:val="center"/>
-            </w:pPr>
-            <w:r>
-              <w:rPr>
-                <w:rFonts w:ascii="Times New Roman" w:cs="Times New Roman" w:eastAsia="Times New Roman" w:hAnsi="Times New Roman"/>
-                <w:b w:val="false"/>
-                <w:bCs w:val="false"/>
-                <w:noProof/>
-                <w:sz w:val="18"/>
-                <w:szCs w:val="18"/>
-                <w:lang w:val="vi-VN"/>
-              </w:rPr>
-              <w:t xml:space="preserve">0,97</w:t>
+              <w:t xml:space="preserve">0,66</w:t>
+            </w:r>
+          </w:p>
+        </w:tc>
+        <w:tc>
+          <w:p>
+            <w:pPr>
+              <w:jc w:val="center"/>
+            </w:pPr>
+            <w:r>
+              <w:rPr>
+                <w:rFonts w:ascii="Times New Roman" w:cs="Times New Roman" w:eastAsia="Times New Roman" w:hAnsi="Times New Roman"/>
+                <w:b w:val="false"/>
+                <w:bCs w:val="false"/>
+                <w:noProof/>
+                <w:sz w:val="18"/>
+                <w:szCs w:val="18"/>
+                <w:lang w:val="vi-VN"/>
+              </w:rPr>
+              <w:t xml:space="preserve">0,96</w:t>
             </w:r>
           </w:p>
         </w:tc>
@@ -11332,472 +11332,6 @@
                 <w:szCs w:val="18"/>
                 <w:lang w:val="vi-VN"/>
               </w:rPr>
-              <w:t xml:space="preserve">BM-DV018</w:t>
-            </w:r>
-          </w:p>
-        </w:tc>
-        <w:tc>
-          <w:p>
-            <w:pPr>
-              <w:jc w:val="center"/>
-            </w:pPr>
-            <w:r>
-              <w:rPr>
-                <w:rFonts w:ascii="Times New Roman" w:cs="Times New Roman" w:eastAsia="Times New Roman" w:hAnsi="Times New Roman"/>
-                <w:b w:val="false"/>
-                <w:bCs w:val="false"/>
-                <w:noProof/>
-                <w:sz w:val="18"/>
-                <w:szCs w:val="18"/>
-                <w:lang w:val="vi-VN"/>
-              </w:rPr>
-              <w:t xml:space="preserve">B6-D25</w:t>
-            </w:r>
-          </w:p>
-        </w:tc>
-        <w:tc>
-          <w:p>
-            <w:pPr>
-              <w:jc w:val="center"/>
-            </w:pPr>
-            <w:r>
-              <w:rPr>
-                <w:rFonts w:ascii="Times New Roman" w:cs="Times New Roman" w:eastAsia="Times New Roman" w:hAnsi="Times New Roman"/>
-                <w:b w:val="false"/>
-                <w:bCs w:val="false"/>
-                <w:noProof/>
-                <w:sz w:val="18"/>
-                <w:szCs w:val="18"/>
-                <w:lang w:val="vi-VN"/>
-              </w:rPr>
-              <w:t xml:space="preserve">4,00</w:t>
-            </w:r>
-          </w:p>
-        </w:tc>
-        <w:tc>
-          <w:p>
-            <w:pPr>
-              <w:jc w:val="center"/>
-            </w:pPr>
-            <w:r>
-              <w:rPr>
-                <w:rFonts w:ascii="Times New Roman" w:cs="Times New Roman" w:eastAsia="Times New Roman" w:hAnsi="Times New Roman"/>
-                <w:b w:val="false"/>
-                <w:bCs w:val="false"/>
-                <w:noProof/>
-                <w:sz w:val="18"/>
-                <w:szCs w:val="18"/>
-                <w:lang w:val="vi-VN"/>
-              </w:rPr>
-              <w:t xml:space="preserve">0,4</w:t>
-            </w:r>
-          </w:p>
-        </w:tc>
-        <w:tc>
-          <w:p>
-            <w:pPr>
-              <w:jc w:val="center"/>
-            </w:pPr>
-            <w:r>
-              <w:rPr>
-                <w:rFonts w:ascii="Times New Roman" w:cs="Times New Roman" w:eastAsia="Times New Roman" w:hAnsi="Times New Roman"/>
-                <w:b w:val="false"/>
-                <w:bCs w:val="false"/>
-                <w:noProof/>
-                <w:sz w:val="18"/>
-                <w:szCs w:val="18"/>
-                <w:lang w:val="vi-VN"/>
-              </w:rPr>
-              <w:t xml:space="preserve">6,38</w:t>
-            </w:r>
-          </w:p>
-        </w:tc>
-        <w:tc>
-          <w:p>
-            <w:pPr>
-              <w:jc w:val="center"/>
-            </w:pPr>
-            <w:r>
-              <w:rPr>
-                <w:rFonts w:ascii="Times New Roman" w:cs="Times New Roman" w:eastAsia="Times New Roman" w:hAnsi="Times New Roman"/>
-                <w:b w:val="false"/>
-                <w:bCs w:val="false"/>
-                <w:noProof/>
-                <w:sz w:val="18"/>
-                <w:szCs w:val="18"/>
-                <w:lang w:val="vi-VN"/>
-              </w:rPr>
-              <w:t xml:space="preserve">16,3</w:t>
-            </w:r>
-          </w:p>
-        </w:tc>
-        <w:tc>
-          <w:p>
-            <w:pPr>
-              <w:jc w:val="center"/>
-            </w:pPr>
-            <w:r>
-              <w:rPr>
-                <w:rFonts w:ascii="Times New Roman" w:cs="Times New Roman" w:eastAsia="Times New Roman" w:hAnsi="Times New Roman"/>
-                <w:b w:val="false"/>
-                <w:bCs w:val="false"/>
-                <w:noProof/>
-                <w:sz w:val="18"/>
-                <w:szCs w:val="18"/>
-                <w:lang w:val="vi-VN"/>
-              </w:rPr>
-              <w:t xml:space="preserve">85,0</w:t>
-            </w:r>
-          </w:p>
-        </w:tc>
-        <w:tc>
-          <w:p>
-            <w:pPr>
-              <w:jc w:val="center"/>
-            </w:pPr>
-            <w:r>
-              <w:rPr>
-                <w:rFonts w:ascii="Times New Roman" w:cs="Times New Roman" w:eastAsia="Times New Roman" w:hAnsi="Times New Roman"/>
-                <w:b w:val="false"/>
-                <w:bCs w:val="false"/>
-                <w:noProof/>
-                <w:sz w:val="18"/>
-                <w:szCs w:val="18"/>
-                <w:lang w:val="vi-VN"/>
-              </w:rPr>
-              <w:t xml:space="preserve">0,72</w:t>
-            </w:r>
-          </w:p>
-        </w:tc>
-        <w:tc>
-          <w:p>
-            <w:pPr>
-              <w:jc w:val="center"/>
-            </w:pPr>
-            <w:r>
-              <w:rPr>
-                <w:rFonts w:ascii="Times New Roman" w:cs="Times New Roman" w:eastAsia="Times New Roman" w:hAnsi="Times New Roman"/>
-                <w:b w:val="false"/>
-                <w:bCs w:val="false"/>
-                <w:noProof/>
-                <w:sz w:val="18"/>
-                <w:szCs w:val="18"/>
-                <w:lang w:val="vi-VN"/>
-              </w:rPr>
-              <w:t xml:space="preserve">0,69</w:t>
-            </w:r>
-          </w:p>
-        </w:tc>
-        <w:tc>
-          <w:p>
-            <w:pPr>
-              <w:jc w:val="center"/>
-            </w:pPr>
-            <w:r>
-              <w:rPr>
-                <w:rFonts w:ascii="Times New Roman" w:cs="Times New Roman" w:eastAsia="Times New Roman" w:hAnsi="Times New Roman"/>
-                <w:b w:val="false"/>
-                <w:bCs w:val="false"/>
-                <w:noProof/>
-                <w:sz w:val="18"/>
-                <w:szCs w:val="18"/>
-                <w:lang w:val="vi-VN"/>
-              </w:rPr>
-              <w:t xml:space="preserve">0,99</w:t>
-            </w:r>
-          </w:p>
-        </w:tc>
-        <w:tc>
-          <w:p>
-            <w:pPr>
-              <w:jc w:val="center"/>
-            </w:pPr>
-            <w:r>
-              <w:rPr>
-                <w:rFonts w:ascii="Times New Roman" w:cs="Times New Roman" w:eastAsia="Times New Roman" w:hAnsi="Times New Roman"/>
-                <w:b w:val="false"/>
-                <w:bCs w:val="false"/>
-                <w:noProof/>
-                <w:sz w:val="18"/>
-                <w:szCs w:val="18"/>
-                <w:lang w:val="vi-VN"/>
-              </w:rPr>
-              <w:t xml:space="preserve">0,62</w:t>
-            </w:r>
-          </w:p>
-        </w:tc>
-        <w:tc>
-          <w:p>
-            <w:pPr>
-              <w:jc w:val="center"/>
-            </w:pPr>
-            <w:r>
-              <w:rPr>
-                <w:rFonts w:ascii="Times New Roman" w:cs="Times New Roman" w:eastAsia="Times New Roman" w:hAnsi="Times New Roman"/>
-                <w:b w:val="false"/>
-                <w:bCs w:val="false"/>
-                <w:noProof/>
-                <w:sz w:val="18"/>
-                <w:szCs w:val="18"/>
-                <w:lang w:val="vi-VN"/>
-              </w:rPr>
-              <w:t xml:space="preserve">ĐẠT</w:t>
-            </w:r>
-          </w:p>
-        </w:tc>
-      </w:tr>
-      <w:tr>
-        <w:trPr>
-          <w:tblHeader w:val="false"/>
-        </w:trPr>
-        <w:tc>
-          <w:p>
-            <w:pPr>
-              <w:jc w:val="center"/>
-            </w:pPr>
-            <w:r>
-              <w:rPr>
-                <w:rFonts w:ascii="Times New Roman" w:cs="Times New Roman" w:eastAsia="Times New Roman" w:hAnsi="Times New Roman"/>
-                <w:b w:val="false"/>
-                <w:bCs w:val="false"/>
-                <w:noProof/>
-                <w:sz w:val="18"/>
-                <w:szCs w:val="18"/>
-                <w:lang w:val="vi-VN"/>
-              </w:rPr>
-              <w:t xml:space="preserve">BM-DV019</w:t>
-            </w:r>
-          </w:p>
-        </w:tc>
-        <w:tc>
-          <w:p>
-            <w:pPr>
-              <w:jc w:val="center"/>
-            </w:pPr>
-            <w:r>
-              <w:rPr>
-                <w:rFonts w:ascii="Times New Roman" w:cs="Times New Roman" w:eastAsia="Times New Roman" w:hAnsi="Times New Roman"/>
-                <w:b w:val="false"/>
-                <w:bCs w:val="false"/>
-                <w:noProof/>
-                <w:sz w:val="18"/>
-                <w:szCs w:val="18"/>
-                <w:lang w:val="vi-VN"/>
-              </w:rPr>
-              <w:t xml:space="preserve">B6-D46</w:t>
-            </w:r>
-          </w:p>
-        </w:tc>
-        <w:tc>
-          <w:p>
-            <w:pPr>
-              <w:jc w:val="center"/>
-            </w:pPr>
-            <w:r>
-              <w:rPr>
-                <w:rFonts w:ascii="Times New Roman" w:cs="Times New Roman" w:eastAsia="Times New Roman" w:hAnsi="Times New Roman"/>
-                <w:b w:val="false"/>
-                <w:bCs w:val="false"/>
-                <w:noProof/>
-                <w:sz w:val="18"/>
-                <w:szCs w:val="18"/>
-                <w:lang w:val="vi-VN"/>
-              </w:rPr>
-              <w:t xml:space="preserve">4,00</w:t>
-            </w:r>
-          </w:p>
-        </w:tc>
-        <w:tc>
-          <w:p>
-            <w:pPr>
-              <w:jc w:val="center"/>
-            </w:pPr>
-            <w:r>
-              <w:rPr>
-                <w:rFonts w:ascii="Times New Roman" w:cs="Times New Roman" w:eastAsia="Times New Roman" w:hAnsi="Times New Roman"/>
-                <w:b w:val="false"/>
-                <w:bCs w:val="false"/>
-                <w:noProof/>
-                <w:sz w:val="18"/>
-                <w:szCs w:val="18"/>
-                <w:lang w:val="vi-VN"/>
-              </w:rPr>
-              <w:t xml:space="preserve">0,4</w:t>
-            </w:r>
-          </w:p>
-        </w:tc>
-        <w:tc>
-          <w:p>
-            <w:pPr>
-              <w:jc w:val="center"/>
-            </w:pPr>
-            <w:r>
-              <w:rPr>
-                <w:rFonts w:ascii="Times New Roman" w:cs="Times New Roman" w:eastAsia="Times New Roman" w:hAnsi="Times New Roman"/>
-                <w:b w:val="false"/>
-                <w:bCs w:val="false"/>
-                <w:noProof/>
-                <w:sz w:val="18"/>
-                <w:szCs w:val="18"/>
-                <w:lang w:val="vi-VN"/>
-              </w:rPr>
-              <w:t xml:space="preserve">6,38</w:t>
-            </w:r>
-          </w:p>
-        </w:tc>
-        <w:tc>
-          <w:p>
-            <w:pPr>
-              <w:jc w:val="center"/>
-            </w:pPr>
-            <w:r>
-              <w:rPr>
-                <w:rFonts w:ascii="Times New Roman" w:cs="Times New Roman" w:eastAsia="Times New Roman" w:hAnsi="Times New Roman"/>
-                <w:b w:val="false"/>
-                <w:bCs w:val="false"/>
-                <w:noProof/>
-                <w:sz w:val="18"/>
-                <w:szCs w:val="18"/>
-                <w:lang w:val="vi-VN"/>
-              </w:rPr>
-              <w:t xml:space="preserve">16,3</w:t>
-            </w:r>
-          </w:p>
-        </w:tc>
-        <w:tc>
-          <w:p>
-            <w:pPr>
-              <w:jc w:val="center"/>
-            </w:pPr>
-            <w:r>
-              <w:rPr>
-                <w:rFonts w:ascii="Times New Roman" w:cs="Times New Roman" w:eastAsia="Times New Roman" w:hAnsi="Times New Roman"/>
-                <w:b w:val="false"/>
-                <w:bCs w:val="false"/>
-                <w:noProof/>
-                <w:sz w:val="18"/>
-                <w:szCs w:val="18"/>
-                <w:lang w:val="vi-VN"/>
-              </w:rPr>
-              <w:t xml:space="preserve">83,4</w:t>
-            </w:r>
-          </w:p>
-        </w:tc>
-        <w:tc>
-          <w:p>
-            <w:pPr>
-              <w:jc w:val="center"/>
-            </w:pPr>
-            <w:r>
-              <w:rPr>
-                <w:rFonts w:ascii="Times New Roman" w:cs="Times New Roman" w:eastAsia="Times New Roman" w:hAnsi="Times New Roman"/>
-                <w:b w:val="false"/>
-                <w:bCs w:val="false"/>
-                <w:noProof/>
-                <w:sz w:val="18"/>
-                <w:szCs w:val="18"/>
-                <w:lang w:val="vi-VN"/>
-              </w:rPr>
-              <w:t xml:space="preserve">0,71</w:t>
-            </w:r>
-          </w:p>
-        </w:tc>
-        <w:tc>
-          <w:p>
-            <w:pPr>
-              <w:jc w:val="center"/>
-            </w:pPr>
-            <w:r>
-              <w:rPr>
-                <w:rFonts w:ascii="Times New Roman" w:cs="Times New Roman" w:eastAsia="Times New Roman" w:hAnsi="Times New Roman"/>
-                <w:b w:val="false"/>
-                <w:bCs w:val="false"/>
-                <w:noProof/>
-                <w:sz w:val="18"/>
-                <w:szCs w:val="18"/>
-                <w:lang w:val="vi-VN"/>
-              </w:rPr>
-              <w:t xml:space="preserve">0,66</w:t>
-            </w:r>
-          </w:p>
-        </w:tc>
-        <w:tc>
-          <w:p>
-            <w:pPr>
-              <w:jc w:val="center"/>
-            </w:pPr>
-            <w:r>
-              <w:rPr>
-                <w:rFonts w:ascii="Times New Roman" w:cs="Times New Roman" w:eastAsia="Times New Roman" w:hAnsi="Times New Roman"/>
-                <w:b w:val="false"/>
-                <w:bCs w:val="false"/>
-                <w:noProof/>
-                <w:sz w:val="18"/>
-                <w:szCs w:val="18"/>
-                <w:lang w:val="vi-VN"/>
-              </w:rPr>
-              <w:t xml:space="preserve">0,96</w:t>
-            </w:r>
-          </w:p>
-        </w:tc>
-        <w:tc>
-          <w:p>
-            <w:pPr>
-              <w:jc w:val="center"/>
-            </w:pPr>
-            <w:r>
-              <w:rPr>
-                <w:rFonts w:ascii="Times New Roman" w:cs="Times New Roman" w:eastAsia="Times New Roman" w:hAnsi="Times New Roman"/>
-                <w:b w:val="false"/>
-                <w:bCs w:val="false"/>
-                <w:noProof/>
-                <w:sz w:val="18"/>
-                <w:szCs w:val="18"/>
-                <w:lang w:val="vi-VN"/>
-              </w:rPr>
-              <w:t xml:space="preserve">0,53</w:t>
-            </w:r>
-          </w:p>
-        </w:tc>
-        <w:tc>
-          <w:p>
-            <w:pPr>
-              <w:jc w:val="center"/>
-            </w:pPr>
-            <w:r>
-              <w:rPr>
-                <w:rFonts w:ascii="Times New Roman" w:cs="Times New Roman" w:eastAsia="Times New Roman" w:hAnsi="Times New Roman"/>
-                <w:b w:val="false"/>
-                <w:bCs w:val="false"/>
-                <w:noProof/>
-                <w:sz w:val="18"/>
-                <w:szCs w:val="18"/>
-                <w:lang w:val="vi-VN"/>
-              </w:rPr>
-              <w:t xml:space="preserve">ĐẠT</w:t>
-            </w:r>
-          </w:p>
-        </w:tc>
-      </w:tr>
-      <w:tr>
-        <w:trPr>
-          <w:tblHeader w:val="false"/>
-        </w:trPr>
-        <w:tc>
-          <w:p>
-            <w:pPr>
-              <w:jc w:val="center"/>
-            </w:pPr>
-            <w:r>
-              <w:rPr>
-                <w:rFonts w:ascii="Times New Roman" w:cs="Times New Roman" w:eastAsia="Times New Roman" w:hAnsi="Times New Roman"/>
-                <w:b w:val="false"/>
-                <w:bCs w:val="false"/>
-                <w:noProof/>
-                <w:sz w:val="18"/>
-                <w:szCs w:val="18"/>
-                <w:lang w:val="vi-VN"/>
-              </w:rPr>
               <w:t xml:space="preserve">TỔNG</w:t>
             </w:r>
           </w:p>
@@ -11817,7 +11351,7 @@
                 <w:szCs w:val="18"/>
                 <w:lang w:val="vi-VN"/>
               </w:rPr>
-              <w:t xml:space="preserve">19 đế, 76 vít</w:t>
+              <w:t xml:space="preserve">17 đế, 68 vít</w:t>
             </w:r>
           </w:p>
         </w:tc>
@@ -11874,7 +11408,7 @@
                 <w:szCs w:val="18"/>
                 <w:lang w:val="vi-VN"/>
               </w:rPr>
-              <w:t xml:space="preserve">133,2</w:t>
+              <w:t xml:space="preserve">128,3</w:t>
             </w:r>
           </w:p>
         </w:tc>
@@ -11912,7 +11446,7 @@
                 <w:szCs w:val="18"/>
                 <w:lang w:val="vi-VN"/>
               </w:rPr>
-              <w:t xml:space="preserve">1.798</w:t>
+              <w:t xml:space="preserve">1.746</w:t>
             </w:r>
           </w:p>
         </w:tc>
@@ -12025,7 +11559,7 @@
           <w:szCs w:val="20"/>
           <w:lang w:val="vi-VN"/>
         </w:rPr>
-        <w:t xml:space="preserve">Mỗi đế có 4 vít ống Ø89×5 ren Ø105, ngàm 3 m; tổng 76 vít, 283 m. Tổng sức chống nhổ 2.405 kN. Các cột Nhổ, Trượt, Lật, 1 vít là mức sử dụng lớn nhất trên mọi tổ hợp.</w:t>
+        <w:t xml:space="preserve">Mỗi đế có 4 vít ống Ø89×5 ren Ø105, ngàm 3 m; tổng 68 vít, 253 m. Tổng sức chống nhổ 2.275 kN. Các cột Nhổ, Trượt, Lật, 1 vít là mức sử dụng lớn nhất trên mọi tổ hợp.</w:t>
       </w:r>
     </w:p>
     <w:p>
@@ -12282,7 +11816,7 @@
                 <w:szCs w:val="18"/>
                 <w:lang w:val="vi-VN"/>
               </w:rPr>
-              <w:t xml:space="preserve">1.227,6</w:t>
+              <w:t xml:space="preserve">1.240,8</w:t>
             </w:r>
           </w:p>
         </w:tc>
@@ -12320,26 +11854,26 @@
                 <w:szCs w:val="18"/>
                 <w:lang w:val="vi-VN"/>
               </w:rPr>
-              <w:t xml:space="preserve">589.248.000</w:t>
-            </w:r>
-          </w:p>
-        </w:tc>
-        <w:tc>
-          <w:p>
-            <w:pPr>
-              <w:jc w:val="center"/>
-            </w:pPr>
-            <w:r>
-              <w:rPr>
-                <w:rFonts w:ascii="Times New Roman" w:cs="Times New Roman" w:eastAsia="Times New Roman" w:hAnsi="Times New Roman"/>
-                <w:b w:val="false"/>
-                <w:bCs w:val="false"/>
-                <w:noProof/>
-                <w:sz w:val="18"/>
-                <w:szCs w:val="18"/>
-                <w:lang w:val="vi-VN"/>
-              </w:rPr>
-              <w:t xml:space="preserve">Đơn giá trọn gói vật tư + nhân công; 186 cọc</w:t>
+              <w:t xml:space="preserve">595.584.000</w:t>
+            </w:r>
+          </w:p>
+        </w:tc>
+        <w:tc>
+          <w:p>
+            <w:pPr>
+              <w:jc w:val="center"/>
+            </w:pPr>
+            <w:r>
+              <w:rPr>
+                <w:rFonts w:ascii="Times New Roman" w:cs="Times New Roman" w:eastAsia="Times New Roman" w:hAnsi="Times New Roman"/>
+                <w:b w:val="false"/>
+                <w:bCs w:val="false"/>
+                <w:noProof/>
+                <w:sz w:val="18"/>
+                <w:szCs w:val="18"/>
+                <w:lang w:val="vi-VN"/>
+              </w:rPr>
+              <w:t xml:space="preserve">Đơn giá trọn gói vật tư + nhân công; 188 cọc</w:t>
             </w:r>
           </w:p>
         </w:tc>
@@ -12420,7 +11954,7 @@
                 <w:szCs w:val="18"/>
                 <w:lang w:val="vi-VN"/>
               </w:rPr>
-              <w:t xml:space="preserve">133,2</w:t>
+              <w:t xml:space="preserve">128,3</w:t>
             </w:r>
           </w:p>
         </w:tc>
@@ -12558,7 +12092,7 @@
                 <w:szCs w:val="18"/>
                 <w:lang w:val="vi-VN"/>
               </w:rPr>
-              <w:t xml:space="preserve">5.858,8</w:t>
+              <w:t xml:space="preserve">5.620,0</w:t>
             </w:r>
           </w:p>
         </w:tc>
@@ -12696,7 +12230,7 @@
                 <w:szCs w:val="18"/>
                 <w:lang w:val="vi-VN"/>
               </w:rPr>
-              <w:t xml:space="preserve">282,8</w:t>
+              <w:t xml:space="preserve">253,2</w:t>
             </w:r>
           </w:p>
         </w:tc>
@@ -12834,7 +12368,7 @@
                 <w:szCs w:val="18"/>
                 <w:lang w:val="vi-VN"/>
               </w:rPr>
-              <w:t xml:space="preserve">19,0</w:t>
+              <w:t xml:space="preserve">17,0</w:t>
             </w:r>
           </w:p>
         </w:tc>
@@ -13148,7 +12682,7 @@
                 <w:szCs w:val="18"/>
                 <w:lang w:val="vi-VN"/>
               </w:rPr>
-              <w:t xml:space="preserve">639.248.000</w:t>
+              <w:t xml:space="preserve">645.584.000</w:t>
             </w:r>
           </w:p>
         </w:tc>
@@ -13286,7 +12820,7 @@
                 <w:szCs w:val="18"/>
                 <w:lang w:val="vi-VN"/>
               </w:rPr>
-              <w:t xml:space="preserve">31.962.400</w:t>
+              <w:t xml:space="preserve">32.279.200</w:t>
             </w:r>
           </w:p>
         </w:tc>
@@ -13424,7 +12958,7 @@
                 <w:szCs w:val="18"/>
                 <w:lang w:val="vi-VN"/>
               </w:rPr>
-              <w:t xml:space="preserve">53.696.832</w:t>
+              <w:t xml:space="preserve">54.229.056</w:t>
             </w:r>
           </w:p>
         </w:tc>
@@ -13562,7 +13096,7 @@
                 <w:szCs w:val="18"/>
                 <w:lang w:val="vi-VN"/>
               </w:rPr>
-              <w:t xml:space="preserve">724.907.232</w:t>
+              <w:t xml:space="preserve">732.092.256</w:t>
             </w:r>
           </w:p>
         </w:tc>
@@ -13614,7 +13148,7 @@
           <w:szCs w:val="20"/>
           <w:lang w:val="vi-VN"/>
         </w:rPr>
-        <w:t xml:space="preserve">Bảng từng cọc khoan nhồi (186 cọc), từng bước tính của mỗi đế và chiều dài cắt 215 dây: xem file HOBANMONG_BANG_TINH_NEO.xlsx.</w:t>
+        <w:t xml:space="preserve">Bảng từng cọc khoan nhồi (188 cọc), từng bước tính của mỗi đế và chiều dài cắt 215 dây: xem file HOBANMONG_BANG_TINH_NEO.xlsx.</w:t>
       </w:r>
     </w:p>
     <w:sectPr>

</xml_diff>

<commit_message>
feat: Ban Mong - noi ca BE 2 - BE 3 (bo D11, D13); luc day noi theo can bang cua ca cum
- Khe BE 2 - BE 3: 4 day noi T23-01..04 (2 tu de chung cu + 2 dat them trong ties.json).
- Luc kiem day noi: groupSideForce (mooringEquilibrium) - luc qua tung khe tu can bang cua ca cum, moi muc nuoc / huong,
  ke ca dut 1 day; khong nho hon gio phia nhe hon; nua so day noi cua khe lam viec. Khe 2-4 154,8 kN, 2-3 130,3, 4-5 65,9.
- Planner: day noi khong chuyen ra bo, G4 bo qua de ao cua day noi, ma day noi theo tung cap.
- Catalogue: kiem hong khoa bao cua be trong cum dung gio ca cum.
- Cum BE 2+3+4+5 T 95,2 kN PES-32; 211 day + 18 day noi, 15 de 104 m3, 60 vit. Ho so tao lai.

Co-Authored-By: Claude Opus 5.5 <noreply@anthropic.com>
</commit_message>
<xml_diff>
--- a/docs/mat-bang-neo-ban-mong/THUYET_MINH_TINH_TOAN.docx
+++ b/docs/mat-bang-neo-ban-mong/THUYET_MINH_TINH_TOAN.docx
@@ -126,7 +126,7 @@
           <w:szCs w:val="24"/>
           <w:lang w:val="vi-VN"/>
         </w:rPr>
-        <w:t xml:space="preserve">Hệ neo: 215 tuyến cáp tại 205 điểm neo = 188 cọc khoan nhồi ven bờ + 17 đế đáy hồ (10 đế dùng chung hai bè).</w:t>
+        <w:t xml:space="preserve">Hệ neo: 211 tuyến cáp tại 203 điểm neo = 188 cọc khoan nhồi ven bờ + 15 đế đáy hồ (8 đế dùng chung hai bè).</w:t>
       </w:r>
     </w:p>
     <w:p>
@@ -186,7 +186,7 @@
           <w:szCs w:val="24"/>
           <w:lang w:val="vi-VN"/>
         </w:rPr>
-        <w:t xml:space="preserve">Kết quả: 6/6 bè đạt; 188/188 cọc bờ đạt; 17/17 đế đạt.</w:t>
+        <w:t xml:space="preserve">Kết quả: 6/6 bè đạt; 188/188 cọc bờ đạt; 15/15 đế đạt.</w:t>
       </w:r>
     </w:p>
     <w:p>
@@ -835,7 +835,7 @@
           <w:szCs w:val="24"/>
           <w:lang w:val="vi-VN"/>
         </w:rPr>
-        <w:t xml:space="preserve">C9, khoảng cách trung bình giữa các dây: chu vi / số dây = 736,4 / 50 = 14,7 m ≤ 15 m (bắt buộc; các bè: 13,7–14,9 m).</w:t>
+        <w:t xml:space="preserve">C9, khoảng cách trung bình giữa các dây: chu vi / số dây = 736,4 / 50 = 14,7 m ≤ 15 m (bắt buộc; các bè: 13,1–14,9 m).</w:t>
       </w:r>
     </w:p>
     <w:p>
@@ -875,7 +875,7 @@
           <w:szCs w:val="24"/>
           <w:lang w:val="vi-VN"/>
         </w:rPr>
-        <w:t xml:space="preserve">Độ trôi bè lớn nhất (mọi hướng, mọi mực nước): 0,4 – 0,8 m tùy bè (kiểm tra C12: ≤ nửa khoảng hở nhỏ nhất tới bè bên cạnh).</w:t>
+        <w:t xml:space="preserve">Độ trôi bè lớn nhất (mọi hướng, mọi mực nước): 0,4 – 0,6 m tùy bè (kiểm tra C12: ≤ nửa khoảng hở nhỏ nhất tới bè bên cạnh).</w:t>
       </w:r>
     </w:p>
     <w:p>
@@ -1370,7 +1370,7 @@
           <w:szCs w:val="24"/>
           <w:lang w:val="vi-VN"/>
         </w:rPr>
-        <w:t xml:space="preserve">Cọc ĐƠN theo lực của chính dây (như đế neo đáy): ở BÈ 2 41/41 điểm, BÈ 4 22/22 điểm, BÈ 5 28/28 điểm, BÈ 6 46/46 điểm, lực lớn nhất của CHÍNH dây (mọi mực nước, mọi hướng gió, cộng lực căng trước) không quá 65,5 kN (BÈ 2), 64,5 kN (BÈ 4), 69,0 kN (BÈ 5), 75,1 kN (BÈ 6) nên dùng một cọc 6Φ25 CB400-V, L</w:t>
+        <w:t xml:space="preserve">Cọc ĐƠN theo lực của chính dây (như đế neo đáy): ở BÈ 2 41/41 điểm, BÈ 3 17/17 điểm, BÈ 4 22/22 điểm, BÈ 5 28/28 điểm, BÈ 6 46/46 điểm, lực lớn nhất của CHÍNH dây (mọi mực nước, mọi hướng gió, cộng lực căng trước) không quá 62,3 kN (BÈ 2), 85,7 kN (BÈ 3), 59,4 kN (BÈ 4), 68,2 kN (BÈ 5), 75,1 kN (BÈ 6) nên dùng một cọc 6Φ25 CB400-V, L</w:t>
       </w:r>
       <w:r>
         <w:rPr>
@@ -1391,6 +1391,27 @@
           <w:szCs w:val="24"/>
           <w:lang w:val="vi-VN"/>
         </w:rPr>
+        <w:t xml:space="preserve"> 6,5 m; 6Φ28 CB500-V, L</w:t>
+      </w:r>
+      <w:r>
+        <w:rPr>
+          <w:rFonts w:ascii="Times New Roman" w:cs="Times New Roman" w:eastAsia="Times New Roman" w:hAnsi="Times New Roman"/>
+          <w:noProof/>
+          <w:sz w:val="24"/>
+          <w:szCs w:val="24"/>
+          <w:vertAlign w:val="subscript"/>
+          <w:lang w:val="vi-VN"/>
+        </w:rPr>
+        <w:t xml:space="preserve">tk</w:t>
+      </w:r>
+      <w:r>
+        <w:rPr>
+          <w:rFonts w:ascii="Times New Roman" w:cs="Times New Roman" w:eastAsia="Times New Roman" w:hAnsi="Times New Roman"/>
+          <w:noProof/>
+          <w:sz w:val="24"/>
+          <w:szCs w:val="24"/>
+          <w:lang w:val="vi-VN"/>
+        </w:rPr>
         <w:t xml:space="preserve"> 6,5 m; 6Φ28 CB400-V, L</w:t>
       </w:r>
       <w:r>
@@ -1412,7 +1433,7 @@
           <w:szCs w:val="24"/>
           <w:lang w:val="vi-VN"/>
         </w:rPr>
-        <w:t xml:space="preserve"> 6,5 m (BP-1 0,56 / 0,56 / 0,60 / 0,65, BP-2 0,94 / 0,92 / 0,80 / 0,89); chỉ các dây lực lớn hơn mới dùng cọc của bè. Lực bè T ở trên là lực bất lợi nhất của bè, có sàn F/(6 cos 30°).</w:t>
+        <w:t xml:space="preserve"> 6,5 m (BP-1 0,54 / 0,74 / 0,51 / 0,59 / 0,65, BP-2 0,88 / 0,86 / 0,83 / 0,79 / 0,89); chỉ các dây lực lớn hơn mới dùng cọc của bè. Lực bè T ở trên là lực bất lợi nhất của bè, có sàn F/(6 cos 30°).</w:t>
       </w:r>
     </w:p>
     <w:p>
@@ -1451,7 +1472,7 @@
           <w:szCs w:val="26"/>
           <w:lang w:val="vi-VN"/>
         </w:rPr>
-        <w:t xml:space="preserve">6. Đế BTCT + vít xoắn (ví dụ BM-DV013, đế làm việc nặng nhất)</w:t>
+        <w:t xml:space="preserve">6. Đế BTCT + vít xoắn (ví dụ BM-DV004, đế làm việc nặng nhất)</w:t>
       </w:r>
     </w:p>
     <w:p>
@@ -1617,7 +1638,7 @@
           <w:szCs w:val="24"/>
           <w:lang w:val="vi-VN"/>
         </w:rPr>
-        <w:t xml:space="preserve">Đế BM-DV013 giữ hai dây B2-D58 (BÈ 2, T = 114,1 kN, dài 9,52 m) và B3-D02 (BÈ 3, T = 78,7 kN, dài 9,52 m). Bích bè cao hơn mặt nước 0,35 m.</w:t>
+        <w:t xml:space="preserve">Đế BM-DV004 giữ hai dây B1-D22 (BÈ 1, T = 46,4 kN, dài 16,16 m) và B2-D52 (BÈ 2, T = 93,2 kN, dài 16,16 m). Bích bè cao hơn mặt nước 0,35 m.</w:t>
       </w:r>
     </w:p>
     <w:p>
@@ -1720,7 +1741,7 @@
           <w:szCs w:val="24"/>
           <w:lang w:val="vi-VN"/>
         </w:rPr>
-        <w:t xml:space="preserve"> = 171,2 kN (hai dây cộng lại), lực ngang T</w:t>
+        <w:t xml:space="preserve"> = 113,3 kN (hai dây cộng lại), lực ngang T</w:t>
       </w:r>
       <w:r>
         <w:rPr>
@@ -1741,7 +1762,7 @@
           <w:szCs w:val="24"/>
           <w:lang w:val="vi-VN"/>
         </w:rPr>
-        <w:t xml:space="preserve"> = 16,3 kN (cộng véc-tơ).</w:t>
+        <w:t xml:space="preserve"> = 27,3 kN (cộng véc-tơ).</w:t>
       </w:r>
     </w:p>
     <w:p>
@@ -1761,7 +1782,7 @@
           <w:szCs w:val="24"/>
           <w:lang w:val="vi-VN"/>
         </w:rPr>
-        <w:t xml:space="preserve">Đế 5,75 × 5,75 × 0,4 m: thể tích 13,23 m³, nặng 330,6 kN trên cạn, W' = 13,23 × (25 − 10) = 198,4 kN trong nước (đã trừ lực đẩy nổi).</w:t>
+        <w:t xml:space="preserve">Đế 4,00 × 4,00 × 0,5 m: thể tích 8,00 m³, nặng 200,0 kN trên cạn, W' = 8,00 × (25 − 10) = 120,0 kN trong nước (đã trừ lực đẩy nổi).</w:t>
       </w:r>
     </w:p>
     <w:p>
@@ -1823,7 +1844,7 @@
           <w:szCs w:val="24"/>
           <w:lang w:val="vi-VN"/>
         </w:rPr>
-        <w:t xml:space="preserve"> = 210,2 kN; mức sử dụng 0,81.</w:t>
+        <w:t xml:space="preserve"> = 139,7 kN; mức sử dụng 0,81.</w:t>
       </w:r>
     </w:p>
     <w:p>
@@ -1906,7 +1927,7 @@
           <w:szCs w:val="24"/>
           <w:lang w:val="vi-VN"/>
         </w:rPr>
-        <w:t xml:space="preserve"> × B² = 330,6 kN (lấy bằng 0 khi T</w:t>
+        <w:t xml:space="preserve"> × B² = 160,0 kN (lấy bằng 0 khi T</w:t>
       </w:r>
       <w:r>
         <w:rPr>
@@ -1948,7 +1969,7 @@
           <w:szCs w:val="24"/>
           <w:lang w:val="vi-VN"/>
         </w:rPr>
-        <w:t xml:space="preserve"> × z) = 34,9 kN; H</w:t>
+        <w:t xml:space="preserve"> × z) = 24,3 kN; H</w:t>
       </w:r>
       <w:r>
         <w:rPr>
@@ -1969,7 +1990,7 @@
           <w:szCs w:val="24"/>
           <w:lang w:val="vi-VN"/>
         </w:rPr>
-        <w:t xml:space="preserve"> một vít = 15,0 kN (Broms, đầu tự do ở mặt bùn). 1,5 × 16,3 = 24,5 ≤ 425,5 kN; mức sử dụng 0,38.</w:t>
+        <w:t xml:space="preserve"> một vít = 15,0 kN (Broms, đầu tự do ở mặt bùn). 1,5 × 27,3 = 41,0 ≤ 244,2 kN; mức sử dụng 0,53.</w:t>
       </w:r>
     </w:p>
     <w:p>
@@ -2073,7 +2094,7 @@
           <w:szCs w:val="24"/>
           <w:lang w:val="vi-VN"/>
         </w:rPr>
-        <w:t xml:space="preserve"> × B / 2 = 16,3 × (0,4 + 0,15) + 171,2 × 5,75 / 2 = 501,0 kNm; M</w:t>
+        <w:t xml:space="preserve"> × B / 2 = 27,3 × (0,5 + 0,15) + 113,3 × 4,00 / 2 = 244,3 kNm; M</w:t>
       </w:r>
       <w:r>
         <w:rPr>
@@ -2136,7 +2157,7 @@
           <w:szCs w:val="24"/>
           <w:lang w:val="vi-VN"/>
         </w:rPr>
-        <w:t xml:space="preserve"> × c = 752,4 kNm (c = 0,15 m từ mép đế tới tim lỗ vít). 1,5 × 501,0 = 751,6 ≤ 752,4 kNm; mức sử dụng 1,00.</w:t>
+        <w:t xml:space="preserve"> × c = 366,7 kNm (c = 0,15 m từ mép đế tới tim lỗ vít). 1,5 × 244,3 = 366,5 ≤ 366,7 kNm; mức sử dụng 1,00.</w:t>
       </w:r>
     </w:p>
     <w:p>
@@ -2219,7 +2240,7 @@
           <w:szCs w:val="24"/>
           <w:lang w:val="vi-VN"/>
         </w:rPr>
-        <w:t xml:space="preserve"> − 0,9 × W' × B / 2) / (B − c) / (n/2)] = 0,0 kN ≤ Q</w:t>
+        <w:t xml:space="preserve"> − 0,9 × W' × B / 2) / (B − c) / (n/2)] = 3,7 kN ≤ Q</w:t>
       </w:r>
       <w:r>
         <w:rPr>
@@ -2240,7 +2261,7 @@
           <w:szCs w:val="24"/>
           <w:lang w:val="vi-VN"/>
         </w:rPr>
-        <w:t xml:space="preserve"> = 7,9 kN; mức sử dụng 0,00.</w:t>
+        <w:t xml:space="preserve"> = 7,9 kN; mức sử dụng 0,47.</w:t>
       </w:r>
     </w:p>
     <w:p>
@@ -2260,7 +2281,7 @@
           <w:szCs w:val="24"/>
           <w:lang w:val="vi-VN"/>
         </w:rPr>
-        <w:t xml:space="preserve">SV-5 áp lực lên nền bùn: W' / B² = 6,0 kPa ≤ 5,14 × c</w:t>
+        <w:t xml:space="preserve">SV-5 áp lực lên nền bùn: W' / B² = 7,5 kPa ≤ 5,14 × c</w:t>
       </w:r>
       <w:r>
         <w:rPr>
@@ -2281,7 +2302,7 @@
           <w:szCs w:val="24"/>
           <w:lang w:val="vi-VN"/>
         </w:rPr>
-        <w:t xml:space="preserve"> / 2,5 = 41,1 kPa (sức chịu tải giới hạn của nền sét mềm); mức sử dụng 0,15.</w:t>
+        <w:t xml:space="preserve"> / 2,5 = 41,1 kPa (sức chịu tải giới hạn của nền sét mềm); mức sử dụng 0,18.</w:t>
       </w:r>
     </w:p>
     <w:p>
@@ -2322,7 +2343,7 @@
           <w:szCs w:val="24"/>
           <w:lang w:val="vi-VN"/>
         </w:rPr>
-        <w:t xml:space="preserve"> × (s/2) / B = 15,01 kNm/m (s = B − 2c); thép cần A</w:t>
+        <w:t xml:space="preserve"> × (s/2) / B = 14,65 kNm/m (s = B − 2c); thép cần A</w:t>
       </w:r>
       <w:r>
         <w:rPr>
@@ -2385,7 +2406,7 @@
           <w:szCs w:val="24"/>
           <w:lang w:val="vi-VN"/>
         </w:rPr>
-        <w:t xml:space="preserve">) = 183 mm²/m, tối thiểu 0,1% = 350 mm²/m; bố trí lưới Ø12 a200 hai lớp = 565 mm²/m; mức sử dụng 0,62.</w:t>
+        <w:t xml:space="preserve">) = 139 mm²/m, tối thiểu 0,1% = 450 mm²/m; bố trí lưới Ø12 a200 hai lớp = 565 mm²/m; mức sử dụng 0,80.</w:t>
       </w:r>
     </w:p>
     <w:p>
@@ -2405,7 +2426,7 @@
           <w:szCs w:val="24"/>
           <w:lang w:val="vi-VN"/>
         </w:rPr>
-        <w:t xml:space="preserve">Cả hệ: 17 đế (2 đế 2,75 m, 2 đế 3,50 m, 1 đế 3,75 m, 6 đế 4,00 m, 3 đế 4,25 m, 2 đế 5,75 m, 1 đế 6,00 m), 128,3 m³ bê tông, 5,6 tấn thép bản, 68 vít (253 m), đế nặng nhất khi cẩu 36,7 tấn.</w:t>
+        <w:t xml:space="preserve">Cả hệ: 15 đế (2 đế 3,00 m, 2 đế 3,50 m, 7 đế 4,00 m, 1 đế 4,25 m, 1 đế 4,50 m, 1 đế 4,75 m, 1 đế 5,50 m), 104,4 m³ bê tông, 4,5 tấn thép bản, 60 vít (224 m), đế nặng nhất khi cẩu 30,8 tấn.</w:t>
       </w:r>
     </w:p>
     <w:p>
@@ -2425,7 +2446,7 @@
           <w:szCs w:val="24"/>
           <w:lang w:val="vi-VN"/>
         </w:rPr>
-        <w:t xml:space="preserve">Tổng lực nhổ lên 17 đế 1.746 kN, tổng sức chống nhổ 2.275 kN. Mức sử dụng lớn nhất: nhổ 0,83, trượt 0,75, lật 1,00, một vít 0,78.</w:t>
+        <w:t xml:space="preserve">Tổng lực nhổ lên 15 đế 1.436 kN, tổng sức chống nhổ 1.888 kN. Mức sử dụng lớn nhất: nhổ 0,81, trượt 0,89, lật 1,00, một vít 0,91.</w:t>
       </w:r>
     </w:p>
     <w:p>
@@ -2464,7 +2485,7 @@
           <w:szCs w:val="24"/>
           <w:lang w:val="vi-VN"/>
         </w:rPr>
-        <w:t xml:space="preserve">Mỗi dây cắt đủ dài cho mực nước làm khoảng cách bích – chốt dài nhất (27 dây đáy ở MNLKT, 188 dây bờ ở MNC). Tổng chiều dài cắt: dây bờ 8.716 m, dây đáy 720 m, chưa gồm đoạn bện đầu và phụ kiện.</w:t>
+        <w:t xml:space="preserve">Mỗi dây cắt đủ dài cho mực nước làm khoảng cách bích – chốt dài nhất (23 dây đáy ở MNLKT, 188 dây bờ ở MNC). Tổng chiều dài cắt: dây bờ 8.716 m, dây đáy 635 m, chưa gồm đoạn bện đầu và phụ kiện.</w:t>
       </w:r>
     </w:p>
     <w:p>
@@ -2484,7 +2505,7 @@
           <w:szCs w:val="24"/>
           <w:lang w:val="vi-VN"/>
         </w:rPr>
-        <w:t xml:space="preserve">Thiết bị bù / điều chỉnh ở đầu bè phải thu – xả được: dây đáy tới 13,5 m, dây bờ tới 5,5 m (độ chùng lớn nhất của dây cắt cố định), và giữ được lực dây thiết kế. Thiết bị này CHƯA thiết kế.</w:t>
+        <w:t xml:space="preserve">Thiết bị bù / điều chỉnh ở đầu bè phải thu – xả được: dây đáy tới 11,7 m, dây bờ tới 5,5 m (độ chùng lớn nhất của dây cắt cố định), và giữ được lực dây thiết kế. Thiết bị này CHƯA thiết kế.</w:t>
       </w:r>
     </w:p>
     <w:p>
@@ -2543,7 +2564,7 @@
           <w:szCs w:val="24"/>
           <w:lang w:val="vi-VN"/>
         </w:rPr>
-        <w:t xml:space="preserve">Nếu khóa của thiết bị bù KHÔNG khóa kịp, đối trọng chỉ giữ lực căng 5 kN và hành trình dư 3 m mỗi chiều: bè trôi 3,6–6,7 m (tới hết hành trình rồi dây mới căng) và lực dây vọt tới 90–383 kN (hệ số an toàn cáp chỉ 1,8–4,3; đế và cọc không được tính cho lực này). Đối trọng treo tự do KHÔNG đủ giữ bè: cần bộ khóa / phanh chủ động, dự phòng, kiểm tra định kỳ.</w:t>
+        <w:t xml:space="preserve">Nếu khóa của thiết bị bù KHÔNG khóa kịp, đối trọng chỉ giữ lực căng 5 kN và hành trình dư 3 m mỗi chiều: bè trôi 4,5–5,3 m (tới hết hành trình rồi dây mới căng) và lực dây vọt tới 145–383 kN (hệ số an toàn cáp chỉ 1,6–2,1; đế và cọc không được tính cho lực này). Đối trọng treo tự do KHÔNG đủ giữ bè: cần bộ khóa / phanh chủ động, dự phòng, kiểm tra định kỳ.</w:t>
       </w:r>
     </w:p>
     <w:p>
@@ -2583,7 +2604,7 @@
           <w:szCs w:val="24"/>
           <w:lang w:val="vi-VN"/>
         </w:rPr>
-        <w:t xml:space="preserve">Đế vít xoắn đặt trên mặt đất IFC tại chỗ (không phải đáy thiết kế chung như Huổi Vanh): 1/17 đế có nền cao hơn MNC (tới 650,48 m) nên lộ khô khi hồ xuống mực nước chết.</w:t>
+        <w:t xml:space="preserve">Theo địa hình IFC (lưới ~10 m), 13/211 dây tì lên sườn dốc giữa bè và neo khi nước ở 650–653 m (B1-D02, B1-D29, B2-D16, B2-D22, B2-D25, B2-D28, B2-D32, B2-D35, B2-D46, B2-D49, B2-D54, B5-D01, B6-D21; sâu nhất 1,7 m dưới mặt đất): mô hình coi dây thẳng — cần ống / con lăn chống mài mòn ở đoạn tì, hoặc dời cọc theo khảo sát địa hình.</w:t>
       </w:r>
     </w:p>
     <w:p>
@@ -2603,7 +2624,7 @@
           <w:szCs w:val="24"/>
           <w:lang w:val="vi-VN"/>
         </w:rPr>
-        <w:t xml:space="preserve">Theo địa hình IFC (lưới ~10 m), 13/215 dây tì lên sườn dốc giữa bè và neo khi nước ở 650–653 m (B1-D02, B1-D29, B2-D16, B2-D22, B2-D25, B2-D28, B2-D32, B2-D35, B2-D46, B2-D49, B2-D54, B5-D01, B6-D21; sâu nhất 1,7 m dưới mặt đất): mô hình coi dây thẳng — cần ống / con lăn chống mài mòn ở đoạn tì, hoặc dời cọc theo khảo sát địa hình.</w:t>
+        <w:t xml:space="preserve">18 dây nối giữa BÈ 2, BÈ 4, BÈ 5, BÈ 3 thay cho các đế dùng chung ở khe (dài 16,7–57,5 m): các bè nối tính như MỘT cụm trên các dây phía ngoài. Mỗi dây nối kiểm tra với 155 kN: lực qua mỗi khe lấy từ cân bằng của cả cụm (phần lực gió của các bè một phía khe không do dây neo riêng của chúng giữ, mọi mực nước và hướng, kể cả đứt 1 dây), không nhỏ hơn toàn bộ lực gió của phía nhẹ hơn; GIẢ ĐỊNH các bè nối dịch chuyển như một khối và chỉ một nửa số dây nối của khe cùng làm việc. Dây nối dài cố định (các bè cùng nổi, không cần bù mực nước); cần đệm chống va giữa các bè và nhà sản xuất bè xác nhận khung chịu được lực tập trung tại điểm nối.</w:t>
       </w:r>
     </w:p>
     <w:p>
@@ -2623,7 +2644,7 @@
           <w:szCs w:val="24"/>
           <w:lang w:val="vi-VN"/>
         </w:rPr>
-        <w:t xml:space="preserve">14 dây nối BÈ 2 – BÈ 4 – BÈ 5 thay cho 14 đế dùng chung ở khe hẹp (dài 18,4–57,5 m): hai bè tính như MỘT cụm trên các dây phía ngoài. Mỗi dây nối kiểm tra với 155 kN (GIẢ ĐỊNH: một bè truyền toàn bộ lực của nó sang bè kia, một nửa số dây nối cùng làm việc) — chưa mô hình riêng. Dây nối dài cố định (hai bè cùng nổi, không cần bù mực nước); cần đệm chống va giữa hai bè và nhà sản xuất bè xác nhận khung chịu được lực tập trung tại điểm nối.</w:t>
+        <w:t xml:space="preserve">15/188 dây bờ lệch quá 60° so với pháp tuyến mép bè (tới 90°: B1-D06, B1-D24, B1-D38, B2-D09, B2-D11, B2-D16, B2-D49, B2-D54, B3-D05, B5-D05, B5-D18, B5-D23, B5-D29, B6-D15, B6-D26) — do ưu tiên neo bờ thay đế ở các khe giữa bè: cáp chạy xiên dọc mép, tai neo trên bè chịu lực xiên; nhà sản xuất bè cần xác nhận.</w:t>
       </w:r>
     </w:p>
     <w:p>
@@ -2643,27 +2664,7 @@
           <w:szCs w:val="24"/>
           <w:lang w:val="vi-VN"/>
         </w:rPr>
-        <w:t xml:space="preserve">15/188 dây bờ lệch quá 60° so với pháp tuyến mép bè (tới 90°: B1-D06, B1-D24, B1-D38, B2-D09, B2-D11, B2-D16, B2-D49, B2-D54, B3-D05, B5-D05, B5-D18, B5-D23, B5-D29, B6-D15, B6-D26) — do ưu tiên neo bờ thay đế ở các khe giữa bè: cáp chạy xiên dọc mép, tai neo trên bè chịu lực xiên; nhà sản xuất bè cần xác nhận.</w:t>
-      </w:r>
-    </w:p>
-    <w:p>
-      <w:pPr>
-        <w:pStyle w:val="ListParagraph"/>
-        <w:numPr>
-          <w:ilvl w:val="0"/>
-          <w:numId w:val="1"/>
-        </w:numPr>
-        <w:spacing w:after="60"/>
-      </w:pPr>
-      <w:r>
-        <w:rPr>
-          <w:rFonts w:ascii="Times New Roman" w:cs="Times New Roman" w:eastAsia="Times New Roman" w:hAnsi="Times New Roman"/>
-          <w:noProof/>
-          <w:sz w:val="24"/>
-          <w:szCs w:val="24"/>
-          <w:lang w:val="vi-VN"/>
-        </w:rPr>
-        <w:t xml:space="preserve">7/17 đế vít xoắn là đế ĐƠN (một dây), ở vùng nước trống xa bờ hơn tầm dây bờ cho phép 80 m hoặc ở khe không đặt được dây đối diện: quy tắc của Huổi Vanh "đế chỉ đặt giữa hai bè" không áp dụng được cho mặt bằng này — cần Chủ đầu tư xác nhận.</w:t>
+        <w:t xml:space="preserve">7/15 đế vít xoắn là đế ĐƠN (một dây), ở vùng nước trống xa bờ hơn tầm dây bờ cho phép 80 m hoặc ở khe không đặt được dây đối diện: quy tắc của Huổi Vanh "đế chỉ đặt giữa hai bè" không áp dụng được cho mặt bằng này — cần Chủ đầu tư xác nhận.</w:t>
       </w:r>
     </w:p>
     <w:p>
@@ -5559,7 +5560,7 @@
                 <w:szCs w:val="18"/>
                 <w:lang w:val="vi-VN"/>
               </w:rPr>
-              <w:t xml:space="preserve">58</w:t>
+              <w:t xml:space="preserve">60</w:t>
             </w:r>
           </w:p>
         </w:tc>
@@ -5597,45 +5598,45 @@
                 <w:szCs w:val="18"/>
                 <w:lang w:val="vi-VN"/>
               </w:rPr>
-              <w:t xml:space="preserve">121,9</w:t>
-            </w:r>
-          </w:p>
-        </w:tc>
-        <w:tc>
-          <w:p>
-            <w:pPr>
-              <w:jc w:val="center"/>
-            </w:pPr>
-            <w:r>
-              <w:rPr>
-                <w:rFonts w:ascii="Times New Roman" w:cs="Times New Roman" w:eastAsia="Times New Roman" w:hAnsi="Times New Roman"/>
-                <w:b w:val="false"/>
-                <w:bCs w:val="false"/>
-                <w:noProof/>
-                <w:sz w:val="18"/>
-                <w:szCs w:val="18"/>
-                <w:lang w:val="vi-VN"/>
-              </w:rPr>
-              <w:t xml:space="preserve">PES-36</w:t>
-            </w:r>
-          </w:p>
-        </w:tc>
-        <w:tc>
-          <w:p>
-            <w:pPr>
-              <w:jc w:val="center"/>
-            </w:pPr>
-            <w:r>
-              <w:rPr>
-                <w:rFonts w:ascii="Times New Roman" w:cs="Times New Roman" w:eastAsia="Times New Roman" w:hAnsi="Times New Roman"/>
-                <w:b w:val="false"/>
-                <w:bCs w:val="false"/>
-                <w:noProof/>
-                <w:sz w:val="18"/>
-                <w:szCs w:val="18"/>
-                <w:lang w:val="vi-VN"/>
-              </w:rPr>
-              <w:t xml:space="preserve">3,16</w:t>
+              <w:t xml:space="preserve">95,2</w:t>
+            </w:r>
+          </w:p>
+        </w:tc>
+        <w:tc>
+          <w:p>
+            <w:pPr>
+              <w:jc w:val="center"/>
+            </w:pPr>
+            <w:r>
+              <w:rPr>
+                <w:rFonts w:ascii="Times New Roman" w:cs="Times New Roman" w:eastAsia="Times New Roman" w:hAnsi="Times New Roman"/>
+                <w:b w:val="false"/>
+                <w:bCs w:val="false"/>
+                <w:noProof/>
+                <w:sz w:val="18"/>
+                <w:szCs w:val="18"/>
+                <w:lang w:val="vi-VN"/>
+              </w:rPr>
+              <w:t xml:space="preserve">PES-32</w:t>
+            </w:r>
+          </w:p>
+        </w:tc>
+        <w:tc>
+          <w:p>
+            <w:pPr>
+              <w:jc w:val="center"/>
+            </w:pPr>
+            <w:r>
+              <w:rPr>
+                <w:rFonts w:ascii="Times New Roman" w:cs="Times New Roman" w:eastAsia="Times New Roman" w:hAnsi="Times New Roman"/>
+                <w:b w:val="false"/>
+                <w:bCs w:val="false"/>
+                <w:noProof/>
+                <w:sz w:val="18"/>
+                <w:szCs w:val="18"/>
+                <w:lang w:val="vi-VN"/>
+              </w:rPr>
+              <w:t xml:space="preserve">3,20</w:t>
             </w:r>
           </w:p>
         </w:tc>
@@ -5730,26 +5731,26 @@
                 <w:szCs w:val="18"/>
                 <w:lang w:val="vi-VN"/>
               </w:rPr>
-              <w:t xml:space="preserve">0,56</w:t>
-            </w:r>
-          </w:p>
-        </w:tc>
-        <w:tc>
-          <w:p>
-            <w:pPr>
-              <w:jc w:val="center"/>
-            </w:pPr>
-            <w:r>
-              <w:rPr>
-                <w:rFonts w:ascii="Times New Roman" w:cs="Times New Roman" w:eastAsia="Times New Roman" w:hAnsi="Times New Roman"/>
-                <w:b w:val="false"/>
-                <w:bCs w:val="false"/>
-                <w:noProof/>
-                <w:sz w:val="18"/>
-                <w:szCs w:val="18"/>
-                <w:lang w:val="vi-VN"/>
-              </w:rPr>
-              <w:t xml:space="preserve">0,94</w:t>
+              <w:t xml:space="preserve">0,54</w:t>
+            </w:r>
+          </w:p>
+        </w:tc>
+        <w:tc>
+          <w:p>
+            <w:pPr>
+              <w:jc w:val="center"/>
+            </w:pPr>
+            <w:r>
+              <w:rPr>
+                <w:rFonts w:ascii="Times New Roman" w:cs="Times New Roman" w:eastAsia="Times New Roman" w:hAnsi="Times New Roman"/>
+                <w:b w:val="false"/>
+                <w:bCs w:val="false"/>
+                <w:noProof/>
+                <w:sz w:val="18"/>
+                <w:szCs w:val="18"/>
+                <w:lang w:val="vi-VN"/>
+              </w:rPr>
+              <w:t xml:space="preserve">0,88</w:t>
             </w:r>
           </w:p>
         </w:tc>
@@ -5811,7 +5812,7 @@
                 <w:szCs w:val="18"/>
                 <w:lang w:val="vi-VN"/>
               </w:rPr>
-              <w:t xml:space="preserve">19</w:t>
+              <w:t xml:space="preserve">21</w:t>
             </w:r>
           </w:p>
         </w:tc>
@@ -5849,7 +5850,7 @@
                 <w:szCs w:val="18"/>
                 <w:lang w:val="vi-VN"/>
               </w:rPr>
-              <w:t xml:space="preserve">78,7</w:t>
+              <w:t xml:space="preserve">95,2</w:t>
             </w:r>
           </w:p>
         </w:tc>
@@ -5887,7 +5888,7 @@
                 <w:szCs w:val="18"/>
                 <w:lang w:val="vi-VN"/>
               </w:rPr>
-              <w:t xml:space="preserve">3,88</w:t>
+              <w:t xml:space="preserve">3,20</w:t>
             </w:r>
           </w:p>
         </w:tc>
@@ -5963,45 +5964,45 @@
                 <w:szCs w:val="18"/>
                 <w:lang w:val="vi-VN"/>
               </w:rPr>
-              <w:t xml:space="preserve">6Φ28 CB400-V</w:t>
-            </w:r>
-          </w:p>
-        </w:tc>
-        <w:tc>
-          <w:p>
-            <w:pPr>
-              <w:jc w:val="center"/>
-            </w:pPr>
-            <w:r>
-              <w:rPr>
-                <w:rFonts w:ascii="Times New Roman" w:cs="Times New Roman" w:eastAsia="Times New Roman" w:hAnsi="Times New Roman"/>
-                <w:b w:val="false"/>
-                <w:bCs w:val="false"/>
-                <w:noProof/>
-                <w:sz w:val="18"/>
-                <w:szCs w:val="18"/>
-                <w:lang w:val="vi-VN"/>
-              </w:rPr>
-              <w:t xml:space="preserve">0,68</w:t>
-            </w:r>
-          </w:p>
-        </w:tc>
-        <w:tc>
-          <w:p>
-            <w:pPr>
-              <w:jc w:val="center"/>
-            </w:pPr>
-            <w:r>
-              <w:rPr>
-                <w:rFonts w:ascii="Times New Roman" w:cs="Times New Roman" w:eastAsia="Times New Roman" w:hAnsi="Times New Roman"/>
-                <w:b w:val="false"/>
-                <w:bCs w:val="false"/>
-                <w:noProof/>
-                <w:sz w:val="18"/>
-                <w:szCs w:val="18"/>
-                <w:lang w:val="vi-VN"/>
-              </w:rPr>
-              <w:t xml:space="preserve">0,95</w:t>
+              <w:t xml:space="preserve">6Φ28 CB500-V</w:t>
+            </w:r>
+          </w:p>
+        </w:tc>
+        <w:tc>
+          <w:p>
+            <w:pPr>
+              <w:jc w:val="center"/>
+            </w:pPr>
+            <w:r>
+              <w:rPr>
+                <w:rFonts w:ascii="Times New Roman" w:cs="Times New Roman" w:eastAsia="Times New Roman" w:hAnsi="Times New Roman"/>
+                <w:b w:val="false"/>
+                <w:bCs w:val="false"/>
+                <w:noProof/>
+                <w:sz w:val="18"/>
+                <w:szCs w:val="18"/>
+                <w:lang w:val="vi-VN"/>
+              </w:rPr>
+              <w:t xml:space="preserve">0,74</w:t>
+            </w:r>
+          </w:p>
+        </w:tc>
+        <w:tc>
+          <w:p>
+            <w:pPr>
+              <w:jc w:val="center"/>
+            </w:pPr>
+            <w:r>
+              <w:rPr>
+                <w:rFonts w:ascii="Times New Roman" w:cs="Times New Roman" w:eastAsia="Times New Roman" w:hAnsi="Times New Roman"/>
+                <w:b w:val="false"/>
+                <w:bCs w:val="false"/>
+                <w:noProof/>
+                <w:sz w:val="18"/>
+                <w:szCs w:val="18"/>
+                <w:lang w:val="vi-VN"/>
+              </w:rPr>
+              <w:t xml:space="preserve">0,86</w:t>
             </w:r>
           </w:p>
         </w:tc>
@@ -6101,45 +6102,45 @@
                 <w:szCs w:val="18"/>
                 <w:lang w:val="vi-VN"/>
               </w:rPr>
-              <w:t xml:space="preserve">121,9</w:t>
-            </w:r>
-          </w:p>
-        </w:tc>
-        <w:tc>
-          <w:p>
-            <w:pPr>
-              <w:jc w:val="center"/>
-            </w:pPr>
-            <w:r>
-              <w:rPr>
-                <w:rFonts w:ascii="Times New Roman" w:cs="Times New Roman" w:eastAsia="Times New Roman" w:hAnsi="Times New Roman"/>
-                <w:b w:val="false"/>
-                <w:bCs w:val="false"/>
-                <w:noProof/>
-                <w:sz w:val="18"/>
-                <w:szCs w:val="18"/>
-                <w:lang w:val="vi-VN"/>
-              </w:rPr>
-              <w:t xml:space="preserve">PES-36</w:t>
-            </w:r>
-          </w:p>
-        </w:tc>
-        <w:tc>
-          <w:p>
-            <w:pPr>
-              <w:jc w:val="center"/>
-            </w:pPr>
-            <w:r>
-              <w:rPr>
-                <w:rFonts w:ascii="Times New Roman" w:cs="Times New Roman" w:eastAsia="Times New Roman" w:hAnsi="Times New Roman"/>
-                <w:b w:val="false"/>
-                <w:bCs w:val="false"/>
-                <w:noProof/>
-                <w:sz w:val="18"/>
-                <w:szCs w:val="18"/>
-                <w:lang w:val="vi-VN"/>
-              </w:rPr>
-              <w:t xml:space="preserve">3,16</w:t>
+              <w:t xml:space="preserve">95,2</w:t>
+            </w:r>
+          </w:p>
+        </w:tc>
+        <w:tc>
+          <w:p>
+            <w:pPr>
+              <w:jc w:val="center"/>
+            </w:pPr>
+            <w:r>
+              <w:rPr>
+                <w:rFonts w:ascii="Times New Roman" w:cs="Times New Roman" w:eastAsia="Times New Roman" w:hAnsi="Times New Roman"/>
+                <w:b w:val="false"/>
+                <w:bCs w:val="false"/>
+                <w:noProof/>
+                <w:sz w:val="18"/>
+                <w:szCs w:val="18"/>
+                <w:lang w:val="vi-VN"/>
+              </w:rPr>
+              <w:t xml:space="preserve">PES-32</w:t>
+            </w:r>
+          </w:p>
+        </w:tc>
+        <w:tc>
+          <w:p>
+            <w:pPr>
+              <w:jc w:val="center"/>
+            </w:pPr>
+            <w:r>
+              <w:rPr>
+                <w:rFonts w:ascii="Times New Roman" w:cs="Times New Roman" w:eastAsia="Times New Roman" w:hAnsi="Times New Roman"/>
+                <w:b w:val="false"/>
+                <w:bCs w:val="false"/>
+                <w:noProof/>
+                <w:sz w:val="18"/>
+                <w:szCs w:val="18"/>
+                <w:lang w:val="vi-VN"/>
+              </w:rPr>
+              <w:t xml:space="preserve">3,20</w:t>
             </w:r>
           </w:p>
         </w:tc>
@@ -6234,26 +6235,26 @@
                 <w:szCs w:val="18"/>
                 <w:lang w:val="vi-VN"/>
               </w:rPr>
-              <w:t xml:space="preserve">0,56</w:t>
-            </w:r>
-          </w:p>
-        </w:tc>
-        <w:tc>
-          <w:p>
-            <w:pPr>
-              <w:jc w:val="center"/>
-            </w:pPr>
-            <w:r>
-              <w:rPr>
-                <w:rFonts w:ascii="Times New Roman" w:cs="Times New Roman" w:eastAsia="Times New Roman" w:hAnsi="Times New Roman"/>
-                <w:b w:val="false"/>
-                <w:bCs w:val="false"/>
-                <w:noProof/>
-                <w:sz w:val="18"/>
-                <w:szCs w:val="18"/>
-                <w:lang w:val="vi-VN"/>
-              </w:rPr>
-              <w:t xml:space="preserve">0,92</w:t>
+              <w:t xml:space="preserve">0,51</w:t>
+            </w:r>
+          </w:p>
+        </w:tc>
+        <w:tc>
+          <w:p>
+            <w:pPr>
+              <w:jc w:val="center"/>
+            </w:pPr>
+            <w:r>
+              <w:rPr>
+                <w:rFonts w:ascii="Times New Roman" w:cs="Times New Roman" w:eastAsia="Times New Roman" w:hAnsi="Times New Roman"/>
+                <w:b w:val="false"/>
+                <w:bCs w:val="false"/>
+                <w:noProof/>
+                <w:sz w:val="18"/>
+                <w:szCs w:val="18"/>
+                <w:lang w:val="vi-VN"/>
+              </w:rPr>
+              <w:t xml:space="preserve">0,83</w:t>
             </w:r>
           </w:p>
         </w:tc>
@@ -6353,45 +6354,45 @@
                 <w:szCs w:val="18"/>
                 <w:lang w:val="vi-VN"/>
               </w:rPr>
-              <w:t xml:space="preserve">121,9</w:t>
-            </w:r>
-          </w:p>
-        </w:tc>
-        <w:tc>
-          <w:p>
-            <w:pPr>
-              <w:jc w:val="center"/>
-            </w:pPr>
-            <w:r>
-              <w:rPr>
-                <w:rFonts w:ascii="Times New Roman" w:cs="Times New Roman" w:eastAsia="Times New Roman" w:hAnsi="Times New Roman"/>
-                <w:b w:val="false"/>
-                <w:bCs w:val="false"/>
-                <w:noProof/>
-                <w:sz w:val="18"/>
-                <w:szCs w:val="18"/>
-                <w:lang w:val="vi-VN"/>
-              </w:rPr>
-              <w:t xml:space="preserve">PES-36</w:t>
-            </w:r>
-          </w:p>
-        </w:tc>
-        <w:tc>
-          <w:p>
-            <w:pPr>
-              <w:jc w:val="center"/>
-            </w:pPr>
-            <w:r>
-              <w:rPr>
-                <w:rFonts w:ascii="Times New Roman" w:cs="Times New Roman" w:eastAsia="Times New Roman" w:hAnsi="Times New Roman"/>
-                <w:b w:val="false"/>
-                <w:bCs w:val="false"/>
-                <w:noProof/>
-                <w:sz w:val="18"/>
-                <w:szCs w:val="18"/>
-                <w:lang w:val="vi-VN"/>
-              </w:rPr>
-              <w:t xml:space="preserve">3,16</w:t>
+              <w:t xml:space="preserve">95,2</w:t>
+            </w:r>
+          </w:p>
+        </w:tc>
+        <w:tc>
+          <w:p>
+            <w:pPr>
+              <w:jc w:val="center"/>
+            </w:pPr>
+            <w:r>
+              <w:rPr>
+                <w:rFonts w:ascii="Times New Roman" w:cs="Times New Roman" w:eastAsia="Times New Roman" w:hAnsi="Times New Roman"/>
+                <w:b w:val="false"/>
+                <w:bCs w:val="false"/>
+                <w:noProof/>
+                <w:sz w:val="18"/>
+                <w:szCs w:val="18"/>
+                <w:lang w:val="vi-VN"/>
+              </w:rPr>
+              <w:t xml:space="preserve">PES-32</w:t>
+            </w:r>
+          </w:p>
+        </w:tc>
+        <w:tc>
+          <w:p>
+            <w:pPr>
+              <w:jc w:val="center"/>
+            </w:pPr>
+            <w:r>
+              <w:rPr>
+                <w:rFonts w:ascii="Times New Roman" w:cs="Times New Roman" w:eastAsia="Times New Roman" w:hAnsi="Times New Roman"/>
+                <w:b w:val="false"/>
+                <w:bCs w:val="false"/>
+                <w:noProof/>
+                <w:sz w:val="18"/>
+                <w:szCs w:val="18"/>
+                <w:lang w:val="vi-VN"/>
+              </w:rPr>
+              <w:t xml:space="preserve">3,20</w:t>
             </w:r>
           </w:p>
         </w:tc>
@@ -6486,26 +6487,26 @@
                 <w:szCs w:val="18"/>
                 <w:lang w:val="vi-VN"/>
               </w:rPr>
-              <w:t xml:space="preserve">0,60</w:t>
-            </w:r>
-          </w:p>
-        </w:tc>
-        <w:tc>
-          <w:p>
-            <w:pPr>
-              <w:jc w:val="center"/>
-            </w:pPr>
-            <w:r>
-              <w:rPr>
-                <w:rFonts w:ascii="Times New Roman" w:cs="Times New Roman" w:eastAsia="Times New Roman" w:hAnsi="Times New Roman"/>
-                <w:b w:val="false"/>
-                <w:bCs w:val="false"/>
-                <w:noProof/>
-                <w:sz w:val="18"/>
-                <w:szCs w:val="18"/>
-                <w:lang w:val="vi-VN"/>
-              </w:rPr>
-              <w:t xml:space="preserve">0,80</w:t>
+              <w:t xml:space="preserve">0,59</w:t>
+            </w:r>
+          </w:p>
+        </w:tc>
+        <w:tc>
+          <w:p>
+            <w:pPr>
+              <w:jc w:val="center"/>
+            </w:pPr>
+            <w:r>
+              <w:rPr>
+                <w:rFonts w:ascii="Times New Roman" w:cs="Times New Roman" w:eastAsia="Times New Roman" w:hAnsi="Times New Roman"/>
+                <w:b w:val="false"/>
+                <w:bCs w:val="false"/>
+                <w:noProof/>
+                <w:sz w:val="18"/>
+                <w:szCs w:val="18"/>
+                <w:lang w:val="vi-VN"/>
+              </w:rPr>
+              <w:t xml:space="preserve">0,79</w:t>
             </w:r>
           </w:p>
         </w:tc>
@@ -6819,7 +6820,7 @@
                 <w:szCs w:val="18"/>
                 <w:lang w:val="vi-VN"/>
               </w:rPr>
-              <w:t xml:space="preserve">215</w:t>
+              <w:t xml:space="preserve">211</w:t>
             </w:r>
           </w:p>
         </w:tc>
@@ -7065,7 +7066,7 @@
           <w:szCs w:val="26"/>
           <w:lang w:val="vi-VN"/>
         </w:rPr>
-        <w:t xml:space="preserve">Bảng B. 17 đế BTCT + vít xoắn</w:t>
+        <w:t xml:space="preserve">Bảng B. 15 đế BTCT + vít xoắn</w:t>
       </w:r>
     </w:p>
     <w:tbl>
@@ -7409,159 +7410,159 @@
                 <w:szCs w:val="18"/>
                 <w:lang w:val="vi-VN"/>
               </w:rPr>
-              <w:t xml:space="preserve">3,75</w:t>
-            </w:r>
-          </w:p>
-        </w:tc>
-        <w:tc>
-          <w:p>
-            <w:pPr>
-              <w:jc w:val="center"/>
-            </w:pPr>
-            <w:r>
-              <w:rPr>
-                <w:rFonts w:ascii="Times New Roman" w:cs="Times New Roman" w:eastAsia="Times New Roman" w:hAnsi="Times New Roman"/>
-                <w:b w:val="false"/>
-                <w:bCs w:val="false"/>
-                <w:noProof/>
-                <w:sz w:val="18"/>
-                <w:szCs w:val="18"/>
-                <w:lang w:val="vi-VN"/>
-              </w:rPr>
-              <w:t xml:space="preserve">0,5</w:t>
-            </w:r>
-          </w:p>
-        </w:tc>
-        <w:tc>
-          <w:p>
-            <w:pPr>
-              <w:jc w:val="center"/>
-            </w:pPr>
-            <w:r>
-              <w:rPr>
-                <w:rFonts w:ascii="Times New Roman" w:cs="Times New Roman" w:eastAsia="Times New Roman" w:hAnsi="Times New Roman"/>
-                <w:b w:val="false"/>
-                <w:bCs w:val="false"/>
-                <w:noProof/>
-                <w:sz w:val="18"/>
-                <w:szCs w:val="18"/>
-                <w:lang w:val="vi-VN"/>
-              </w:rPr>
-              <w:t xml:space="preserve">7,01</w:t>
-            </w:r>
-          </w:p>
-        </w:tc>
-        <w:tc>
-          <w:p>
-            <w:pPr>
-              <w:jc w:val="center"/>
-            </w:pPr>
-            <w:r>
-              <w:rPr>
-                <w:rFonts w:ascii="Times New Roman" w:cs="Times New Roman" w:eastAsia="Times New Roman" w:hAnsi="Times New Roman"/>
-                <w:b w:val="false"/>
-                <w:bCs w:val="false"/>
-                <w:noProof/>
-                <w:sz w:val="18"/>
-                <w:szCs w:val="18"/>
-                <w:lang w:val="vi-VN"/>
-              </w:rPr>
-              <w:t xml:space="preserve">17,9</w:t>
-            </w:r>
-          </w:p>
-        </w:tc>
-        <w:tc>
-          <w:p>
-            <w:pPr>
-              <w:jc w:val="center"/>
-            </w:pPr>
-            <w:r>
-              <w:rPr>
-                <w:rFonts w:ascii="Times New Roman" w:cs="Times New Roman" w:eastAsia="Times New Roman" w:hAnsi="Times New Roman"/>
-                <w:b w:val="false"/>
-                <w:bCs w:val="false"/>
-                <w:noProof/>
-                <w:sz w:val="18"/>
-                <w:szCs w:val="18"/>
-                <w:lang w:val="vi-VN"/>
-              </w:rPr>
-              <w:t xml:space="preserve">103,7</w:t>
-            </w:r>
-          </w:p>
-        </w:tc>
-        <w:tc>
-          <w:p>
-            <w:pPr>
-              <w:jc w:val="center"/>
-            </w:pPr>
-            <w:r>
-              <w:rPr>
-                <w:rFonts w:ascii="Times New Roman" w:cs="Times New Roman" w:eastAsia="Times New Roman" w:hAnsi="Times New Roman"/>
-                <w:b w:val="false"/>
-                <w:bCs w:val="false"/>
-                <w:noProof/>
-                <w:sz w:val="18"/>
-                <w:szCs w:val="18"/>
-                <w:lang w:val="vi-VN"/>
-              </w:rPr>
-              <w:t xml:space="preserve">0,82</w:t>
-            </w:r>
-          </w:p>
-        </w:tc>
-        <w:tc>
-          <w:p>
-            <w:pPr>
-              <w:jc w:val="center"/>
-            </w:pPr>
-            <w:r>
-              <w:rPr>
-                <w:rFonts w:ascii="Times New Roman" w:cs="Times New Roman" w:eastAsia="Times New Roman" w:hAnsi="Times New Roman"/>
-                <w:b w:val="false"/>
-                <w:bCs w:val="false"/>
-                <w:noProof/>
-                <w:sz w:val="18"/>
-                <w:szCs w:val="18"/>
-                <w:lang w:val="vi-VN"/>
-              </w:rPr>
-              <w:t xml:space="preserve">0,52</w:t>
-            </w:r>
-          </w:p>
-        </w:tc>
-        <w:tc>
-          <w:p>
-            <w:pPr>
-              <w:jc w:val="center"/>
-            </w:pPr>
-            <w:r>
-              <w:rPr>
-                <w:rFonts w:ascii="Times New Roman" w:cs="Times New Roman" w:eastAsia="Times New Roman" w:hAnsi="Times New Roman"/>
-                <w:b w:val="false"/>
-                <w:bCs w:val="false"/>
-                <w:noProof/>
-                <w:sz w:val="18"/>
-                <w:szCs w:val="18"/>
-                <w:lang w:val="vi-VN"/>
-              </w:rPr>
-              <w:t xml:space="preserve">0,99</w:t>
-            </w:r>
-          </w:p>
-        </w:tc>
-        <w:tc>
-          <w:p>
-            <w:pPr>
-              <w:jc w:val="center"/>
-            </w:pPr>
-            <w:r>
-              <w:rPr>
-                <w:rFonts w:ascii="Times New Roman" w:cs="Times New Roman" w:eastAsia="Times New Roman" w:hAnsi="Times New Roman"/>
-                <w:b w:val="false"/>
-                <w:bCs w:val="false"/>
-                <w:noProof/>
-                <w:sz w:val="18"/>
-                <w:szCs w:val="18"/>
-                <w:lang w:val="vi-VN"/>
-              </w:rPr>
-              <w:t xml:space="preserve">0,55</w:t>
+              <w:t xml:space="preserve">4,25</w:t>
+            </w:r>
+          </w:p>
+        </w:tc>
+        <w:tc>
+          <w:p>
+            <w:pPr>
+              <w:jc w:val="center"/>
+            </w:pPr>
+            <w:r>
+              <w:rPr>
+                <w:rFonts w:ascii="Times New Roman" w:cs="Times New Roman" w:eastAsia="Times New Roman" w:hAnsi="Times New Roman"/>
+                <w:b w:val="false"/>
+                <w:bCs w:val="false"/>
+                <w:noProof/>
+                <w:sz w:val="18"/>
+                <w:szCs w:val="18"/>
+                <w:lang w:val="vi-VN"/>
+              </w:rPr>
+              <w:t xml:space="preserve">0,4</w:t>
+            </w:r>
+          </w:p>
+        </w:tc>
+        <w:tc>
+          <w:p>
+            <w:pPr>
+              <w:jc w:val="center"/>
+            </w:pPr>
+            <w:r>
+              <w:rPr>
+                <w:rFonts w:ascii="Times New Roman" w:cs="Times New Roman" w:eastAsia="Times New Roman" w:hAnsi="Times New Roman"/>
+                <w:b w:val="false"/>
+                <w:bCs w:val="false"/>
+                <w:noProof/>
+                <w:sz w:val="18"/>
+                <w:szCs w:val="18"/>
+                <w:lang w:val="vi-VN"/>
+              </w:rPr>
+              <w:t xml:space="preserve">7,21</w:t>
+            </w:r>
+          </w:p>
+        </w:tc>
+        <w:tc>
+          <w:p>
+            <w:pPr>
+              <w:jc w:val="center"/>
+            </w:pPr>
+            <w:r>
+              <w:rPr>
+                <w:rFonts w:ascii="Times New Roman" w:cs="Times New Roman" w:eastAsia="Times New Roman" w:hAnsi="Times New Roman"/>
+                <w:b w:val="false"/>
+                <w:bCs w:val="false"/>
+                <w:noProof/>
+                <w:sz w:val="18"/>
+                <w:szCs w:val="18"/>
+                <w:lang w:val="vi-VN"/>
+              </w:rPr>
+              <w:t xml:space="preserve">18,4</w:t>
+            </w:r>
+          </w:p>
+        </w:tc>
+        <w:tc>
+          <w:p>
+            <w:pPr>
+              <w:jc w:val="center"/>
+            </w:pPr>
+            <w:r>
+              <w:rPr>
+                <w:rFonts w:ascii="Times New Roman" w:cs="Times New Roman" w:eastAsia="Times New Roman" w:hAnsi="Times New Roman"/>
+                <w:b w:val="false"/>
+                <w:bCs w:val="false"/>
+                <w:noProof/>
+                <w:sz w:val="18"/>
+                <w:szCs w:val="18"/>
+                <w:lang w:val="vi-VN"/>
+              </w:rPr>
+              <w:t xml:space="preserve">104,9</w:t>
+            </w:r>
+          </w:p>
+        </w:tc>
+        <w:tc>
+          <w:p>
+            <w:pPr>
+              <w:jc w:val="center"/>
+            </w:pPr>
+            <w:r>
+              <w:rPr>
+                <w:rFonts w:ascii="Times New Roman" w:cs="Times New Roman" w:eastAsia="Times New Roman" w:hAnsi="Times New Roman"/>
+                <w:b w:val="false"/>
+                <w:bCs w:val="false"/>
+                <w:noProof/>
+                <w:sz w:val="18"/>
+                <w:szCs w:val="18"/>
+                <w:lang w:val="vi-VN"/>
+              </w:rPr>
+              <w:t xml:space="preserve">0,81</w:t>
+            </w:r>
+          </w:p>
+        </w:tc>
+        <w:tc>
+          <w:p>
+            <w:pPr>
+              <w:jc w:val="center"/>
+            </w:pPr>
+            <w:r>
+              <w:rPr>
+                <w:rFonts w:ascii="Times New Roman" w:cs="Times New Roman" w:eastAsia="Times New Roman" w:hAnsi="Times New Roman"/>
+                <w:b w:val="false"/>
+                <w:bCs w:val="false"/>
+                <w:noProof/>
+                <w:sz w:val="18"/>
+                <w:szCs w:val="18"/>
+                <w:lang w:val="vi-VN"/>
+              </w:rPr>
+              <w:t xml:space="preserve">0,44</w:t>
+            </w:r>
+          </w:p>
+        </w:tc>
+        <w:tc>
+          <w:p>
+            <w:pPr>
+              <w:jc w:val="center"/>
+            </w:pPr>
+            <w:r>
+              <w:rPr>
+                <w:rFonts w:ascii="Times New Roman" w:cs="Times New Roman" w:eastAsia="Times New Roman" w:hAnsi="Times New Roman"/>
+                <w:b w:val="false"/>
+                <w:bCs w:val="false"/>
+                <w:noProof/>
+                <w:sz w:val="18"/>
+                <w:szCs w:val="18"/>
+                <w:lang w:val="vi-VN"/>
+              </w:rPr>
+              <w:t xml:space="preserve">0,97</w:t>
+            </w:r>
+          </w:p>
+        </w:tc>
+        <w:tc>
+          <w:p>
+            <w:pPr>
+              <w:jc w:val="center"/>
+            </w:pPr>
+            <w:r>
+              <w:rPr>
+                <w:rFonts w:ascii="Times New Roman" w:cs="Times New Roman" w:eastAsia="Times New Roman" w:hAnsi="Times New Roman"/>
+                <w:b w:val="false"/>
+                <w:bCs w:val="false"/>
+                <w:noProof/>
+                <w:sz w:val="18"/>
+                <w:szCs w:val="18"/>
+                <w:lang w:val="vi-VN"/>
+              </w:rPr>
+              <w:t xml:space="preserve">0,44</w:t>
             </w:r>
           </w:p>
         </w:tc>
@@ -7642,121 +7643,121 @@
                 <w:szCs w:val="18"/>
                 <w:lang w:val="vi-VN"/>
               </w:rPr>
-              <w:t xml:space="preserve">4,25</w:t>
-            </w:r>
-          </w:p>
-        </w:tc>
-        <w:tc>
-          <w:p>
-            <w:pPr>
-              <w:jc w:val="center"/>
-            </w:pPr>
-            <w:r>
-              <w:rPr>
-                <w:rFonts w:ascii="Times New Roman" w:cs="Times New Roman" w:eastAsia="Times New Roman" w:hAnsi="Times New Roman"/>
-                <w:b w:val="false"/>
-                <w:bCs w:val="false"/>
-                <w:noProof/>
-                <w:sz w:val="18"/>
-                <w:szCs w:val="18"/>
-                <w:lang w:val="vi-VN"/>
-              </w:rPr>
-              <w:t xml:space="preserve">0,4</w:t>
-            </w:r>
-          </w:p>
-        </w:tc>
-        <w:tc>
-          <w:p>
-            <w:pPr>
-              <w:jc w:val="center"/>
-            </w:pPr>
-            <w:r>
-              <w:rPr>
-                <w:rFonts w:ascii="Times New Roman" w:cs="Times New Roman" w:eastAsia="Times New Roman" w:hAnsi="Times New Roman"/>
-                <w:b w:val="false"/>
-                <w:bCs w:val="false"/>
-                <w:noProof/>
-                <w:sz w:val="18"/>
-                <w:szCs w:val="18"/>
-                <w:lang w:val="vi-VN"/>
-              </w:rPr>
-              <w:t xml:space="preserve">7,21</w:t>
-            </w:r>
-          </w:p>
-        </w:tc>
-        <w:tc>
-          <w:p>
-            <w:pPr>
-              <w:jc w:val="center"/>
-            </w:pPr>
-            <w:r>
-              <w:rPr>
-                <w:rFonts w:ascii="Times New Roman" w:cs="Times New Roman" w:eastAsia="Times New Roman" w:hAnsi="Times New Roman"/>
-                <w:b w:val="false"/>
-                <w:bCs w:val="false"/>
-                <w:noProof/>
-                <w:sz w:val="18"/>
-                <w:szCs w:val="18"/>
-                <w:lang w:val="vi-VN"/>
-              </w:rPr>
-              <w:t xml:space="preserve">18,4</w:t>
-            </w:r>
-          </w:p>
-        </w:tc>
-        <w:tc>
-          <w:p>
-            <w:pPr>
-              <w:jc w:val="center"/>
-            </w:pPr>
-            <w:r>
-              <w:rPr>
-                <w:rFonts w:ascii="Times New Roman" w:cs="Times New Roman" w:eastAsia="Times New Roman" w:hAnsi="Times New Roman"/>
-                <w:b w:val="false"/>
-                <w:bCs w:val="false"/>
-                <w:noProof/>
-                <w:sz w:val="18"/>
-                <w:szCs w:val="18"/>
-                <w:lang w:val="vi-VN"/>
-              </w:rPr>
-              <w:t xml:space="preserve">107,6</w:t>
-            </w:r>
-          </w:p>
-        </w:tc>
-        <w:tc>
-          <w:p>
-            <w:pPr>
-              <w:jc w:val="center"/>
-            </w:pPr>
-            <w:r>
-              <w:rPr>
-                <w:rFonts w:ascii="Times New Roman" w:cs="Times New Roman" w:eastAsia="Times New Roman" w:hAnsi="Times New Roman"/>
-                <w:b w:val="false"/>
-                <w:bCs w:val="false"/>
-                <w:noProof/>
-                <w:sz w:val="18"/>
-                <w:szCs w:val="18"/>
-                <w:lang w:val="vi-VN"/>
-              </w:rPr>
-              <w:t xml:space="preserve">0,83</w:t>
-            </w:r>
-          </w:p>
-        </w:tc>
-        <w:tc>
-          <w:p>
-            <w:pPr>
-              <w:jc w:val="center"/>
-            </w:pPr>
-            <w:r>
-              <w:rPr>
-                <w:rFonts w:ascii="Times New Roman" w:cs="Times New Roman" w:eastAsia="Times New Roman" w:hAnsi="Times New Roman"/>
-                <w:b w:val="false"/>
-                <w:bCs w:val="false"/>
-                <w:noProof/>
-                <w:sz w:val="18"/>
-                <w:szCs w:val="18"/>
-                <w:lang w:val="vi-VN"/>
-              </w:rPr>
-              <w:t xml:space="preserve">0,44</w:t>
+              <w:t xml:space="preserve">4,00</w:t>
+            </w:r>
+          </w:p>
+        </w:tc>
+        <w:tc>
+          <w:p>
+            <w:pPr>
+              <w:jc w:val="center"/>
+            </w:pPr>
+            <w:r>
+              <w:rPr>
+                <w:rFonts w:ascii="Times New Roman" w:cs="Times New Roman" w:eastAsia="Times New Roman" w:hAnsi="Times New Roman"/>
+                <w:b w:val="false"/>
+                <w:bCs w:val="false"/>
+                <w:noProof/>
+                <w:sz w:val="18"/>
+                <w:szCs w:val="18"/>
+                <w:lang w:val="vi-VN"/>
+              </w:rPr>
+              <w:t xml:space="preserve">0,5</w:t>
+            </w:r>
+          </w:p>
+        </w:tc>
+        <w:tc>
+          <w:p>
+            <w:pPr>
+              <w:jc w:val="center"/>
+            </w:pPr>
+            <w:r>
+              <w:rPr>
+                <w:rFonts w:ascii="Times New Roman" w:cs="Times New Roman" w:eastAsia="Times New Roman" w:hAnsi="Times New Roman"/>
+                <w:b w:val="false"/>
+                <w:bCs w:val="false"/>
+                <w:noProof/>
+                <w:sz w:val="18"/>
+                <w:szCs w:val="18"/>
+                <w:lang w:val="vi-VN"/>
+              </w:rPr>
+              <w:t xml:space="preserve">7,98</w:t>
+            </w:r>
+          </w:p>
+        </w:tc>
+        <w:tc>
+          <w:p>
+            <w:pPr>
+              <w:jc w:val="center"/>
+            </w:pPr>
+            <w:r>
+              <w:rPr>
+                <w:rFonts w:ascii="Times New Roman" w:cs="Times New Roman" w:eastAsia="Times New Roman" w:hAnsi="Times New Roman"/>
+                <w:b w:val="false"/>
+                <w:bCs w:val="false"/>
+                <w:noProof/>
+                <w:sz w:val="18"/>
+                <w:szCs w:val="18"/>
+                <w:lang w:val="vi-VN"/>
+              </w:rPr>
+              <w:t xml:space="preserve">20,4</w:t>
+            </w:r>
+          </w:p>
+        </w:tc>
+        <w:tc>
+          <w:p>
+            <w:pPr>
+              <w:jc w:val="center"/>
+            </w:pPr>
+            <w:r>
+              <w:rPr>
+                <w:rFonts w:ascii="Times New Roman" w:cs="Times New Roman" w:eastAsia="Times New Roman" w:hAnsi="Times New Roman"/>
+                <w:b w:val="false"/>
+                <w:bCs w:val="false"/>
+                <w:noProof/>
+                <w:sz w:val="18"/>
+                <w:szCs w:val="18"/>
+                <w:lang w:val="vi-VN"/>
+              </w:rPr>
+              <w:t xml:space="preserve">112,5</w:t>
+            </w:r>
+          </w:p>
+        </w:tc>
+        <w:tc>
+          <w:p>
+            <w:pPr>
+              <w:jc w:val="center"/>
+            </w:pPr>
+            <w:r>
+              <w:rPr>
+                <w:rFonts w:ascii="Times New Roman" w:cs="Times New Roman" w:eastAsia="Times New Roman" w:hAnsi="Times New Roman"/>
+                <w:b w:val="false"/>
+                <w:bCs w:val="false"/>
+                <w:noProof/>
+                <w:sz w:val="18"/>
+                <w:szCs w:val="18"/>
+                <w:lang w:val="vi-VN"/>
+              </w:rPr>
+              <w:t xml:space="preserve">0,81</w:t>
+            </w:r>
+          </w:p>
+        </w:tc>
+        <w:tc>
+          <w:p>
+            <w:pPr>
+              <w:jc w:val="center"/>
+            </w:pPr>
+            <w:r>
+              <w:rPr>
+                <w:rFonts w:ascii="Times New Roman" w:cs="Times New Roman" w:eastAsia="Times New Roman" w:hAnsi="Times New Roman"/>
+                <w:b w:val="false"/>
+                <w:bCs w:val="false"/>
+                <w:noProof/>
+                <w:sz w:val="18"/>
+                <w:szCs w:val="18"/>
+                <w:lang w:val="vi-VN"/>
+              </w:rPr>
+              <w:t xml:space="preserve">0,51</w:t>
             </w:r>
           </w:p>
         </w:tc>
@@ -7794,7 +7795,7 @@
                 <w:szCs w:val="18"/>
                 <w:lang w:val="vi-VN"/>
               </w:rPr>
-              <w:t xml:space="preserve">0,51</w:t>
+              <w:t xml:space="preserve">0,42</w:t>
             </w:r>
           </w:p>
         </w:tc>
@@ -7875,159 +7876,159 @@
                 <w:szCs w:val="18"/>
                 <w:lang w:val="vi-VN"/>
               </w:rPr>
-              <w:t xml:space="preserve">4,00</w:t>
-            </w:r>
-          </w:p>
-        </w:tc>
-        <w:tc>
-          <w:p>
-            <w:pPr>
-              <w:jc w:val="center"/>
-            </w:pPr>
-            <w:r>
-              <w:rPr>
-                <w:rFonts w:ascii="Times New Roman" w:cs="Times New Roman" w:eastAsia="Times New Roman" w:hAnsi="Times New Roman"/>
-                <w:b w:val="false"/>
-                <w:bCs w:val="false"/>
-                <w:noProof/>
-                <w:sz w:val="18"/>
-                <w:szCs w:val="18"/>
-                <w:lang w:val="vi-VN"/>
-              </w:rPr>
-              <w:t xml:space="preserve">0,5</w:t>
-            </w:r>
-          </w:p>
-        </w:tc>
-        <w:tc>
-          <w:p>
-            <w:pPr>
-              <w:jc w:val="center"/>
-            </w:pPr>
-            <w:r>
-              <w:rPr>
-                <w:rFonts w:ascii="Times New Roman" w:cs="Times New Roman" w:eastAsia="Times New Roman" w:hAnsi="Times New Roman"/>
-                <w:b w:val="false"/>
-                <w:bCs w:val="false"/>
-                <w:noProof/>
-                <w:sz w:val="18"/>
-                <w:szCs w:val="18"/>
-                <w:lang w:val="vi-VN"/>
-              </w:rPr>
-              <w:t xml:space="preserve">7,98</w:t>
-            </w:r>
-          </w:p>
-        </w:tc>
-        <w:tc>
-          <w:p>
-            <w:pPr>
-              <w:jc w:val="center"/>
-            </w:pPr>
-            <w:r>
-              <w:rPr>
-                <w:rFonts w:ascii="Times New Roman" w:cs="Times New Roman" w:eastAsia="Times New Roman" w:hAnsi="Times New Roman"/>
-                <w:b w:val="false"/>
-                <w:bCs w:val="false"/>
-                <w:noProof/>
-                <w:sz w:val="18"/>
-                <w:szCs w:val="18"/>
-                <w:lang w:val="vi-VN"/>
-              </w:rPr>
-              <w:t xml:space="preserve">20,4</w:t>
-            </w:r>
-          </w:p>
-        </w:tc>
-        <w:tc>
-          <w:p>
-            <w:pPr>
-              <w:jc w:val="center"/>
-            </w:pPr>
-            <w:r>
-              <w:rPr>
-                <w:rFonts w:ascii="Times New Roman" w:cs="Times New Roman" w:eastAsia="Times New Roman" w:hAnsi="Times New Roman"/>
-                <w:b w:val="false"/>
-                <w:bCs w:val="false"/>
-                <w:noProof/>
-                <w:sz w:val="18"/>
-                <w:szCs w:val="18"/>
-                <w:lang w:val="vi-VN"/>
-              </w:rPr>
-              <w:t xml:space="preserve">112,5</w:t>
-            </w:r>
-          </w:p>
-        </w:tc>
-        <w:tc>
-          <w:p>
-            <w:pPr>
-              <w:jc w:val="center"/>
-            </w:pPr>
-            <w:r>
-              <w:rPr>
-                <w:rFonts w:ascii="Times New Roman" w:cs="Times New Roman" w:eastAsia="Times New Roman" w:hAnsi="Times New Roman"/>
-                <w:b w:val="false"/>
-                <w:bCs w:val="false"/>
-                <w:noProof/>
-                <w:sz w:val="18"/>
-                <w:szCs w:val="18"/>
-                <w:lang w:val="vi-VN"/>
-              </w:rPr>
-              <w:t xml:space="preserve">0,81</w:t>
-            </w:r>
-          </w:p>
-        </w:tc>
-        <w:tc>
-          <w:p>
-            <w:pPr>
-              <w:jc w:val="center"/>
-            </w:pPr>
-            <w:r>
-              <w:rPr>
-                <w:rFonts w:ascii="Times New Roman" w:cs="Times New Roman" w:eastAsia="Times New Roman" w:hAnsi="Times New Roman"/>
-                <w:b w:val="false"/>
-                <w:bCs w:val="false"/>
-                <w:noProof/>
-                <w:sz w:val="18"/>
-                <w:szCs w:val="18"/>
-                <w:lang w:val="vi-VN"/>
-              </w:rPr>
-              <w:t xml:space="preserve">0,52</w:t>
-            </w:r>
-          </w:p>
-        </w:tc>
-        <w:tc>
-          <w:p>
-            <w:pPr>
-              <w:jc w:val="center"/>
-            </w:pPr>
-            <w:r>
-              <w:rPr>
-                <w:rFonts w:ascii="Times New Roman" w:cs="Times New Roman" w:eastAsia="Times New Roman" w:hAnsi="Times New Roman"/>
-                <w:b w:val="false"/>
-                <w:bCs w:val="false"/>
-                <w:noProof/>
-                <w:sz w:val="18"/>
-                <w:szCs w:val="18"/>
-                <w:lang w:val="vi-VN"/>
-              </w:rPr>
-              <w:t xml:space="preserve">0,98</w:t>
-            </w:r>
-          </w:p>
-        </w:tc>
-        <w:tc>
-          <w:p>
-            <w:pPr>
-              <w:jc w:val="center"/>
-            </w:pPr>
-            <w:r>
-              <w:rPr>
-                <w:rFonts w:ascii="Times New Roman" w:cs="Times New Roman" w:eastAsia="Times New Roman" w:hAnsi="Times New Roman"/>
-                <w:b w:val="false"/>
-                <w:bCs w:val="false"/>
-                <w:noProof/>
-                <w:sz w:val="18"/>
-                <w:szCs w:val="18"/>
-                <w:lang w:val="vi-VN"/>
-              </w:rPr>
-              <w:t xml:space="preserve">0,40</w:t>
+              <w:t xml:space="preserve">4,75</w:t>
+            </w:r>
+          </w:p>
+        </w:tc>
+        <w:tc>
+          <w:p>
+            <w:pPr>
+              <w:jc w:val="center"/>
+            </w:pPr>
+            <w:r>
+              <w:rPr>
+                <w:rFonts w:ascii="Times New Roman" w:cs="Times New Roman" w:eastAsia="Times New Roman" w:hAnsi="Times New Roman"/>
+                <w:b w:val="false"/>
+                <w:bCs w:val="false"/>
+                <w:noProof/>
+                <w:sz w:val="18"/>
+                <w:szCs w:val="18"/>
+                <w:lang w:val="vi-VN"/>
+              </w:rPr>
+              <w:t xml:space="preserve">0,4</w:t>
+            </w:r>
+          </w:p>
+        </w:tc>
+        <w:tc>
+          <w:p>
+            <w:pPr>
+              <w:jc w:val="center"/>
+            </w:pPr>
+            <w:r>
+              <w:rPr>
+                <w:rFonts w:ascii="Times New Roman" w:cs="Times New Roman" w:eastAsia="Times New Roman" w:hAnsi="Times New Roman"/>
+                <w:b w:val="false"/>
+                <w:bCs w:val="false"/>
+                <w:noProof/>
+                <w:sz w:val="18"/>
+                <w:szCs w:val="18"/>
+                <w:lang w:val="vi-VN"/>
+              </w:rPr>
+              <w:t xml:space="preserve">9,01</w:t>
+            </w:r>
+          </w:p>
+        </w:tc>
+        <w:tc>
+          <w:p>
+            <w:pPr>
+              <w:jc w:val="center"/>
+            </w:pPr>
+            <w:r>
+              <w:rPr>
+                <w:rFonts w:ascii="Times New Roman" w:cs="Times New Roman" w:eastAsia="Times New Roman" w:hAnsi="Times New Roman"/>
+                <w:b w:val="false"/>
+                <w:bCs w:val="false"/>
+                <w:noProof/>
+                <w:sz w:val="18"/>
+                <w:szCs w:val="18"/>
+                <w:lang w:val="vi-VN"/>
+              </w:rPr>
+              <w:t xml:space="preserve">23,0</w:t>
+            </w:r>
+          </w:p>
+        </w:tc>
+        <w:tc>
+          <w:p>
+            <w:pPr>
+              <w:jc w:val="center"/>
+            </w:pPr>
+            <w:r>
+              <w:rPr>
+                <w:rFonts w:ascii="Times New Roman" w:cs="Times New Roman" w:eastAsia="Times New Roman" w:hAnsi="Times New Roman"/>
+                <w:b w:val="false"/>
+                <w:bCs w:val="false"/>
+                <w:noProof/>
+                <w:sz w:val="18"/>
+                <w:szCs w:val="18"/>
+                <w:lang w:val="vi-VN"/>
+              </w:rPr>
+              <w:t xml:space="preserve">116,8</w:t>
+            </w:r>
+          </w:p>
+        </w:tc>
+        <w:tc>
+          <w:p>
+            <w:pPr>
+              <w:jc w:val="center"/>
+            </w:pPr>
+            <w:r>
+              <w:rPr>
+                <w:rFonts w:ascii="Times New Roman" w:cs="Times New Roman" w:eastAsia="Times New Roman" w:hAnsi="Times New Roman"/>
+                <w:b w:val="false"/>
+                <w:bCs w:val="false"/>
+                <w:noProof/>
+                <w:sz w:val="18"/>
+                <w:szCs w:val="18"/>
+                <w:lang w:val="vi-VN"/>
+              </w:rPr>
+              <w:t xml:space="preserve">0,76</w:t>
+            </w:r>
+          </w:p>
+        </w:tc>
+        <w:tc>
+          <w:p>
+            <w:pPr>
+              <w:jc w:val="center"/>
+            </w:pPr>
+            <w:r>
+              <w:rPr>
+                <w:rFonts w:ascii="Times New Roman" w:cs="Times New Roman" w:eastAsia="Times New Roman" w:hAnsi="Times New Roman"/>
+                <w:b w:val="false"/>
+                <w:bCs w:val="false"/>
+                <w:noProof/>
+                <w:sz w:val="18"/>
+                <w:szCs w:val="18"/>
+                <w:lang w:val="vi-VN"/>
+              </w:rPr>
+              <w:t xml:space="preserve">0,43</w:t>
+            </w:r>
+          </w:p>
+        </w:tc>
+        <w:tc>
+          <w:p>
+            <w:pPr>
+              <w:jc w:val="center"/>
+            </w:pPr>
+            <w:r>
+              <w:rPr>
+                <w:rFonts w:ascii="Times New Roman" w:cs="Times New Roman" w:eastAsia="Times New Roman" w:hAnsi="Times New Roman"/>
+                <w:b w:val="false"/>
+                <w:bCs w:val="false"/>
+                <w:noProof/>
+                <w:sz w:val="18"/>
+                <w:szCs w:val="18"/>
+                <w:lang w:val="vi-VN"/>
+              </w:rPr>
+              <w:t xml:space="preserve">0,93</w:t>
+            </w:r>
+          </w:p>
+        </w:tc>
+        <w:tc>
+          <w:p>
+            <w:pPr>
+              <w:jc w:val="center"/>
+            </w:pPr>
+            <w:r>
+              <w:rPr>
+                <w:rFonts w:ascii="Times New Roman" w:cs="Times New Roman" w:eastAsia="Times New Roman" w:hAnsi="Times New Roman"/>
+                <w:b w:val="false"/>
+                <w:bCs w:val="false"/>
+                <w:noProof/>
+                <w:sz w:val="18"/>
+                <w:szCs w:val="18"/>
+                <w:lang w:val="vi-VN"/>
+              </w:rPr>
+              <w:t xml:space="preserve">0,04</w:t>
             </w:r>
           </w:p>
         </w:tc>
@@ -8184,83 +8185,83 @@
                 <w:szCs w:val="18"/>
                 <w:lang w:val="vi-VN"/>
               </w:rPr>
-              <w:t xml:space="preserve">109,8</w:t>
-            </w:r>
-          </w:p>
-        </w:tc>
-        <w:tc>
-          <w:p>
-            <w:pPr>
-              <w:jc w:val="center"/>
-            </w:pPr>
-            <w:r>
-              <w:rPr>
-                <w:rFonts w:ascii="Times New Roman" w:cs="Times New Roman" w:eastAsia="Times New Roman" w:hAnsi="Times New Roman"/>
-                <w:b w:val="false"/>
-                <w:bCs w:val="false"/>
-                <w:noProof/>
-                <w:sz w:val="18"/>
-                <w:szCs w:val="18"/>
-                <w:lang w:val="vi-VN"/>
-              </w:rPr>
-              <w:t xml:space="preserve">0,79</w:t>
-            </w:r>
-          </w:p>
-        </w:tc>
-        <w:tc>
-          <w:p>
-            <w:pPr>
-              <w:jc w:val="center"/>
-            </w:pPr>
-            <w:r>
-              <w:rPr>
-                <w:rFonts w:ascii="Times New Roman" w:cs="Times New Roman" w:eastAsia="Times New Roman" w:hAnsi="Times New Roman"/>
-                <w:b w:val="false"/>
-                <w:bCs w:val="false"/>
-                <w:noProof/>
-                <w:sz w:val="18"/>
-                <w:szCs w:val="18"/>
-                <w:lang w:val="vi-VN"/>
-              </w:rPr>
-              <w:t xml:space="preserve">0,51</w:t>
-            </w:r>
-          </w:p>
-        </w:tc>
-        <w:tc>
-          <w:p>
-            <w:pPr>
-              <w:jc w:val="center"/>
-            </w:pPr>
-            <w:r>
-              <w:rPr>
-                <w:rFonts w:ascii="Times New Roman" w:cs="Times New Roman" w:eastAsia="Times New Roman" w:hAnsi="Times New Roman"/>
-                <w:b w:val="false"/>
-                <w:bCs w:val="false"/>
-                <w:noProof/>
-                <w:sz w:val="18"/>
-                <w:szCs w:val="18"/>
-                <w:lang w:val="vi-VN"/>
-              </w:rPr>
-              <w:t xml:space="preserve">0,96</w:t>
-            </w:r>
-          </w:p>
-        </w:tc>
-        <w:tc>
-          <w:p>
-            <w:pPr>
-              <w:jc w:val="center"/>
-            </w:pPr>
-            <w:r>
-              <w:rPr>
-                <w:rFonts w:ascii="Times New Roman" w:cs="Times New Roman" w:eastAsia="Times New Roman" w:hAnsi="Times New Roman"/>
-                <w:b w:val="false"/>
-                <w:bCs w:val="false"/>
-                <w:noProof/>
-                <w:sz w:val="18"/>
-                <w:szCs w:val="18"/>
-                <w:lang w:val="vi-VN"/>
-              </w:rPr>
-              <w:t xml:space="preserve">0,32</w:t>
+              <w:t xml:space="preserve">113,3</w:t>
+            </w:r>
+          </w:p>
+        </w:tc>
+        <w:tc>
+          <w:p>
+            <w:pPr>
+              <w:jc w:val="center"/>
+            </w:pPr>
+            <w:r>
+              <w:rPr>
+                <w:rFonts w:ascii="Times New Roman" w:cs="Times New Roman" w:eastAsia="Times New Roman" w:hAnsi="Times New Roman"/>
+                <w:b w:val="false"/>
+                <w:bCs w:val="false"/>
+                <w:noProof/>
+                <w:sz w:val="18"/>
+                <w:szCs w:val="18"/>
+                <w:lang w:val="vi-VN"/>
+              </w:rPr>
+              <w:t xml:space="preserve">0,81</w:t>
+            </w:r>
+          </w:p>
+        </w:tc>
+        <w:tc>
+          <w:p>
+            <w:pPr>
+              <w:jc w:val="center"/>
+            </w:pPr>
+            <w:r>
+              <w:rPr>
+                <w:rFonts w:ascii="Times New Roman" w:cs="Times New Roman" w:eastAsia="Times New Roman" w:hAnsi="Times New Roman"/>
+                <w:b w:val="false"/>
+                <w:bCs w:val="false"/>
+                <w:noProof/>
+                <w:sz w:val="18"/>
+                <w:szCs w:val="18"/>
+                <w:lang w:val="vi-VN"/>
+              </w:rPr>
+              <w:t xml:space="preserve">0,53</w:t>
+            </w:r>
+          </w:p>
+        </w:tc>
+        <w:tc>
+          <w:p>
+            <w:pPr>
+              <w:jc w:val="center"/>
+            </w:pPr>
+            <w:r>
+              <w:rPr>
+                <w:rFonts w:ascii="Times New Roman" w:cs="Times New Roman" w:eastAsia="Times New Roman" w:hAnsi="Times New Roman"/>
+                <w:b w:val="false"/>
+                <w:bCs w:val="false"/>
+                <w:noProof/>
+                <w:sz w:val="18"/>
+                <w:szCs w:val="18"/>
+                <w:lang w:val="vi-VN"/>
+              </w:rPr>
+              <w:t xml:space="preserve">1,00</w:t>
+            </w:r>
+          </w:p>
+        </w:tc>
+        <w:tc>
+          <w:p>
+            <w:pPr>
+              <w:jc w:val="center"/>
+            </w:pPr>
+            <w:r>
+              <w:rPr>
+                <w:rFonts w:ascii="Times New Roman" w:cs="Times New Roman" w:eastAsia="Times New Roman" w:hAnsi="Times New Roman"/>
+                <w:b w:val="false"/>
+                <w:bCs w:val="false"/>
+                <w:noProof/>
+                <w:sz w:val="18"/>
+                <w:szCs w:val="18"/>
+                <w:lang w:val="vi-VN"/>
+              </w:rPr>
+              <w:t xml:space="preserve">0,47</w:t>
             </w:r>
           </w:p>
         </w:tc>
@@ -8574,159 +8575,159 @@
                 <w:szCs w:val="18"/>
                 <w:lang w:val="vi-VN"/>
               </w:rPr>
-              <w:t xml:space="preserve">4,25</w:t>
-            </w:r>
-          </w:p>
-        </w:tc>
-        <w:tc>
-          <w:p>
-            <w:pPr>
-              <w:jc w:val="center"/>
-            </w:pPr>
-            <w:r>
-              <w:rPr>
-                <w:rFonts w:ascii="Times New Roman" w:cs="Times New Roman" w:eastAsia="Times New Roman" w:hAnsi="Times New Roman"/>
-                <w:b w:val="false"/>
-                <w:bCs w:val="false"/>
-                <w:noProof/>
-                <w:sz w:val="18"/>
-                <w:szCs w:val="18"/>
-                <w:lang w:val="vi-VN"/>
-              </w:rPr>
-              <w:t xml:space="preserve">0,4</w:t>
-            </w:r>
-          </w:p>
-        </w:tc>
-        <w:tc>
-          <w:p>
-            <w:pPr>
-              <w:jc w:val="center"/>
-            </w:pPr>
-            <w:r>
-              <w:rPr>
-                <w:rFonts w:ascii="Times New Roman" w:cs="Times New Roman" w:eastAsia="Times New Roman" w:hAnsi="Times New Roman"/>
-                <w:b w:val="false"/>
-                <w:bCs w:val="false"/>
-                <w:noProof/>
-                <w:sz w:val="18"/>
-                <w:szCs w:val="18"/>
-                <w:lang w:val="vi-VN"/>
-              </w:rPr>
-              <w:t xml:space="preserve">7,21</w:t>
-            </w:r>
-          </w:p>
-        </w:tc>
-        <w:tc>
-          <w:p>
-            <w:pPr>
-              <w:jc w:val="center"/>
-            </w:pPr>
-            <w:r>
-              <w:rPr>
-                <w:rFonts w:ascii="Times New Roman" w:cs="Times New Roman" w:eastAsia="Times New Roman" w:hAnsi="Times New Roman"/>
-                <w:b w:val="false"/>
-                <w:bCs w:val="false"/>
-                <w:noProof/>
-                <w:sz w:val="18"/>
-                <w:szCs w:val="18"/>
-                <w:lang w:val="vi-VN"/>
-              </w:rPr>
-              <w:t xml:space="preserve">18,4</w:t>
-            </w:r>
-          </w:p>
-        </w:tc>
-        <w:tc>
-          <w:p>
-            <w:pPr>
-              <w:jc w:val="center"/>
-            </w:pPr>
-            <w:r>
-              <w:rPr>
-                <w:rFonts w:ascii="Times New Roman" w:cs="Times New Roman" w:eastAsia="Times New Roman" w:hAnsi="Times New Roman"/>
-                <w:b w:val="false"/>
-                <w:bCs w:val="false"/>
-                <w:noProof/>
-                <w:sz w:val="18"/>
-                <w:szCs w:val="18"/>
-                <w:lang w:val="vi-VN"/>
-              </w:rPr>
-              <w:t xml:space="preserve">107,1</w:t>
-            </w:r>
-          </w:p>
-        </w:tc>
-        <w:tc>
-          <w:p>
-            <w:pPr>
-              <w:jc w:val="center"/>
-            </w:pPr>
-            <w:r>
-              <w:rPr>
-                <w:rFonts w:ascii="Times New Roman" w:cs="Times New Roman" w:eastAsia="Times New Roman" w:hAnsi="Times New Roman"/>
-                <w:b w:val="false"/>
-                <w:bCs w:val="false"/>
-                <w:noProof/>
-                <w:sz w:val="18"/>
-                <w:szCs w:val="18"/>
-                <w:lang w:val="vi-VN"/>
-              </w:rPr>
-              <w:t xml:space="preserve">0,83</w:t>
-            </w:r>
-          </w:p>
-        </w:tc>
-        <w:tc>
-          <w:p>
-            <w:pPr>
-              <w:jc w:val="center"/>
-            </w:pPr>
-            <w:r>
-              <w:rPr>
-                <w:rFonts w:ascii="Times New Roman" w:cs="Times New Roman" w:eastAsia="Times New Roman" w:hAnsi="Times New Roman"/>
-                <w:b w:val="false"/>
-                <w:bCs w:val="false"/>
-                <w:noProof/>
-                <w:sz w:val="18"/>
-                <w:szCs w:val="18"/>
-                <w:lang w:val="vi-VN"/>
-              </w:rPr>
-              <w:t xml:space="preserve">0,44</w:t>
-            </w:r>
-          </w:p>
-        </w:tc>
-        <w:tc>
-          <w:p>
-            <w:pPr>
-              <w:jc w:val="center"/>
-            </w:pPr>
-            <w:r>
-              <w:rPr>
-                <w:rFonts w:ascii="Times New Roman" w:cs="Times New Roman" w:eastAsia="Times New Roman" w:hAnsi="Times New Roman"/>
-                <w:b w:val="false"/>
-                <w:bCs w:val="false"/>
-                <w:noProof/>
-                <w:sz w:val="18"/>
-                <w:szCs w:val="18"/>
-                <w:lang w:val="vi-VN"/>
-              </w:rPr>
-              <w:t xml:space="preserve">0,98</w:t>
-            </w:r>
-          </w:p>
-        </w:tc>
-        <w:tc>
-          <w:p>
-            <w:pPr>
-              <w:jc w:val="center"/>
-            </w:pPr>
-            <w:r>
-              <w:rPr>
-                <w:rFonts w:ascii="Times New Roman" w:cs="Times New Roman" w:eastAsia="Times New Roman" w:hAnsi="Times New Roman"/>
-                <w:b w:val="false"/>
-                <w:bCs w:val="false"/>
-                <w:noProof/>
-                <w:sz w:val="18"/>
-                <w:szCs w:val="18"/>
-                <w:lang w:val="vi-VN"/>
-              </w:rPr>
-              <w:t xml:space="preserve">0,49</w:t>
+              <w:t xml:space="preserve">4,00</w:t>
+            </w:r>
+          </w:p>
+        </w:tc>
+        <w:tc>
+          <w:p>
+            <w:pPr>
+              <w:jc w:val="center"/>
+            </w:pPr>
+            <w:r>
+              <w:rPr>
+                <w:rFonts w:ascii="Times New Roman" w:cs="Times New Roman" w:eastAsia="Times New Roman" w:hAnsi="Times New Roman"/>
+                <w:b w:val="false"/>
+                <w:bCs w:val="false"/>
+                <w:noProof/>
+                <w:sz w:val="18"/>
+                <w:szCs w:val="18"/>
+                <w:lang w:val="vi-VN"/>
+              </w:rPr>
+              <w:t xml:space="preserve">0,5</w:t>
+            </w:r>
+          </w:p>
+        </w:tc>
+        <w:tc>
+          <w:p>
+            <w:pPr>
+              <w:jc w:val="center"/>
+            </w:pPr>
+            <w:r>
+              <w:rPr>
+                <w:rFonts w:ascii="Times New Roman" w:cs="Times New Roman" w:eastAsia="Times New Roman" w:hAnsi="Times New Roman"/>
+                <w:b w:val="false"/>
+                <w:bCs w:val="false"/>
+                <w:noProof/>
+                <w:sz w:val="18"/>
+                <w:szCs w:val="18"/>
+                <w:lang w:val="vi-VN"/>
+              </w:rPr>
+              <w:t xml:space="preserve">7,98</w:t>
+            </w:r>
+          </w:p>
+        </w:tc>
+        <w:tc>
+          <w:p>
+            <w:pPr>
+              <w:jc w:val="center"/>
+            </w:pPr>
+            <w:r>
+              <w:rPr>
+                <w:rFonts w:ascii="Times New Roman" w:cs="Times New Roman" w:eastAsia="Times New Roman" w:hAnsi="Times New Roman"/>
+                <w:b w:val="false"/>
+                <w:bCs w:val="false"/>
+                <w:noProof/>
+                <w:sz w:val="18"/>
+                <w:szCs w:val="18"/>
+                <w:lang w:val="vi-VN"/>
+              </w:rPr>
+              <w:t xml:space="preserve">20,4</w:t>
+            </w:r>
+          </w:p>
+        </w:tc>
+        <w:tc>
+          <w:p>
+            <w:pPr>
+              <w:jc w:val="center"/>
+            </w:pPr>
+            <w:r>
+              <w:rPr>
+                <w:rFonts w:ascii="Times New Roman" w:cs="Times New Roman" w:eastAsia="Times New Roman" w:hAnsi="Times New Roman"/>
+                <w:b w:val="false"/>
+                <w:bCs w:val="false"/>
+                <w:noProof/>
+                <w:sz w:val="18"/>
+                <w:szCs w:val="18"/>
+                <w:lang w:val="vi-VN"/>
+              </w:rPr>
+              <w:t xml:space="preserve">111,2</w:t>
+            </w:r>
+          </w:p>
+        </w:tc>
+        <w:tc>
+          <w:p>
+            <w:pPr>
+              <w:jc w:val="center"/>
+            </w:pPr>
+            <w:r>
+              <w:rPr>
+                <w:rFonts w:ascii="Times New Roman" w:cs="Times New Roman" w:eastAsia="Times New Roman" w:hAnsi="Times New Roman"/>
+                <w:b w:val="false"/>
+                <w:bCs w:val="false"/>
+                <w:noProof/>
+                <w:sz w:val="18"/>
+                <w:szCs w:val="18"/>
+                <w:lang w:val="vi-VN"/>
+              </w:rPr>
+              <w:t xml:space="preserve">0,80</w:t>
+            </w:r>
+          </w:p>
+        </w:tc>
+        <w:tc>
+          <w:p>
+            <w:pPr>
+              <w:jc w:val="center"/>
+            </w:pPr>
+            <w:r>
+              <w:rPr>
+                <w:rFonts w:ascii="Times New Roman" w:cs="Times New Roman" w:eastAsia="Times New Roman" w:hAnsi="Times New Roman"/>
+                <w:b w:val="false"/>
+                <w:bCs w:val="false"/>
+                <w:noProof/>
+                <w:sz w:val="18"/>
+                <w:szCs w:val="18"/>
+                <w:lang w:val="vi-VN"/>
+              </w:rPr>
+              <w:t xml:space="preserve">0,51</w:t>
+            </w:r>
+          </w:p>
+        </w:tc>
+        <w:tc>
+          <w:p>
+            <w:pPr>
+              <w:jc w:val="center"/>
+            </w:pPr>
+            <w:r>
+              <w:rPr>
+                <w:rFonts w:ascii="Times New Roman" w:cs="Times New Roman" w:eastAsia="Times New Roman" w:hAnsi="Times New Roman"/>
+                <w:b w:val="false"/>
+                <w:bCs w:val="false"/>
+                <w:noProof/>
+                <w:sz w:val="18"/>
+                <w:szCs w:val="18"/>
+                <w:lang w:val="vi-VN"/>
+              </w:rPr>
+              <w:t xml:space="preserve">0,97</w:t>
+            </w:r>
+          </w:p>
+        </w:tc>
+        <w:tc>
+          <w:p>
+            <w:pPr>
+              <w:jc w:val="center"/>
+            </w:pPr>
+            <w:r>
+              <w:rPr>
+                <w:rFonts w:ascii="Times New Roman" w:cs="Times New Roman" w:eastAsia="Times New Roman" w:hAnsi="Times New Roman"/>
+                <w:b w:val="false"/>
+                <w:bCs w:val="false"/>
+                <w:noProof/>
+                <w:sz w:val="18"/>
+                <w:szCs w:val="18"/>
+                <w:lang w:val="vi-VN"/>
+              </w:rPr>
+              <w:t xml:space="preserve">0,36</w:t>
             </w:r>
           </w:p>
         </w:tc>
@@ -8807,159 +8808,159 @@
                 <w:szCs w:val="18"/>
                 <w:lang w:val="vi-VN"/>
               </w:rPr>
-              <w:t xml:space="preserve">4,00</w:t>
-            </w:r>
-          </w:p>
-        </w:tc>
-        <w:tc>
-          <w:p>
-            <w:pPr>
-              <w:jc w:val="center"/>
-            </w:pPr>
-            <w:r>
-              <w:rPr>
-                <w:rFonts w:ascii="Times New Roman" w:cs="Times New Roman" w:eastAsia="Times New Roman" w:hAnsi="Times New Roman"/>
-                <w:b w:val="false"/>
-                <w:bCs w:val="false"/>
-                <w:noProof/>
-                <w:sz w:val="18"/>
-                <w:szCs w:val="18"/>
-                <w:lang w:val="vi-VN"/>
-              </w:rPr>
-              <w:t xml:space="preserve">0,5</w:t>
-            </w:r>
-          </w:p>
-        </w:tc>
-        <w:tc>
-          <w:p>
-            <w:pPr>
-              <w:jc w:val="center"/>
-            </w:pPr>
-            <w:r>
-              <w:rPr>
-                <w:rFonts w:ascii="Times New Roman" w:cs="Times New Roman" w:eastAsia="Times New Roman" w:hAnsi="Times New Roman"/>
-                <w:b w:val="false"/>
-                <w:bCs w:val="false"/>
-                <w:noProof/>
-                <w:sz w:val="18"/>
-                <w:szCs w:val="18"/>
-                <w:lang w:val="vi-VN"/>
-              </w:rPr>
-              <w:t xml:space="preserve">7,98</w:t>
-            </w:r>
-          </w:p>
-        </w:tc>
-        <w:tc>
-          <w:p>
-            <w:pPr>
-              <w:jc w:val="center"/>
-            </w:pPr>
-            <w:r>
-              <w:rPr>
-                <w:rFonts w:ascii="Times New Roman" w:cs="Times New Roman" w:eastAsia="Times New Roman" w:hAnsi="Times New Roman"/>
-                <w:b w:val="false"/>
-                <w:bCs w:val="false"/>
-                <w:noProof/>
-                <w:sz w:val="18"/>
-                <w:szCs w:val="18"/>
-                <w:lang w:val="vi-VN"/>
-              </w:rPr>
-              <w:t xml:space="preserve">20,4</w:t>
-            </w:r>
-          </w:p>
-        </w:tc>
-        <w:tc>
-          <w:p>
-            <w:pPr>
-              <w:jc w:val="center"/>
-            </w:pPr>
-            <w:r>
-              <w:rPr>
-                <w:rFonts w:ascii="Times New Roman" w:cs="Times New Roman" w:eastAsia="Times New Roman" w:hAnsi="Times New Roman"/>
-                <w:b w:val="false"/>
-                <w:bCs w:val="false"/>
-                <w:noProof/>
-                <w:sz w:val="18"/>
-                <w:szCs w:val="18"/>
-                <w:lang w:val="vi-VN"/>
-              </w:rPr>
-              <w:t xml:space="preserve">109,9</w:t>
-            </w:r>
-          </w:p>
-        </w:tc>
-        <w:tc>
-          <w:p>
-            <w:pPr>
-              <w:jc w:val="center"/>
-            </w:pPr>
-            <w:r>
-              <w:rPr>
-                <w:rFonts w:ascii="Times New Roman" w:cs="Times New Roman" w:eastAsia="Times New Roman" w:hAnsi="Times New Roman"/>
-                <w:b w:val="false"/>
-                <w:bCs w:val="false"/>
-                <w:noProof/>
-                <w:sz w:val="18"/>
-                <w:szCs w:val="18"/>
-                <w:lang w:val="vi-VN"/>
-              </w:rPr>
-              <w:t xml:space="preserve">0,79</w:t>
-            </w:r>
-          </w:p>
-        </w:tc>
-        <w:tc>
-          <w:p>
-            <w:pPr>
-              <w:jc w:val="center"/>
-            </w:pPr>
-            <w:r>
-              <w:rPr>
-                <w:rFonts w:ascii="Times New Roman" w:cs="Times New Roman" w:eastAsia="Times New Roman" w:hAnsi="Times New Roman"/>
-                <w:b w:val="false"/>
-                <w:bCs w:val="false"/>
-                <w:noProof/>
-                <w:sz w:val="18"/>
-                <w:szCs w:val="18"/>
-                <w:lang w:val="vi-VN"/>
-              </w:rPr>
-              <w:t xml:space="preserve">0,50</w:t>
-            </w:r>
-          </w:p>
-        </w:tc>
-        <w:tc>
-          <w:p>
-            <w:pPr>
-              <w:jc w:val="center"/>
-            </w:pPr>
-            <w:r>
-              <w:rPr>
-                <w:rFonts w:ascii="Times New Roman" w:cs="Times New Roman" w:eastAsia="Times New Roman" w:hAnsi="Times New Roman"/>
-                <w:b w:val="false"/>
-                <w:bCs w:val="false"/>
-                <w:noProof/>
-                <w:sz w:val="18"/>
-                <w:szCs w:val="18"/>
-                <w:lang w:val="vi-VN"/>
-              </w:rPr>
-              <w:t xml:space="preserve">0,96</w:t>
-            </w:r>
-          </w:p>
-        </w:tc>
-        <w:tc>
-          <w:p>
-            <w:pPr>
-              <w:jc w:val="center"/>
-            </w:pPr>
-            <w:r>
-              <w:rPr>
-                <w:rFonts w:ascii="Times New Roman" w:cs="Times New Roman" w:eastAsia="Times New Roman" w:hAnsi="Times New Roman"/>
-                <w:b w:val="false"/>
-                <w:bCs w:val="false"/>
-                <w:noProof/>
-                <w:sz w:val="18"/>
-                <w:szCs w:val="18"/>
-                <w:lang w:val="vi-VN"/>
-              </w:rPr>
-              <w:t xml:space="preserve">0,31</w:t>
+              <w:t xml:space="preserve">4,50</w:t>
+            </w:r>
+          </w:p>
+        </w:tc>
+        <w:tc>
+          <w:p>
+            <w:pPr>
+              <w:jc w:val="center"/>
+            </w:pPr>
+            <w:r>
+              <w:rPr>
+                <w:rFonts w:ascii="Times New Roman" w:cs="Times New Roman" w:eastAsia="Times New Roman" w:hAnsi="Times New Roman"/>
+                <w:b w:val="false"/>
+                <w:bCs w:val="false"/>
+                <w:noProof/>
+                <w:sz w:val="18"/>
+                <w:szCs w:val="18"/>
+                <w:lang w:val="vi-VN"/>
+              </w:rPr>
+              <w:t xml:space="preserve">0,4</w:t>
+            </w:r>
+          </w:p>
+        </w:tc>
+        <w:tc>
+          <w:p>
+            <w:pPr>
+              <w:jc w:val="center"/>
+            </w:pPr>
+            <w:r>
+              <w:rPr>
+                <w:rFonts w:ascii="Times New Roman" w:cs="Times New Roman" w:eastAsia="Times New Roman" w:hAnsi="Times New Roman"/>
+                <w:b w:val="false"/>
+                <w:bCs w:val="false"/>
+                <w:noProof/>
+                <w:sz w:val="18"/>
+                <w:szCs w:val="18"/>
+                <w:lang w:val="vi-VN"/>
+              </w:rPr>
+              <w:t xml:space="preserve">8,08</w:t>
+            </w:r>
+          </w:p>
+        </w:tc>
+        <w:tc>
+          <w:p>
+            <w:pPr>
+              <w:jc w:val="center"/>
+            </w:pPr>
+            <w:r>
+              <w:rPr>
+                <w:rFonts w:ascii="Times New Roman" w:cs="Times New Roman" w:eastAsia="Times New Roman" w:hAnsi="Times New Roman"/>
+                <w:b w:val="false"/>
+                <w:bCs w:val="false"/>
+                <w:noProof/>
+                <w:sz w:val="18"/>
+                <w:szCs w:val="18"/>
+                <w:lang w:val="vi-VN"/>
+              </w:rPr>
+              <w:t xml:space="preserve">20,6</w:t>
+            </w:r>
+          </w:p>
+        </w:tc>
+        <w:tc>
+          <w:p>
+            <w:pPr>
+              <w:jc w:val="center"/>
+            </w:pPr>
+            <w:r>
+              <w:rPr>
+                <w:rFonts w:ascii="Times New Roman" w:cs="Times New Roman" w:eastAsia="Times New Roman" w:hAnsi="Times New Roman"/>
+                <w:b w:val="false"/>
+                <w:bCs w:val="false"/>
+                <w:noProof/>
+                <w:sz w:val="18"/>
+                <w:szCs w:val="18"/>
+                <w:lang w:val="vi-VN"/>
+              </w:rPr>
+              <w:t xml:space="preserve">114,1</w:t>
+            </w:r>
+          </w:p>
+        </w:tc>
+        <w:tc>
+          <w:p>
+            <w:pPr>
+              <w:jc w:val="center"/>
+            </w:pPr>
+            <w:r>
+              <w:rPr>
+                <w:rFonts w:ascii="Times New Roman" w:cs="Times New Roman" w:eastAsia="Times New Roman" w:hAnsi="Times New Roman"/>
+                <w:b w:val="false"/>
+                <w:bCs w:val="false"/>
+                <w:noProof/>
+                <w:sz w:val="18"/>
+                <w:szCs w:val="18"/>
+                <w:lang w:val="vi-VN"/>
+              </w:rPr>
+              <w:t xml:space="preserve">0,81</w:t>
+            </w:r>
+          </w:p>
+        </w:tc>
+        <w:tc>
+          <w:p>
+            <w:pPr>
+              <w:jc w:val="center"/>
+            </w:pPr>
+            <w:r>
+              <w:rPr>
+                <w:rFonts w:ascii="Times New Roman" w:cs="Times New Roman" w:eastAsia="Times New Roman" w:hAnsi="Times New Roman"/>
+                <w:b w:val="false"/>
+                <w:bCs w:val="false"/>
+                <w:noProof/>
+                <w:sz w:val="18"/>
+                <w:szCs w:val="18"/>
+                <w:lang w:val="vi-VN"/>
+              </w:rPr>
+              <w:t xml:space="preserve">0,45</w:t>
+            </w:r>
+          </w:p>
+        </w:tc>
+        <w:tc>
+          <w:p>
+            <w:pPr>
+              <w:jc w:val="center"/>
+            </w:pPr>
+            <w:r>
+              <w:rPr>
+                <w:rFonts w:ascii="Times New Roman" w:cs="Times New Roman" w:eastAsia="Times New Roman" w:hAnsi="Times New Roman"/>
+                <w:b w:val="false"/>
+                <w:bCs w:val="false"/>
+                <w:noProof/>
+                <w:sz w:val="18"/>
+                <w:szCs w:val="18"/>
+                <w:lang w:val="vi-VN"/>
+              </w:rPr>
+              <w:t xml:space="preserve">0,98</w:t>
+            </w:r>
+          </w:p>
+        </w:tc>
+        <w:tc>
+          <w:p>
+            <w:pPr>
+              <w:jc w:val="center"/>
+            </w:pPr>
+            <w:r>
+              <w:rPr>
+                <w:rFonts w:ascii="Times New Roman" w:cs="Times New Roman" w:eastAsia="Times New Roman" w:hAnsi="Times New Roman"/>
+                <w:b w:val="false"/>
+                <w:bCs w:val="false"/>
+                <w:noProof/>
+                <w:sz w:val="18"/>
+                <w:szCs w:val="18"/>
+                <w:lang w:val="vi-VN"/>
+              </w:rPr>
+              <w:t xml:space="preserve">0,37</w:t>
             </w:r>
           </w:p>
         </w:tc>
@@ -9040,159 +9041,159 @@
                 <w:szCs w:val="18"/>
                 <w:lang w:val="vi-VN"/>
               </w:rPr>
-              <w:t xml:space="preserve">4,25</w:t>
-            </w:r>
-          </w:p>
-        </w:tc>
-        <w:tc>
-          <w:p>
-            <w:pPr>
-              <w:jc w:val="center"/>
-            </w:pPr>
-            <w:r>
-              <w:rPr>
-                <w:rFonts w:ascii="Times New Roman" w:cs="Times New Roman" w:eastAsia="Times New Roman" w:hAnsi="Times New Roman"/>
-                <w:b w:val="false"/>
-                <w:bCs w:val="false"/>
-                <w:noProof/>
-                <w:sz w:val="18"/>
-                <w:szCs w:val="18"/>
-                <w:lang w:val="vi-VN"/>
-              </w:rPr>
-              <w:t xml:space="preserve">0,4</w:t>
-            </w:r>
-          </w:p>
-        </w:tc>
-        <w:tc>
-          <w:p>
-            <w:pPr>
-              <w:jc w:val="center"/>
-            </w:pPr>
-            <w:r>
-              <w:rPr>
-                <w:rFonts w:ascii="Times New Roman" w:cs="Times New Roman" w:eastAsia="Times New Roman" w:hAnsi="Times New Roman"/>
-                <w:b w:val="false"/>
-                <w:bCs w:val="false"/>
-                <w:noProof/>
-                <w:sz w:val="18"/>
-                <w:szCs w:val="18"/>
-                <w:lang w:val="vi-VN"/>
-              </w:rPr>
-              <w:t xml:space="preserve">7,21</w:t>
-            </w:r>
-          </w:p>
-        </w:tc>
-        <w:tc>
-          <w:p>
-            <w:pPr>
-              <w:jc w:val="center"/>
-            </w:pPr>
-            <w:r>
-              <w:rPr>
-                <w:rFonts w:ascii="Times New Roman" w:cs="Times New Roman" w:eastAsia="Times New Roman" w:hAnsi="Times New Roman"/>
-                <w:b w:val="false"/>
-                <w:bCs w:val="false"/>
-                <w:noProof/>
-                <w:sz w:val="18"/>
-                <w:szCs w:val="18"/>
-                <w:lang w:val="vi-VN"/>
-              </w:rPr>
-              <w:t xml:space="preserve">18,4</w:t>
-            </w:r>
-          </w:p>
-        </w:tc>
-        <w:tc>
-          <w:p>
-            <w:pPr>
-              <w:jc w:val="center"/>
-            </w:pPr>
-            <w:r>
-              <w:rPr>
-                <w:rFonts w:ascii="Times New Roman" w:cs="Times New Roman" w:eastAsia="Times New Roman" w:hAnsi="Times New Roman"/>
-                <w:b w:val="false"/>
-                <w:bCs w:val="false"/>
-                <w:noProof/>
-                <w:sz w:val="18"/>
-                <w:szCs w:val="18"/>
-                <w:lang w:val="vi-VN"/>
-              </w:rPr>
-              <w:t xml:space="preserve">105,8</w:t>
-            </w:r>
-          </w:p>
-        </w:tc>
-        <w:tc>
-          <w:p>
-            <w:pPr>
-              <w:jc w:val="center"/>
-            </w:pPr>
-            <w:r>
-              <w:rPr>
-                <w:rFonts w:ascii="Times New Roman" w:cs="Times New Roman" w:eastAsia="Times New Roman" w:hAnsi="Times New Roman"/>
-                <w:b w:val="false"/>
-                <w:bCs w:val="false"/>
-                <w:noProof/>
-                <w:sz w:val="18"/>
-                <w:szCs w:val="18"/>
-                <w:lang w:val="vi-VN"/>
-              </w:rPr>
-              <w:t xml:space="preserve">0,82</w:t>
-            </w:r>
-          </w:p>
-        </w:tc>
-        <w:tc>
-          <w:p>
-            <w:pPr>
-              <w:jc w:val="center"/>
-            </w:pPr>
-            <w:r>
-              <w:rPr>
-                <w:rFonts w:ascii="Times New Roman" w:cs="Times New Roman" w:eastAsia="Times New Roman" w:hAnsi="Times New Roman"/>
-                <w:b w:val="false"/>
-                <w:bCs w:val="false"/>
-                <w:noProof/>
-                <w:sz w:val="18"/>
-                <w:szCs w:val="18"/>
-                <w:lang w:val="vi-VN"/>
-              </w:rPr>
-              <w:t xml:space="preserve">0,43</w:t>
-            </w:r>
-          </w:p>
-        </w:tc>
-        <w:tc>
-          <w:p>
-            <w:pPr>
-              <w:jc w:val="center"/>
-            </w:pPr>
-            <w:r>
-              <w:rPr>
-                <w:rFonts w:ascii="Times New Roman" w:cs="Times New Roman" w:eastAsia="Times New Roman" w:hAnsi="Times New Roman"/>
-                <w:b w:val="false"/>
-                <w:bCs w:val="false"/>
-                <w:noProof/>
-                <w:sz w:val="18"/>
-                <w:szCs w:val="18"/>
-                <w:lang w:val="vi-VN"/>
-              </w:rPr>
-              <w:t xml:space="preserve">0,97</w:t>
-            </w:r>
-          </w:p>
-        </w:tc>
-        <w:tc>
-          <w:p>
-            <w:pPr>
-              <w:jc w:val="center"/>
-            </w:pPr>
-            <w:r>
-              <w:rPr>
-                <w:rFonts w:ascii="Times New Roman" w:cs="Times New Roman" w:eastAsia="Times New Roman" w:hAnsi="Times New Roman"/>
-                <w:b w:val="false"/>
-                <w:bCs w:val="false"/>
-                <w:noProof/>
-                <w:sz w:val="18"/>
-                <w:szCs w:val="18"/>
-                <w:lang w:val="vi-VN"/>
-              </w:rPr>
-              <w:t xml:space="preserve">0,45</w:t>
+              <w:t xml:space="preserve">4,00</w:t>
+            </w:r>
+          </w:p>
+        </w:tc>
+        <w:tc>
+          <w:p>
+            <w:pPr>
+              <w:jc w:val="center"/>
+            </w:pPr>
+            <w:r>
+              <w:rPr>
+                <w:rFonts w:ascii="Times New Roman" w:cs="Times New Roman" w:eastAsia="Times New Roman" w:hAnsi="Times New Roman"/>
+                <w:b w:val="false"/>
+                <w:bCs w:val="false"/>
+                <w:noProof/>
+                <w:sz w:val="18"/>
+                <w:szCs w:val="18"/>
+                <w:lang w:val="vi-VN"/>
+              </w:rPr>
+              <w:t xml:space="preserve">0,5</w:t>
+            </w:r>
+          </w:p>
+        </w:tc>
+        <w:tc>
+          <w:p>
+            <w:pPr>
+              <w:jc w:val="center"/>
+            </w:pPr>
+            <w:r>
+              <w:rPr>
+                <w:rFonts w:ascii="Times New Roman" w:cs="Times New Roman" w:eastAsia="Times New Roman" w:hAnsi="Times New Roman"/>
+                <w:b w:val="false"/>
+                <w:bCs w:val="false"/>
+                <w:noProof/>
+                <w:sz w:val="18"/>
+                <w:szCs w:val="18"/>
+                <w:lang w:val="vi-VN"/>
+              </w:rPr>
+              <w:t xml:space="preserve">7,98</w:t>
+            </w:r>
+          </w:p>
+        </w:tc>
+        <w:tc>
+          <w:p>
+            <w:pPr>
+              <w:jc w:val="center"/>
+            </w:pPr>
+            <w:r>
+              <w:rPr>
+                <w:rFonts w:ascii="Times New Roman" w:cs="Times New Roman" w:eastAsia="Times New Roman" w:hAnsi="Times New Roman"/>
+                <w:b w:val="false"/>
+                <w:bCs w:val="false"/>
+                <w:noProof/>
+                <w:sz w:val="18"/>
+                <w:szCs w:val="18"/>
+                <w:lang w:val="vi-VN"/>
+              </w:rPr>
+              <w:t xml:space="preserve">20,4</w:t>
+            </w:r>
+          </w:p>
+        </w:tc>
+        <w:tc>
+          <w:p>
+            <w:pPr>
+              <w:jc w:val="center"/>
+            </w:pPr>
+            <w:r>
+              <w:rPr>
+                <w:rFonts w:ascii="Times New Roman" w:cs="Times New Roman" w:eastAsia="Times New Roman" w:hAnsi="Times New Roman"/>
+                <w:b w:val="false"/>
+                <w:bCs w:val="false"/>
+                <w:noProof/>
+                <w:sz w:val="18"/>
+                <w:szCs w:val="18"/>
+                <w:lang w:val="vi-VN"/>
+              </w:rPr>
+              <w:t xml:space="preserve">109,8</w:t>
+            </w:r>
+          </w:p>
+        </w:tc>
+        <w:tc>
+          <w:p>
+            <w:pPr>
+              <w:jc w:val="center"/>
+            </w:pPr>
+            <w:r>
+              <w:rPr>
+                <w:rFonts w:ascii="Times New Roman" w:cs="Times New Roman" w:eastAsia="Times New Roman" w:hAnsi="Times New Roman"/>
+                <w:b w:val="false"/>
+                <w:bCs w:val="false"/>
+                <w:noProof/>
+                <w:sz w:val="18"/>
+                <w:szCs w:val="18"/>
+                <w:lang w:val="vi-VN"/>
+              </w:rPr>
+              <w:t xml:space="preserve">0,79</w:t>
+            </w:r>
+          </w:p>
+        </w:tc>
+        <w:tc>
+          <w:p>
+            <w:pPr>
+              <w:jc w:val="center"/>
+            </w:pPr>
+            <w:r>
+              <w:rPr>
+                <w:rFonts w:ascii="Times New Roman" w:cs="Times New Roman" w:eastAsia="Times New Roman" w:hAnsi="Times New Roman"/>
+                <w:b w:val="false"/>
+                <w:bCs w:val="false"/>
+                <w:noProof/>
+                <w:sz w:val="18"/>
+                <w:szCs w:val="18"/>
+                <w:lang w:val="vi-VN"/>
+              </w:rPr>
+              <w:t xml:space="preserve">0,50</w:t>
+            </w:r>
+          </w:p>
+        </w:tc>
+        <w:tc>
+          <w:p>
+            <w:pPr>
+              <w:jc w:val="center"/>
+            </w:pPr>
+            <w:r>
+              <w:rPr>
+                <w:rFonts w:ascii="Times New Roman" w:cs="Times New Roman" w:eastAsia="Times New Roman" w:hAnsi="Times New Roman"/>
+                <w:b w:val="false"/>
+                <w:bCs w:val="false"/>
+                <w:noProof/>
+                <w:sz w:val="18"/>
+                <w:szCs w:val="18"/>
+                <w:lang w:val="vi-VN"/>
+              </w:rPr>
+              <w:t xml:space="preserve">0,96</w:t>
+            </w:r>
+          </w:p>
+        </w:tc>
+        <w:tc>
+          <w:p>
+            <w:pPr>
+              <w:jc w:val="center"/>
+            </w:pPr>
+            <w:r>
+              <w:rPr>
+                <w:rFonts w:ascii="Times New Roman" w:cs="Times New Roman" w:eastAsia="Times New Roman" w:hAnsi="Times New Roman"/>
+                <w:b w:val="false"/>
+                <w:bCs w:val="false"/>
+                <w:noProof/>
+                <w:sz w:val="18"/>
+                <w:szCs w:val="18"/>
+                <w:lang w:val="vi-VN"/>
+              </w:rPr>
+              <w:t xml:space="preserve">0,31</w:t>
             </w:r>
           </w:p>
         </w:tc>
@@ -9506,7 +9507,7 @@
                 <w:szCs w:val="18"/>
                 <w:lang w:val="vi-VN"/>
               </w:rPr>
-              <w:t xml:space="preserve">2,75</w:t>
+              <w:t xml:space="preserve">3,00</w:t>
             </w:r>
           </w:p>
         </w:tc>
@@ -9544,83 +9545,64 @@
                 <w:szCs w:val="18"/>
                 <w:lang w:val="vi-VN"/>
               </w:rPr>
-              <w:t xml:space="preserve">3,01</w:t>
-            </w:r>
-          </w:p>
-        </w:tc>
-        <w:tc>
-          <w:p>
-            <w:pPr>
-              <w:jc w:val="center"/>
-            </w:pPr>
-            <w:r>
-              <w:rPr>
-                <w:rFonts w:ascii="Times New Roman" w:cs="Times New Roman" w:eastAsia="Times New Roman" w:hAnsi="Times New Roman"/>
-                <w:b w:val="false"/>
-                <w:bCs w:val="false"/>
-                <w:noProof/>
-                <w:sz w:val="18"/>
-                <w:szCs w:val="18"/>
-                <w:lang w:val="vi-VN"/>
-              </w:rPr>
-              <w:t xml:space="preserve">7,7</w:t>
-            </w:r>
-          </w:p>
-        </w:tc>
-        <w:tc>
-          <w:p>
-            <w:pPr>
-              <w:jc w:val="center"/>
-            </w:pPr>
-            <w:r>
-              <w:rPr>
-                <w:rFonts w:ascii="Times New Roman" w:cs="Times New Roman" w:eastAsia="Times New Roman" w:hAnsi="Times New Roman"/>
-                <w:b w:val="false"/>
-                <w:bCs w:val="false"/>
-                <w:noProof/>
-                <w:sz w:val="18"/>
-                <w:szCs w:val="18"/>
-                <w:lang w:val="vi-VN"/>
-              </w:rPr>
-              <w:t xml:space="preserve">48,9</w:t>
-            </w:r>
-          </w:p>
-        </w:tc>
-        <w:tc>
-          <w:p>
-            <w:pPr>
-              <w:jc w:val="center"/>
-            </w:pPr>
-            <w:r>
-              <w:rPr>
-                <w:rFonts w:ascii="Times New Roman" w:cs="Times New Roman" w:eastAsia="Times New Roman" w:hAnsi="Times New Roman"/>
-                <w:b w:val="false"/>
-                <w:bCs w:val="false"/>
-                <w:noProof/>
-                <w:sz w:val="18"/>
-                <w:szCs w:val="18"/>
-                <w:lang w:val="vi-VN"/>
-              </w:rPr>
-              <w:t xml:space="preserve">0,67</w:t>
-            </w:r>
-          </w:p>
-        </w:tc>
-        <w:tc>
-          <w:p>
-            <w:pPr>
-              <w:jc w:val="center"/>
-            </w:pPr>
-            <w:r>
-              <w:rPr>
-                <w:rFonts w:ascii="Times New Roman" w:cs="Times New Roman" w:eastAsia="Times New Roman" w:hAnsi="Times New Roman"/>
-                <w:b w:val="false"/>
-                <w:bCs w:val="false"/>
-                <w:noProof/>
-                <w:sz w:val="18"/>
-                <w:szCs w:val="18"/>
-                <w:lang w:val="vi-VN"/>
-              </w:rPr>
-              <w:t xml:space="preserve">0,75</w:t>
+              <w:t xml:space="preserve">3,58</w:t>
+            </w:r>
+          </w:p>
+        </w:tc>
+        <w:tc>
+          <w:p>
+            <w:pPr>
+              <w:jc w:val="center"/>
+            </w:pPr>
+            <w:r>
+              <w:rPr>
+                <w:rFonts w:ascii="Times New Roman" w:cs="Times New Roman" w:eastAsia="Times New Roman" w:hAnsi="Times New Roman"/>
+                <w:b w:val="false"/>
+                <w:bCs w:val="false"/>
+                <w:noProof/>
+                <w:sz w:val="18"/>
+                <w:szCs w:val="18"/>
+                <w:lang w:val="vi-VN"/>
+              </w:rPr>
+              <w:t xml:space="preserve">9,2</w:t>
+            </w:r>
+          </w:p>
+        </w:tc>
+        <w:tc>
+          <w:p>
+            <w:pPr>
+              <w:jc w:val="center"/>
+            </w:pPr>
+            <w:r>
+              <w:rPr>
+                <w:rFonts w:ascii="Times New Roman" w:cs="Times New Roman" w:eastAsia="Times New Roman" w:hAnsi="Times New Roman"/>
+                <w:b w:val="false"/>
+                <w:bCs w:val="false"/>
+                <w:noProof/>
+                <w:sz w:val="18"/>
+                <w:szCs w:val="18"/>
+                <w:lang w:val="vi-VN"/>
+              </w:rPr>
+              <w:t xml:space="preserve">59,0</w:t>
+            </w:r>
+          </w:p>
+        </w:tc>
+        <w:tc>
+          <w:p>
+            <w:pPr>
+              <w:jc w:val="center"/>
+            </w:pPr>
+            <w:r>
+              <w:rPr>
+                <w:rFonts w:ascii="Times New Roman" w:cs="Times New Roman" w:eastAsia="Times New Roman" w:hAnsi="Times New Roman"/>
+                <w:b w:val="false"/>
+                <w:bCs w:val="false"/>
+                <w:noProof/>
+                <w:sz w:val="18"/>
+                <w:szCs w:val="18"/>
+                <w:lang w:val="vi-VN"/>
+              </w:rPr>
+              <w:t xml:space="preserve">0,73</w:t>
             </w:r>
           </w:p>
         </w:tc>
@@ -9658,7 +9640,26 @@
                 <w:szCs w:val="18"/>
                 <w:lang w:val="vi-VN"/>
               </w:rPr>
-              <w:t xml:space="preserve">0,78</w:t>
+              <w:t xml:space="preserve">0,97</w:t>
+            </w:r>
+          </w:p>
+        </w:tc>
+        <w:tc>
+          <w:p>
+            <w:pPr>
+              <w:jc w:val="center"/>
+            </w:pPr>
+            <w:r>
+              <w:rPr>
+                <w:rFonts w:ascii="Times New Roman" w:cs="Times New Roman" w:eastAsia="Times New Roman" w:hAnsi="Times New Roman"/>
+                <w:b w:val="false"/>
+                <w:bCs w:val="false"/>
+                <w:noProof/>
+                <w:sz w:val="18"/>
+                <w:szCs w:val="18"/>
+                <w:lang w:val="vi-VN"/>
+              </w:rPr>
+              <w:t xml:space="preserve">0,91</w:t>
             </w:r>
           </w:p>
         </w:tc>
@@ -9720,26 +9721,26 @@
                 <w:szCs w:val="18"/>
                 <w:lang w:val="vi-VN"/>
               </w:rPr>
-              <w:t xml:space="preserve">B2-D24 + B3-D13</w:t>
-            </w:r>
-          </w:p>
-        </w:tc>
-        <w:tc>
-          <w:p>
-            <w:pPr>
-              <w:jc w:val="center"/>
-            </w:pPr>
-            <w:r>
-              <w:rPr>
-                <w:rFonts w:ascii="Times New Roman" w:cs="Times New Roman" w:eastAsia="Times New Roman" w:hAnsi="Times New Roman"/>
-                <w:b w:val="false"/>
-                <w:bCs w:val="false"/>
-                <w:noProof/>
-                <w:sz w:val="18"/>
-                <w:szCs w:val="18"/>
-                <w:lang w:val="vi-VN"/>
-              </w:rPr>
-              <w:t xml:space="preserve">6,00</w:t>
+              <w:t xml:space="preserve">B2-D34</w:t>
+            </w:r>
+          </w:p>
+        </w:tc>
+        <w:tc>
+          <w:p>
+            <w:pPr>
+              <w:jc w:val="center"/>
+            </w:pPr>
+            <w:r>
+              <w:rPr>
+                <w:rFonts w:ascii="Times New Roman" w:cs="Times New Roman" w:eastAsia="Times New Roman" w:hAnsi="Times New Roman"/>
+                <w:b w:val="false"/>
+                <w:bCs w:val="false"/>
+                <w:noProof/>
+                <w:sz w:val="18"/>
+                <w:szCs w:val="18"/>
+                <w:lang w:val="vi-VN"/>
+              </w:rPr>
+              <w:t xml:space="preserve">3,00</w:t>
             </w:r>
           </w:p>
         </w:tc>
@@ -9777,83 +9778,83 @@
                 <w:szCs w:val="18"/>
                 <w:lang w:val="vi-VN"/>
               </w:rPr>
-              <w:t xml:space="preserve">14,38</w:t>
-            </w:r>
-          </w:p>
-        </w:tc>
-        <w:tc>
-          <w:p>
-            <w:pPr>
-              <w:jc w:val="center"/>
-            </w:pPr>
-            <w:r>
-              <w:rPr>
-                <w:rFonts w:ascii="Times New Roman" w:cs="Times New Roman" w:eastAsia="Times New Roman" w:hAnsi="Times New Roman"/>
-                <w:b w:val="false"/>
-                <w:bCs w:val="false"/>
-                <w:noProof/>
-                <w:sz w:val="18"/>
-                <w:szCs w:val="18"/>
-                <w:lang w:val="vi-VN"/>
-              </w:rPr>
-              <w:t xml:space="preserve">36,7</w:t>
-            </w:r>
-          </w:p>
-        </w:tc>
-        <w:tc>
-          <w:p>
-            <w:pPr>
-              <w:jc w:val="center"/>
-            </w:pPr>
-            <w:r>
-              <w:rPr>
-                <w:rFonts w:ascii="Times New Roman" w:cs="Times New Roman" w:eastAsia="Times New Roman" w:hAnsi="Times New Roman"/>
-                <w:b w:val="false"/>
-                <w:bCs w:val="false"/>
-                <w:noProof/>
-                <w:sz w:val="18"/>
-                <w:szCs w:val="18"/>
-                <w:lang w:val="vi-VN"/>
-              </w:rPr>
-              <w:t xml:space="preserve">177,7</w:t>
-            </w:r>
-          </w:p>
-        </w:tc>
-        <w:tc>
-          <w:p>
-            <w:pPr>
-              <w:jc w:val="center"/>
-            </w:pPr>
-            <w:r>
-              <w:rPr>
-                <w:rFonts w:ascii="Times New Roman" w:cs="Times New Roman" w:eastAsia="Times New Roman" w:hAnsi="Times New Roman"/>
-                <w:b w:val="false"/>
-                <w:bCs w:val="false"/>
-                <w:noProof/>
-                <w:sz w:val="18"/>
-                <w:szCs w:val="18"/>
-                <w:lang w:val="vi-VN"/>
-              </w:rPr>
-              <w:t xml:space="preserve">0,79</w:t>
-            </w:r>
-          </w:p>
-        </w:tc>
-        <w:tc>
-          <w:p>
-            <w:pPr>
-              <w:jc w:val="center"/>
-            </w:pPr>
-            <w:r>
-              <w:rPr>
-                <w:rFonts w:ascii="Times New Roman" w:cs="Times New Roman" w:eastAsia="Times New Roman" w:hAnsi="Times New Roman"/>
-                <w:b w:val="false"/>
-                <w:bCs w:val="false"/>
-                <w:noProof/>
-                <w:sz w:val="18"/>
-                <w:szCs w:val="18"/>
-                <w:lang w:val="vi-VN"/>
-              </w:rPr>
-              <w:t xml:space="preserve">0,38</w:t>
+              <w:t xml:space="preserve">3,58</w:t>
+            </w:r>
+          </w:p>
+        </w:tc>
+        <w:tc>
+          <w:p>
+            <w:pPr>
+              <w:jc w:val="center"/>
+            </w:pPr>
+            <w:r>
+              <w:rPr>
+                <w:rFonts w:ascii="Times New Roman" w:cs="Times New Roman" w:eastAsia="Times New Roman" w:hAnsi="Times New Roman"/>
+                <w:b w:val="false"/>
+                <w:bCs w:val="false"/>
+                <w:noProof/>
+                <w:sz w:val="18"/>
+                <w:szCs w:val="18"/>
+                <w:lang w:val="vi-VN"/>
+              </w:rPr>
+              <w:t xml:space="preserve">9,2</w:t>
+            </w:r>
+          </w:p>
+        </w:tc>
+        <w:tc>
+          <w:p>
+            <w:pPr>
+              <w:jc w:val="center"/>
+            </w:pPr>
+            <w:r>
+              <w:rPr>
+                <w:rFonts w:ascii="Times New Roman" w:cs="Times New Roman" w:eastAsia="Times New Roman" w:hAnsi="Times New Roman"/>
+                <w:b w:val="false"/>
+                <w:bCs w:val="false"/>
+                <w:noProof/>
+                <w:sz w:val="18"/>
+                <w:szCs w:val="18"/>
+                <w:lang w:val="vi-VN"/>
+              </w:rPr>
+              <w:t xml:space="preserve">59,0</w:t>
+            </w:r>
+          </w:p>
+        </w:tc>
+        <w:tc>
+          <w:p>
+            <w:pPr>
+              <w:jc w:val="center"/>
+            </w:pPr>
+            <w:r>
+              <w:rPr>
+                <w:rFonts w:ascii="Times New Roman" w:cs="Times New Roman" w:eastAsia="Times New Roman" w:hAnsi="Times New Roman"/>
+                <w:b w:val="false"/>
+                <w:bCs w:val="false"/>
+                <w:noProof/>
+                <w:sz w:val="18"/>
+                <w:szCs w:val="18"/>
+                <w:lang w:val="vi-VN"/>
+              </w:rPr>
+              <w:t xml:space="preserve">0,74</w:t>
+            </w:r>
+          </w:p>
+        </w:tc>
+        <w:tc>
+          <w:p>
+            <w:pPr>
+              <w:jc w:val="center"/>
+            </w:pPr>
+            <w:r>
+              <w:rPr>
+                <w:rFonts w:ascii="Times New Roman" w:cs="Times New Roman" w:eastAsia="Times New Roman" w:hAnsi="Times New Roman"/>
+                <w:b w:val="false"/>
+                <w:bCs w:val="false"/>
+                <w:noProof/>
+                <w:sz w:val="18"/>
+                <w:szCs w:val="18"/>
+                <w:lang w:val="vi-VN"/>
+              </w:rPr>
+              <w:t xml:space="preserve">0,89</w:t>
             </w:r>
           </w:p>
         </w:tc>
@@ -9891,7 +9892,7 @@
                 <w:szCs w:val="18"/>
                 <w:lang w:val="vi-VN"/>
               </w:rPr>
-              <w:t xml:space="preserve">0,00</w:t>
+              <w:t xml:space="preserve">0,91</w:t>
             </w:r>
           </w:p>
         </w:tc>
@@ -9953,26 +9954,26 @@
                 <w:szCs w:val="18"/>
                 <w:lang w:val="vi-VN"/>
               </w:rPr>
-              <w:t xml:space="preserve">B2-D34</w:t>
-            </w:r>
-          </w:p>
-        </w:tc>
-        <w:tc>
-          <w:p>
-            <w:pPr>
-              <w:jc w:val="center"/>
-            </w:pPr>
-            <w:r>
-              <w:rPr>
-                <w:rFonts w:ascii="Times New Roman" w:cs="Times New Roman" w:eastAsia="Times New Roman" w:hAnsi="Times New Roman"/>
-                <w:b w:val="false"/>
-                <w:bCs w:val="false"/>
-                <w:noProof/>
-                <w:sz w:val="18"/>
-                <w:szCs w:val="18"/>
-                <w:lang w:val="vi-VN"/>
-              </w:rPr>
-              <w:t xml:space="preserve">2,75</w:t>
+              <w:t xml:space="preserve">B5-D17 + B6-D06</w:t>
+            </w:r>
+          </w:p>
+        </w:tc>
+        <w:tc>
+          <w:p>
+            <w:pPr>
+              <w:jc w:val="center"/>
+            </w:pPr>
+            <w:r>
+              <w:rPr>
+                <w:rFonts w:ascii="Times New Roman" w:cs="Times New Roman" w:eastAsia="Times New Roman" w:hAnsi="Times New Roman"/>
+                <w:b w:val="false"/>
+                <w:bCs w:val="false"/>
+                <w:noProof/>
+                <w:sz w:val="18"/>
+                <w:szCs w:val="18"/>
+                <w:lang w:val="vi-VN"/>
+              </w:rPr>
+              <w:t xml:space="preserve">5,50</w:t>
             </w:r>
           </w:p>
         </w:tc>
@@ -10010,121 +10011,121 @@
                 <w:szCs w:val="18"/>
                 <w:lang w:val="vi-VN"/>
               </w:rPr>
-              <w:t xml:space="preserve">3,01</w:t>
-            </w:r>
-          </w:p>
-        </w:tc>
-        <w:tc>
-          <w:p>
-            <w:pPr>
-              <w:jc w:val="center"/>
-            </w:pPr>
-            <w:r>
-              <w:rPr>
-                <w:rFonts w:ascii="Times New Roman" w:cs="Times New Roman" w:eastAsia="Times New Roman" w:hAnsi="Times New Roman"/>
-                <w:b w:val="false"/>
-                <w:bCs w:val="false"/>
-                <w:noProof/>
-                <w:sz w:val="18"/>
-                <w:szCs w:val="18"/>
-                <w:lang w:val="vi-VN"/>
-              </w:rPr>
-              <w:t xml:space="preserve">7,7</w:t>
-            </w:r>
-          </w:p>
-        </w:tc>
-        <w:tc>
-          <w:p>
-            <w:pPr>
-              <w:jc w:val="center"/>
-            </w:pPr>
-            <w:r>
-              <w:rPr>
-                <w:rFonts w:ascii="Times New Roman" w:cs="Times New Roman" w:eastAsia="Times New Roman" w:hAnsi="Times New Roman"/>
-                <w:b w:val="false"/>
-                <w:bCs w:val="false"/>
-                <w:noProof/>
-                <w:sz w:val="18"/>
-                <w:szCs w:val="18"/>
-                <w:lang w:val="vi-VN"/>
-              </w:rPr>
-              <w:t xml:space="preserve">48,9</w:t>
-            </w:r>
-          </w:p>
-        </w:tc>
-        <w:tc>
-          <w:p>
-            <w:pPr>
-              <w:jc w:val="center"/>
-            </w:pPr>
-            <w:r>
-              <w:rPr>
-                <w:rFonts w:ascii="Times New Roman" w:cs="Times New Roman" w:eastAsia="Times New Roman" w:hAnsi="Times New Roman"/>
-                <w:b w:val="false"/>
-                <w:bCs w:val="false"/>
-                <w:noProof/>
-                <w:sz w:val="18"/>
-                <w:szCs w:val="18"/>
-                <w:lang w:val="vi-VN"/>
-              </w:rPr>
-              <w:t xml:space="preserve">0,67</w:t>
-            </w:r>
-          </w:p>
-        </w:tc>
-        <w:tc>
-          <w:p>
-            <w:pPr>
-              <w:jc w:val="center"/>
-            </w:pPr>
-            <w:r>
-              <w:rPr>
-                <w:rFonts w:ascii="Times New Roman" w:cs="Times New Roman" w:eastAsia="Times New Roman" w:hAnsi="Times New Roman"/>
-                <w:b w:val="false"/>
-                <w:bCs w:val="false"/>
-                <w:noProof/>
-                <w:sz w:val="18"/>
-                <w:szCs w:val="18"/>
-                <w:lang w:val="vi-VN"/>
-              </w:rPr>
-              <w:t xml:space="preserve">0,75</w:t>
-            </w:r>
-          </w:p>
-        </w:tc>
-        <w:tc>
-          <w:p>
-            <w:pPr>
-              <w:jc w:val="center"/>
-            </w:pPr>
-            <w:r>
-              <w:rPr>
-                <w:rFonts w:ascii="Times New Roman" w:cs="Times New Roman" w:eastAsia="Times New Roman" w:hAnsi="Times New Roman"/>
-                <w:b w:val="false"/>
-                <w:bCs w:val="false"/>
-                <w:noProof/>
-                <w:sz w:val="18"/>
-                <w:szCs w:val="18"/>
-                <w:lang w:val="vi-VN"/>
-              </w:rPr>
-              <w:t xml:space="preserve">0,89</w:t>
-            </w:r>
-          </w:p>
-        </w:tc>
-        <w:tc>
-          <w:p>
-            <w:pPr>
-              <w:jc w:val="center"/>
-            </w:pPr>
-            <w:r>
-              <w:rPr>
-                <w:rFonts w:ascii="Times New Roman" w:cs="Times New Roman" w:eastAsia="Times New Roman" w:hAnsi="Times New Roman"/>
-                <w:b w:val="false"/>
-                <w:bCs w:val="false"/>
-                <w:noProof/>
-                <w:sz w:val="18"/>
-                <w:szCs w:val="18"/>
-                <w:lang w:val="vi-VN"/>
-              </w:rPr>
-              <w:t xml:space="preserve">0,78</w:t>
+              <w:t xml:space="preserve">12,08</w:t>
+            </w:r>
+          </w:p>
+        </w:tc>
+        <w:tc>
+          <w:p>
+            <w:pPr>
+              <w:jc w:val="center"/>
+            </w:pPr>
+            <w:r>
+              <w:rPr>
+                <w:rFonts w:ascii="Times New Roman" w:cs="Times New Roman" w:eastAsia="Times New Roman" w:hAnsi="Times New Roman"/>
+                <w:b w:val="false"/>
+                <w:bCs w:val="false"/>
+                <w:noProof/>
+                <w:sz w:val="18"/>
+                <w:szCs w:val="18"/>
+                <w:lang w:val="vi-VN"/>
+              </w:rPr>
+              <w:t xml:space="preserve">30,8</w:t>
+            </w:r>
+          </w:p>
+        </w:tc>
+        <w:tc>
+          <w:p>
+            <w:pPr>
+              <w:jc w:val="center"/>
+            </w:pPr>
+            <w:r>
+              <w:rPr>
+                <w:rFonts w:ascii="Times New Roman" w:cs="Times New Roman" w:eastAsia="Times New Roman" w:hAnsi="Times New Roman"/>
+                <w:b w:val="false"/>
+                <w:bCs w:val="false"/>
+                <w:noProof/>
+                <w:sz w:val="18"/>
+                <w:szCs w:val="18"/>
+                <w:lang w:val="vi-VN"/>
+              </w:rPr>
+              <w:t xml:space="preserve">149,4</w:t>
+            </w:r>
+          </w:p>
+        </w:tc>
+        <w:tc>
+          <w:p>
+            <w:pPr>
+              <w:jc w:val="center"/>
+            </w:pPr>
+            <w:r>
+              <w:rPr>
+                <w:rFonts w:ascii="Times New Roman" w:cs="Times New Roman" w:eastAsia="Times New Roman" w:hAnsi="Times New Roman"/>
+                <w:b w:val="false"/>
+                <w:bCs w:val="false"/>
+                <w:noProof/>
+                <w:sz w:val="18"/>
+                <w:szCs w:val="18"/>
+                <w:lang w:val="vi-VN"/>
+              </w:rPr>
+              <w:t xml:space="preserve">0,77</w:t>
+            </w:r>
+          </w:p>
+        </w:tc>
+        <w:tc>
+          <w:p>
+            <w:pPr>
+              <w:jc w:val="center"/>
+            </w:pPr>
+            <w:r>
+              <w:rPr>
+                <w:rFonts w:ascii="Times New Roman" w:cs="Times New Roman" w:eastAsia="Times New Roman" w:hAnsi="Times New Roman"/>
+                <w:b w:val="false"/>
+                <w:bCs w:val="false"/>
+                <w:noProof/>
+                <w:sz w:val="18"/>
+                <w:szCs w:val="18"/>
+                <w:lang w:val="vi-VN"/>
+              </w:rPr>
+              <w:t xml:space="preserve">0,56</w:t>
+            </w:r>
+          </w:p>
+        </w:tc>
+        <w:tc>
+          <w:p>
+            <w:pPr>
+              <w:jc w:val="center"/>
+            </w:pPr>
+            <w:r>
+              <w:rPr>
+                <w:rFonts w:ascii="Times New Roman" w:cs="Times New Roman" w:eastAsia="Times New Roman" w:hAnsi="Times New Roman"/>
+                <w:b w:val="false"/>
+                <w:bCs w:val="false"/>
+                <w:noProof/>
+                <w:sz w:val="18"/>
+                <w:szCs w:val="18"/>
+                <w:lang w:val="vi-VN"/>
+              </w:rPr>
+              <w:t xml:space="preserve">0,99</w:t>
+            </w:r>
+          </w:p>
+        </w:tc>
+        <w:tc>
+          <w:p>
+            <w:pPr>
+              <w:jc w:val="center"/>
+            </w:pPr>
+            <w:r>
+              <w:rPr>
+                <w:rFonts w:ascii="Times New Roman" w:cs="Times New Roman" w:eastAsia="Times New Roman" w:hAnsi="Times New Roman"/>
+                <w:b w:val="false"/>
+                <w:bCs w:val="false"/>
+                <w:noProof/>
+                <w:sz w:val="18"/>
+                <w:szCs w:val="18"/>
+                <w:lang w:val="vi-VN"/>
+              </w:rPr>
+              <w:t xml:space="preserve">0,00</w:t>
             </w:r>
           </w:p>
         </w:tc>
@@ -10186,26 +10187,26 @@
                 <w:szCs w:val="18"/>
                 <w:lang w:val="vi-VN"/>
               </w:rPr>
-              <w:t xml:space="preserve">B2-D58 + B3-D02</w:t>
-            </w:r>
-          </w:p>
-        </w:tc>
-        <w:tc>
-          <w:p>
-            <w:pPr>
-              <w:jc w:val="center"/>
-            </w:pPr>
-            <w:r>
-              <w:rPr>
-                <w:rFonts w:ascii="Times New Roman" w:cs="Times New Roman" w:eastAsia="Times New Roman" w:hAnsi="Times New Roman"/>
-                <w:b w:val="false"/>
-                <w:bCs w:val="false"/>
-                <w:noProof/>
-                <w:sz w:val="18"/>
-                <w:szCs w:val="18"/>
-                <w:lang w:val="vi-VN"/>
-              </w:rPr>
-              <w:t xml:space="preserve">5,75</w:t>
+              <w:t xml:space="preserve">B6-D13</w:t>
+            </w:r>
+          </w:p>
+        </w:tc>
+        <w:tc>
+          <w:p>
+            <w:pPr>
+              <w:jc w:val="center"/>
+            </w:pPr>
+            <w:r>
+              <w:rPr>
+                <w:rFonts w:ascii="Times New Roman" w:cs="Times New Roman" w:eastAsia="Times New Roman" w:hAnsi="Times New Roman"/>
+                <w:b w:val="false"/>
+                <w:bCs w:val="false"/>
+                <w:noProof/>
+                <w:sz w:val="18"/>
+                <w:szCs w:val="18"/>
+                <w:lang w:val="vi-VN"/>
+              </w:rPr>
+              <w:t xml:space="preserve">4,00</w:t>
             </w:r>
           </w:p>
         </w:tc>
@@ -10243,121 +10244,121 @@
                 <w:szCs w:val="18"/>
                 <w:lang w:val="vi-VN"/>
               </w:rPr>
-              <w:t xml:space="preserve">13,21</w:t>
-            </w:r>
-          </w:p>
-        </w:tc>
-        <w:tc>
-          <w:p>
-            <w:pPr>
-              <w:jc w:val="center"/>
-            </w:pPr>
-            <w:r>
-              <w:rPr>
-                <w:rFonts w:ascii="Times New Roman" w:cs="Times New Roman" w:eastAsia="Times New Roman" w:hAnsi="Times New Roman"/>
-                <w:b w:val="false"/>
-                <w:bCs w:val="false"/>
-                <w:noProof/>
-                <w:sz w:val="18"/>
-                <w:szCs w:val="18"/>
-                <w:lang w:val="vi-VN"/>
-              </w:rPr>
-              <w:t xml:space="preserve">33,7</w:t>
-            </w:r>
-          </w:p>
-        </w:tc>
-        <w:tc>
-          <w:p>
-            <w:pPr>
-              <w:jc w:val="center"/>
-            </w:pPr>
-            <w:r>
-              <w:rPr>
-                <w:rFonts w:ascii="Times New Roman" w:cs="Times New Roman" w:eastAsia="Times New Roman" w:hAnsi="Times New Roman"/>
-                <w:b w:val="false"/>
-                <w:bCs w:val="false"/>
-                <w:noProof/>
-                <w:sz w:val="18"/>
-                <w:szCs w:val="18"/>
-                <w:lang w:val="vi-VN"/>
-              </w:rPr>
-              <w:t xml:space="preserve">171,2</w:t>
-            </w:r>
-          </w:p>
-        </w:tc>
-        <w:tc>
-          <w:p>
-            <w:pPr>
-              <w:jc w:val="center"/>
-            </w:pPr>
-            <w:r>
-              <w:rPr>
-                <w:rFonts w:ascii="Times New Roman" w:cs="Times New Roman" w:eastAsia="Times New Roman" w:hAnsi="Times New Roman"/>
-                <w:b w:val="false"/>
-                <w:bCs w:val="false"/>
-                <w:noProof/>
-                <w:sz w:val="18"/>
-                <w:szCs w:val="18"/>
-                <w:lang w:val="vi-VN"/>
-              </w:rPr>
-              <w:t xml:space="preserve">0,81</w:t>
-            </w:r>
-          </w:p>
-        </w:tc>
-        <w:tc>
-          <w:p>
-            <w:pPr>
-              <w:jc w:val="center"/>
-            </w:pPr>
-            <w:r>
-              <w:rPr>
-                <w:rFonts w:ascii="Times New Roman" w:cs="Times New Roman" w:eastAsia="Times New Roman" w:hAnsi="Times New Roman"/>
-                <w:b w:val="false"/>
-                <w:bCs w:val="false"/>
-                <w:noProof/>
-                <w:sz w:val="18"/>
-                <w:szCs w:val="18"/>
-                <w:lang w:val="vi-VN"/>
-              </w:rPr>
-              <w:t xml:space="preserve">0,38</w:t>
-            </w:r>
-          </w:p>
-        </w:tc>
-        <w:tc>
-          <w:p>
-            <w:pPr>
-              <w:jc w:val="center"/>
-            </w:pPr>
-            <w:r>
-              <w:rPr>
-                <w:rFonts w:ascii="Times New Roman" w:cs="Times New Roman" w:eastAsia="Times New Roman" w:hAnsi="Times New Roman"/>
-                <w:b w:val="false"/>
-                <w:bCs w:val="false"/>
-                <w:noProof/>
-                <w:sz w:val="18"/>
-                <w:szCs w:val="18"/>
-                <w:lang w:val="vi-VN"/>
-              </w:rPr>
-              <w:t xml:space="preserve">1,00</w:t>
-            </w:r>
-          </w:p>
-        </w:tc>
-        <w:tc>
-          <w:p>
-            <w:pPr>
-              <w:jc w:val="center"/>
-            </w:pPr>
-            <w:r>
-              <w:rPr>
-                <w:rFonts w:ascii="Times New Roman" w:cs="Times New Roman" w:eastAsia="Times New Roman" w:hAnsi="Times New Roman"/>
-                <w:b w:val="false"/>
-                <w:bCs w:val="false"/>
-                <w:noProof/>
-                <w:sz w:val="18"/>
-                <w:szCs w:val="18"/>
-                <w:lang w:val="vi-VN"/>
-              </w:rPr>
-              <w:t xml:space="preserve">0,00</w:t>
+              <w:t xml:space="preserve">6,38</w:t>
+            </w:r>
+          </w:p>
+        </w:tc>
+        <w:tc>
+          <w:p>
+            <w:pPr>
+              <w:jc w:val="center"/>
+            </w:pPr>
+            <w:r>
+              <w:rPr>
+                <w:rFonts w:ascii="Times New Roman" w:cs="Times New Roman" w:eastAsia="Times New Roman" w:hAnsi="Times New Roman"/>
+                <w:b w:val="false"/>
+                <w:bCs w:val="false"/>
+                <w:noProof/>
+                <w:sz w:val="18"/>
+                <w:szCs w:val="18"/>
+                <w:lang w:val="vi-VN"/>
+              </w:rPr>
+              <w:t xml:space="preserve">16,3</w:t>
+            </w:r>
+          </w:p>
+        </w:tc>
+        <w:tc>
+          <w:p>
+            <w:pPr>
+              <w:jc w:val="center"/>
+            </w:pPr>
+            <w:r>
+              <w:rPr>
+                <w:rFonts w:ascii="Times New Roman" w:cs="Times New Roman" w:eastAsia="Times New Roman" w:hAnsi="Times New Roman"/>
+                <w:b w:val="false"/>
+                <w:bCs w:val="false"/>
+                <w:noProof/>
+                <w:sz w:val="18"/>
+                <w:szCs w:val="18"/>
+                <w:lang w:val="vi-VN"/>
+              </w:rPr>
+              <w:t xml:space="preserve">83,3</w:t>
+            </w:r>
+          </w:p>
+        </w:tc>
+        <w:tc>
+          <w:p>
+            <w:pPr>
+              <w:jc w:val="center"/>
+            </w:pPr>
+            <w:r>
+              <w:rPr>
+                <w:rFonts w:ascii="Times New Roman" w:cs="Times New Roman" w:eastAsia="Times New Roman" w:hAnsi="Times New Roman"/>
+                <w:b w:val="false"/>
+                <w:bCs w:val="false"/>
+                <w:noProof/>
+                <w:sz w:val="18"/>
+                <w:szCs w:val="18"/>
+                <w:lang w:val="vi-VN"/>
+              </w:rPr>
+              <w:t xml:space="preserve">0,71</w:t>
+            </w:r>
+          </w:p>
+        </w:tc>
+        <w:tc>
+          <w:p>
+            <w:pPr>
+              <w:jc w:val="center"/>
+            </w:pPr>
+            <w:r>
+              <w:rPr>
+                <w:rFonts w:ascii="Times New Roman" w:cs="Times New Roman" w:eastAsia="Times New Roman" w:hAnsi="Times New Roman"/>
+                <w:b w:val="false"/>
+                <w:bCs w:val="false"/>
+                <w:noProof/>
+                <w:sz w:val="18"/>
+                <w:szCs w:val="18"/>
+                <w:lang w:val="vi-VN"/>
+              </w:rPr>
+              <w:t xml:space="preserve">0,67</w:t>
+            </w:r>
+          </w:p>
+        </w:tc>
+        <w:tc>
+          <w:p>
+            <w:pPr>
+              <w:jc w:val="center"/>
+            </w:pPr>
+            <w:r>
+              <w:rPr>
+                <w:rFonts w:ascii="Times New Roman" w:cs="Times New Roman" w:eastAsia="Times New Roman" w:hAnsi="Times New Roman"/>
+                <w:b w:val="false"/>
+                <w:bCs w:val="false"/>
+                <w:noProof/>
+                <w:sz w:val="18"/>
+                <w:szCs w:val="18"/>
+                <w:lang w:val="vi-VN"/>
+              </w:rPr>
+              <w:t xml:space="preserve">0,97</w:t>
+            </w:r>
+          </w:p>
+        </w:tc>
+        <w:tc>
+          <w:p>
+            <w:pPr>
+              <w:jc w:val="center"/>
+            </w:pPr>
+            <w:r>
+              <w:rPr>
+                <w:rFonts w:ascii="Times New Roman" w:cs="Times New Roman" w:eastAsia="Times New Roman" w:hAnsi="Times New Roman"/>
+                <w:b w:val="false"/>
+                <w:bCs w:val="false"/>
+                <w:noProof/>
+                <w:sz w:val="18"/>
+                <w:szCs w:val="18"/>
+                <w:lang w:val="vi-VN"/>
+              </w:rPr>
+              <w:t xml:space="preserve">0,53</w:t>
             </w:r>
           </w:p>
         </w:tc>
@@ -10419,26 +10420,26 @@
                 <w:szCs w:val="18"/>
                 <w:lang w:val="vi-VN"/>
               </w:rPr>
-              <w:t xml:space="preserve">B5-D17 + B6-D06</w:t>
-            </w:r>
-          </w:p>
-        </w:tc>
-        <w:tc>
-          <w:p>
-            <w:pPr>
-              <w:jc w:val="center"/>
-            </w:pPr>
-            <w:r>
-              <w:rPr>
-                <w:rFonts w:ascii="Times New Roman" w:cs="Times New Roman" w:eastAsia="Times New Roman" w:hAnsi="Times New Roman"/>
-                <w:b w:val="false"/>
-                <w:bCs w:val="false"/>
-                <w:noProof/>
-                <w:sz w:val="18"/>
-                <w:szCs w:val="18"/>
-                <w:lang w:val="vi-VN"/>
-              </w:rPr>
-              <w:t xml:space="preserve">5,75</w:t>
+              <w:t xml:space="preserve">B6-D25</w:t>
+            </w:r>
+          </w:p>
+        </w:tc>
+        <w:tc>
+          <w:p>
+            <w:pPr>
+              <w:jc w:val="center"/>
+            </w:pPr>
+            <w:r>
+              <w:rPr>
+                <w:rFonts w:ascii="Times New Roman" w:cs="Times New Roman" w:eastAsia="Times New Roman" w:hAnsi="Times New Roman"/>
+                <w:b w:val="false"/>
+                <w:bCs w:val="false"/>
+                <w:noProof/>
+                <w:sz w:val="18"/>
+                <w:szCs w:val="18"/>
+                <w:lang w:val="vi-VN"/>
+              </w:rPr>
+              <w:t xml:space="preserve">4,00</w:t>
             </w:r>
           </w:p>
         </w:tc>
@@ -10476,121 +10477,121 @@
                 <w:szCs w:val="18"/>
                 <w:lang w:val="vi-VN"/>
               </w:rPr>
-              <w:t xml:space="preserve">13,21</w:t>
-            </w:r>
-          </w:p>
-        </w:tc>
-        <w:tc>
-          <w:p>
-            <w:pPr>
-              <w:jc w:val="center"/>
-            </w:pPr>
-            <w:r>
-              <w:rPr>
-                <w:rFonts w:ascii="Times New Roman" w:cs="Times New Roman" w:eastAsia="Times New Roman" w:hAnsi="Times New Roman"/>
-                <w:b w:val="false"/>
-                <w:bCs w:val="false"/>
-                <w:noProof/>
-                <w:sz w:val="18"/>
-                <w:szCs w:val="18"/>
-                <w:lang w:val="vi-VN"/>
-              </w:rPr>
-              <w:t xml:space="preserve">33,7</w:t>
-            </w:r>
-          </w:p>
-        </w:tc>
-        <w:tc>
-          <w:p>
-            <w:pPr>
-              <w:jc w:val="center"/>
-            </w:pPr>
-            <w:r>
-              <w:rPr>
-                <w:rFonts w:ascii="Times New Roman" w:cs="Times New Roman" w:eastAsia="Times New Roman" w:hAnsi="Times New Roman"/>
-                <w:b w:val="false"/>
-                <w:bCs w:val="false"/>
-                <w:noProof/>
-                <w:sz w:val="18"/>
-                <w:szCs w:val="18"/>
-                <w:lang w:val="vi-VN"/>
-              </w:rPr>
-              <w:t xml:space="preserve">156,6</w:t>
-            </w:r>
-          </w:p>
-        </w:tc>
-        <w:tc>
-          <w:p>
-            <w:pPr>
-              <w:jc w:val="center"/>
-            </w:pPr>
-            <w:r>
-              <w:rPr>
-                <w:rFonts w:ascii="Times New Roman" w:cs="Times New Roman" w:eastAsia="Times New Roman" w:hAnsi="Times New Roman"/>
-                <w:b w:val="false"/>
-                <w:bCs w:val="false"/>
-                <w:noProof/>
-                <w:sz w:val="18"/>
-                <w:szCs w:val="18"/>
-                <w:lang w:val="vi-VN"/>
-              </w:rPr>
-              <w:t xml:space="preserve">0,74</w:t>
-            </w:r>
-          </w:p>
-        </w:tc>
-        <w:tc>
-          <w:p>
-            <w:pPr>
-              <w:jc w:val="center"/>
-            </w:pPr>
-            <w:r>
-              <w:rPr>
-                <w:rFonts w:ascii="Times New Roman" w:cs="Times New Roman" w:eastAsia="Times New Roman" w:hAnsi="Times New Roman"/>
-                <w:b w:val="false"/>
-                <w:bCs w:val="false"/>
-                <w:noProof/>
-                <w:sz w:val="18"/>
-                <w:szCs w:val="18"/>
-                <w:lang w:val="vi-VN"/>
-              </w:rPr>
-              <w:t xml:space="preserve">0,52</w:t>
-            </w:r>
-          </w:p>
-        </w:tc>
-        <w:tc>
-          <w:p>
-            <w:pPr>
-              <w:jc w:val="center"/>
-            </w:pPr>
-            <w:r>
-              <w:rPr>
-                <w:rFonts w:ascii="Times New Roman" w:cs="Times New Roman" w:eastAsia="Times New Roman" w:hAnsi="Times New Roman"/>
-                <w:b w:val="false"/>
-                <w:bCs w:val="false"/>
-                <w:noProof/>
-                <w:sz w:val="18"/>
-                <w:szCs w:val="18"/>
-                <w:lang w:val="vi-VN"/>
-              </w:rPr>
-              <w:t xml:space="preserve">0,95</w:t>
-            </w:r>
-          </w:p>
-        </w:tc>
-        <w:tc>
-          <w:p>
-            <w:pPr>
-              <w:jc w:val="center"/>
-            </w:pPr>
-            <w:r>
-              <w:rPr>
-                <w:rFonts w:ascii="Times New Roman" w:cs="Times New Roman" w:eastAsia="Times New Roman" w:hAnsi="Times New Roman"/>
-                <w:b w:val="false"/>
-                <w:bCs w:val="false"/>
-                <w:noProof/>
-                <w:sz w:val="18"/>
-                <w:szCs w:val="18"/>
-                <w:lang w:val="vi-VN"/>
-              </w:rPr>
-              <w:t xml:space="preserve">0,00</w:t>
+              <w:t xml:space="preserve">6,38</w:t>
+            </w:r>
+          </w:p>
+        </w:tc>
+        <w:tc>
+          <w:p>
+            <w:pPr>
+              <w:jc w:val="center"/>
+            </w:pPr>
+            <w:r>
+              <w:rPr>
+                <w:rFonts w:ascii="Times New Roman" w:cs="Times New Roman" w:eastAsia="Times New Roman" w:hAnsi="Times New Roman"/>
+                <w:b w:val="false"/>
+                <w:bCs w:val="false"/>
+                <w:noProof/>
+                <w:sz w:val="18"/>
+                <w:szCs w:val="18"/>
+                <w:lang w:val="vi-VN"/>
+              </w:rPr>
+              <w:t xml:space="preserve">16,3</w:t>
+            </w:r>
+          </w:p>
+        </w:tc>
+        <w:tc>
+          <w:p>
+            <w:pPr>
+              <w:jc w:val="center"/>
+            </w:pPr>
+            <w:r>
+              <w:rPr>
+                <w:rFonts w:ascii="Times New Roman" w:cs="Times New Roman" w:eastAsia="Times New Roman" w:hAnsi="Times New Roman"/>
+                <w:b w:val="false"/>
+                <w:bCs w:val="false"/>
+                <w:noProof/>
+                <w:sz w:val="18"/>
+                <w:szCs w:val="18"/>
+                <w:lang w:val="vi-VN"/>
+              </w:rPr>
+              <w:t xml:space="preserve">85,0</w:t>
+            </w:r>
+          </w:p>
+        </w:tc>
+        <w:tc>
+          <w:p>
+            <w:pPr>
+              <w:jc w:val="center"/>
+            </w:pPr>
+            <w:r>
+              <w:rPr>
+                <w:rFonts w:ascii="Times New Roman" w:cs="Times New Roman" w:eastAsia="Times New Roman" w:hAnsi="Times New Roman"/>
+                <w:b w:val="false"/>
+                <w:bCs w:val="false"/>
+                <w:noProof/>
+                <w:sz w:val="18"/>
+                <w:szCs w:val="18"/>
+                <w:lang w:val="vi-VN"/>
+              </w:rPr>
+              <w:t xml:space="preserve">0,72</w:t>
+            </w:r>
+          </w:p>
+        </w:tc>
+        <w:tc>
+          <w:p>
+            <w:pPr>
+              <w:jc w:val="center"/>
+            </w:pPr>
+            <w:r>
+              <w:rPr>
+                <w:rFonts w:ascii="Times New Roman" w:cs="Times New Roman" w:eastAsia="Times New Roman" w:hAnsi="Times New Roman"/>
+                <w:b w:val="false"/>
+                <w:bCs w:val="false"/>
+                <w:noProof/>
+                <w:sz w:val="18"/>
+                <w:szCs w:val="18"/>
+                <w:lang w:val="vi-VN"/>
+              </w:rPr>
+              <w:t xml:space="preserve">0,69</w:t>
+            </w:r>
+          </w:p>
+        </w:tc>
+        <w:tc>
+          <w:p>
+            <w:pPr>
+              <w:jc w:val="center"/>
+            </w:pPr>
+            <w:r>
+              <w:rPr>
+                <w:rFonts w:ascii="Times New Roman" w:cs="Times New Roman" w:eastAsia="Times New Roman" w:hAnsi="Times New Roman"/>
+                <w:b w:val="false"/>
+                <w:bCs w:val="false"/>
+                <w:noProof/>
+                <w:sz w:val="18"/>
+                <w:szCs w:val="18"/>
+                <w:lang w:val="vi-VN"/>
+              </w:rPr>
+              <w:t xml:space="preserve">0,99</w:t>
+            </w:r>
+          </w:p>
+        </w:tc>
+        <w:tc>
+          <w:p>
+            <w:pPr>
+              <w:jc w:val="center"/>
+            </w:pPr>
+            <w:r>
+              <w:rPr>
+                <w:rFonts w:ascii="Times New Roman" w:cs="Times New Roman" w:eastAsia="Times New Roman" w:hAnsi="Times New Roman"/>
+                <w:b w:val="false"/>
+                <w:bCs w:val="false"/>
+                <w:noProof/>
+                <w:sz w:val="18"/>
+                <w:szCs w:val="18"/>
+                <w:lang w:val="vi-VN"/>
+              </w:rPr>
+              <w:t xml:space="preserve">0,62</w:t>
             </w:r>
           </w:p>
         </w:tc>
@@ -10652,7 +10653,7 @@
                 <w:szCs w:val="18"/>
                 <w:lang w:val="vi-VN"/>
               </w:rPr>
-              <w:t xml:space="preserve">B6-D13</w:t>
+              <w:t xml:space="preserve">B6-D46</w:t>
             </w:r>
           </w:p>
         </w:tc>
@@ -10747,7 +10748,7 @@
                 <w:szCs w:val="18"/>
                 <w:lang w:val="vi-VN"/>
               </w:rPr>
-              <w:t xml:space="preserve">83,3</w:t>
+              <w:t xml:space="preserve">83,4</w:t>
             </w:r>
           </w:p>
         </w:tc>
@@ -10785,26 +10786,26 @@
                 <w:szCs w:val="18"/>
                 <w:lang w:val="vi-VN"/>
               </w:rPr>
-              <w:t xml:space="preserve">0,67</w:t>
-            </w:r>
-          </w:p>
-        </w:tc>
-        <w:tc>
-          <w:p>
-            <w:pPr>
-              <w:jc w:val="center"/>
-            </w:pPr>
-            <w:r>
-              <w:rPr>
-                <w:rFonts w:ascii="Times New Roman" w:cs="Times New Roman" w:eastAsia="Times New Roman" w:hAnsi="Times New Roman"/>
-                <w:b w:val="false"/>
-                <w:bCs w:val="false"/>
-                <w:noProof/>
-                <w:sz w:val="18"/>
-                <w:szCs w:val="18"/>
-                <w:lang w:val="vi-VN"/>
-              </w:rPr>
-              <w:t xml:space="preserve">0,97</w:t>
+              <w:t xml:space="preserve">0,66</w:t>
+            </w:r>
+          </w:p>
+        </w:tc>
+        <w:tc>
+          <w:p>
+            <w:pPr>
+              <w:jc w:val="center"/>
+            </w:pPr>
+            <w:r>
+              <w:rPr>
+                <w:rFonts w:ascii="Times New Roman" w:cs="Times New Roman" w:eastAsia="Times New Roman" w:hAnsi="Times New Roman"/>
+                <w:b w:val="false"/>
+                <w:bCs w:val="false"/>
+                <w:noProof/>
+                <w:sz w:val="18"/>
+                <w:szCs w:val="18"/>
+                <w:lang w:val="vi-VN"/>
+              </w:rPr>
+              <w:t xml:space="preserve">0,96</w:t>
             </w:r>
           </w:p>
         </w:tc>
@@ -10866,472 +10867,6 @@
                 <w:szCs w:val="18"/>
                 <w:lang w:val="vi-VN"/>
               </w:rPr>
-              <w:t xml:space="preserve">BM-DV016</w:t>
-            </w:r>
-          </w:p>
-        </w:tc>
-        <w:tc>
-          <w:p>
-            <w:pPr>
-              <w:jc w:val="center"/>
-            </w:pPr>
-            <w:r>
-              <w:rPr>
-                <w:rFonts w:ascii="Times New Roman" w:cs="Times New Roman" w:eastAsia="Times New Roman" w:hAnsi="Times New Roman"/>
-                <w:b w:val="false"/>
-                <w:bCs w:val="false"/>
-                <w:noProof/>
-                <w:sz w:val="18"/>
-                <w:szCs w:val="18"/>
-                <w:lang w:val="vi-VN"/>
-              </w:rPr>
-              <w:t xml:space="preserve">B6-D25</w:t>
-            </w:r>
-          </w:p>
-        </w:tc>
-        <w:tc>
-          <w:p>
-            <w:pPr>
-              <w:jc w:val="center"/>
-            </w:pPr>
-            <w:r>
-              <w:rPr>
-                <w:rFonts w:ascii="Times New Roman" w:cs="Times New Roman" w:eastAsia="Times New Roman" w:hAnsi="Times New Roman"/>
-                <w:b w:val="false"/>
-                <w:bCs w:val="false"/>
-                <w:noProof/>
-                <w:sz w:val="18"/>
-                <w:szCs w:val="18"/>
-                <w:lang w:val="vi-VN"/>
-              </w:rPr>
-              <w:t xml:space="preserve">4,00</w:t>
-            </w:r>
-          </w:p>
-        </w:tc>
-        <w:tc>
-          <w:p>
-            <w:pPr>
-              <w:jc w:val="center"/>
-            </w:pPr>
-            <w:r>
-              <w:rPr>
-                <w:rFonts w:ascii="Times New Roman" w:cs="Times New Roman" w:eastAsia="Times New Roman" w:hAnsi="Times New Roman"/>
-                <w:b w:val="false"/>
-                <w:bCs w:val="false"/>
-                <w:noProof/>
-                <w:sz w:val="18"/>
-                <w:szCs w:val="18"/>
-                <w:lang w:val="vi-VN"/>
-              </w:rPr>
-              <w:t xml:space="preserve">0,4</w:t>
-            </w:r>
-          </w:p>
-        </w:tc>
-        <w:tc>
-          <w:p>
-            <w:pPr>
-              <w:jc w:val="center"/>
-            </w:pPr>
-            <w:r>
-              <w:rPr>
-                <w:rFonts w:ascii="Times New Roman" w:cs="Times New Roman" w:eastAsia="Times New Roman" w:hAnsi="Times New Roman"/>
-                <w:b w:val="false"/>
-                <w:bCs w:val="false"/>
-                <w:noProof/>
-                <w:sz w:val="18"/>
-                <w:szCs w:val="18"/>
-                <w:lang w:val="vi-VN"/>
-              </w:rPr>
-              <w:t xml:space="preserve">6,38</w:t>
-            </w:r>
-          </w:p>
-        </w:tc>
-        <w:tc>
-          <w:p>
-            <w:pPr>
-              <w:jc w:val="center"/>
-            </w:pPr>
-            <w:r>
-              <w:rPr>
-                <w:rFonts w:ascii="Times New Roman" w:cs="Times New Roman" w:eastAsia="Times New Roman" w:hAnsi="Times New Roman"/>
-                <w:b w:val="false"/>
-                <w:bCs w:val="false"/>
-                <w:noProof/>
-                <w:sz w:val="18"/>
-                <w:szCs w:val="18"/>
-                <w:lang w:val="vi-VN"/>
-              </w:rPr>
-              <w:t xml:space="preserve">16,3</w:t>
-            </w:r>
-          </w:p>
-        </w:tc>
-        <w:tc>
-          <w:p>
-            <w:pPr>
-              <w:jc w:val="center"/>
-            </w:pPr>
-            <w:r>
-              <w:rPr>
-                <w:rFonts w:ascii="Times New Roman" w:cs="Times New Roman" w:eastAsia="Times New Roman" w:hAnsi="Times New Roman"/>
-                <w:b w:val="false"/>
-                <w:bCs w:val="false"/>
-                <w:noProof/>
-                <w:sz w:val="18"/>
-                <w:szCs w:val="18"/>
-                <w:lang w:val="vi-VN"/>
-              </w:rPr>
-              <w:t xml:space="preserve">85,0</w:t>
-            </w:r>
-          </w:p>
-        </w:tc>
-        <w:tc>
-          <w:p>
-            <w:pPr>
-              <w:jc w:val="center"/>
-            </w:pPr>
-            <w:r>
-              <w:rPr>
-                <w:rFonts w:ascii="Times New Roman" w:cs="Times New Roman" w:eastAsia="Times New Roman" w:hAnsi="Times New Roman"/>
-                <w:b w:val="false"/>
-                <w:bCs w:val="false"/>
-                <w:noProof/>
-                <w:sz w:val="18"/>
-                <w:szCs w:val="18"/>
-                <w:lang w:val="vi-VN"/>
-              </w:rPr>
-              <w:t xml:space="preserve">0,72</w:t>
-            </w:r>
-          </w:p>
-        </w:tc>
-        <w:tc>
-          <w:p>
-            <w:pPr>
-              <w:jc w:val="center"/>
-            </w:pPr>
-            <w:r>
-              <w:rPr>
-                <w:rFonts w:ascii="Times New Roman" w:cs="Times New Roman" w:eastAsia="Times New Roman" w:hAnsi="Times New Roman"/>
-                <w:b w:val="false"/>
-                <w:bCs w:val="false"/>
-                <w:noProof/>
-                <w:sz w:val="18"/>
-                <w:szCs w:val="18"/>
-                <w:lang w:val="vi-VN"/>
-              </w:rPr>
-              <w:t xml:space="preserve">0,69</w:t>
-            </w:r>
-          </w:p>
-        </w:tc>
-        <w:tc>
-          <w:p>
-            <w:pPr>
-              <w:jc w:val="center"/>
-            </w:pPr>
-            <w:r>
-              <w:rPr>
-                <w:rFonts w:ascii="Times New Roman" w:cs="Times New Roman" w:eastAsia="Times New Roman" w:hAnsi="Times New Roman"/>
-                <w:b w:val="false"/>
-                <w:bCs w:val="false"/>
-                <w:noProof/>
-                <w:sz w:val="18"/>
-                <w:szCs w:val="18"/>
-                <w:lang w:val="vi-VN"/>
-              </w:rPr>
-              <w:t xml:space="preserve">0,99</w:t>
-            </w:r>
-          </w:p>
-        </w:tc>
-        <w:tc>
-          <w:p>
-            <w:pPr>
-              <w:jc w:val="center"/>
-            </w:pPr>
-            <w:r>
-              <w:rPr>
-                <w:rFonts w:ascii="Times New Roman" w:cs="Times New Roman" w:eastAsia="Times New Roman" w:hAnsi="Times New Roman"/>
-                <w:b w:val="false"/>
-                <w:bCs w:val="false"/>
-                <w:noProof/>
-                <w:sz w:val="18"/>
-                <w:szCs w:val="18"/>
-                <w:lang w:val="vi-VN"/>
-              </w:rPr>
-              <w:t xml:space="preserve">0,62</w:t>
-            </w:r>
-          </w:p>
-        </w:tc>
-        <w:tc>
-          <w:p>
-            <w:pPr>
-              <w:jc w:val="center"/>
-            </w:pPr>
-            <w:r>
-              <w:rPr>
-                <w:rFonts w:ascii="Times New Roman" w:cs="Times New Roman" w:eastAsia="Times New Roman" w:hAnsi="Times New Roman"/>
-                <w:b w:val="false"/>
-                <w:bCs w:val="false"/>
-                <w:noProof/>
-                <w:sz w:val="18"/>
-                <w:szCs w:val="18"/>
-                <w:lang w:val="vi-VN"/>
-              </w:rPr>
-              <w:t xml:space="preserve">ĐẠT</w:t>
-            </w:r>
-          </w:p>
-        </w:tc>
-      </w:tr>
-      <w:tr>
-        <w:trPr>
-          <w:tblHeader w:val="false"/>
-        </w:trPr>
-        <w:tc>
-          <w:p>
-            <w:pPr>
-              <w:jc w:val="center"/>
-            </w:pPr>
-            <w:r>
-              <w:rPr>
-                <w:rFonts w:ascii="Times New Roman" w:cs="Times New Roman" w:eastAsia="Times New Roman" w:hAnsi="Times New Roman"/>
-                <w:b w:val="false"/>
-                <w:bCs w:val="false"/>
-                <w:noProof/>
-                <w:sz w:val="18"/>
-                <w:szCs w:val="18"/>
-                <w:lang w:val="vi-VN"/>
-              </w:rPr>
-              <w:t xml:space="preserve">BM-DV017</w:t>
-            </w:r>
-          </w:p>
-        </w:tc>
-        <w:tc>
-          <w:p>
-            <w:pPr>
-              <w:jc w:val="center"/>
-            </w:pPr>
-            <w:r>
-              <w:rPr>
-                <w:rFonts w:ascii="Times New Roman" w:cs="Times New Roman" w:eastAsia="Times New Roman" w:hAnsi="Times New Roman"/>
-                <w:b w:val="false"/>
-                <w:bCs w:val="false"/>
-                <w:noProof/>
-                <w:sz w:val="18"/>
-                <w:szCs w:val="18"/>
-                <w:lang w:val="vi-VN"/>
-              </w:rPr>
-              <w:t xml:space="preserve">B6-D46</w:t>
-            </w:r>
-          </w:p>
-        </w:tc>
-        <w:tc>
-          <w:p>
-            <w:pPr>
-              <w:jc w:val="center"/>
-            </w:pPr>
-            <w:r>
-              <w:rPr>
-                <w:rFonts w:ascii="Times New Roman" w:cs="Times New Roman" w:eastAsia="Times New Roman" w:hAnsi="Times New Roman"/>
-                <w:b w:val="false"/>
-                <w:bCs w:val="false"/>
-                <w:noProof/>
-                <w:sz w:val="18"/>
-                <w:szCs w:val="18"/>
-                <w:lang w:val="vi-VN"/>
-              </w:rPr>
-              <w:t xml:space="preserve">4,00</w:t>
-            </w:r>
-          </w:p>
-        </w:tc>
-        <w:tc>
-          <w:p>
-            <w:pPr>
-              <w:jc w:val="center"/>
-            </w:pPr>
-            <w:r>
-              <w:rPr>
-                <w:rFonts w:ascii="Times New Roman" w:cs="Times New Roman" w:eastAsia="Times New Roman" w:hAnsi="Times New Roman"/>
-                <w:b w:val="false"/>
-                <w:bCs w:val="false"/>
-                <w:noProof/>
-                <w:sz w:val="18"/>
-                <w:szCs w:val="18"/>
-                <w:lang w:val="vi-VN"/>
-              </w:rPr>
-              <w:t xml:space="preserve">0,4</w:t>
-            </w:r>
-          </w:p>
-        </w:tc>
-        <w:tc>
-          <w:p>
-            <w:pPr>
-              <w:jc w:val="center"/>
-            </w:pPr>
-            <w:r>
-              <w:rPr>
-                <w:rFonts w:ascii="Times New Roman" w:cs="Times New Roman" w:eastAsia="Times New Roman" w:hAnsi="Times New Roman"/>
-                <w:b w:val="false"/>
-                <w:bCs w:val="false"/>
-                <w:noProof/>
-                <w:sz w:val="18"/>
-                <w:szCs w:val="18"/>
-                <w:lang w:val="vi-VN"/>
-              </w:rPr>
-              <w:t xml:space="preserve">6,38</w:t>
-            </w:r>
-          </w:p>
-        </w:tc>
-        <w:tc>
-          <w:p>
-            <w:pPr>
-              <w:jc w:val="center"/>
-            </w:pPr>
-            <w:r>
-              <w:rPr>
-                <w:rFonts w:ascii="Times New Roman" w:cs="Times New Roman" w:eastAsia="Times New Roman" w:hAnsi="Times New Roman"/>
-                <w:b w:val="false"/>
-                <w:bCs w:val="false"/>
-                <w:noProof/>
-                <w:sz w:val="18"/>
-                <w:szCs w:val="18"/>
-                <w:lang w:val="vi-VN"/>
-              </w:rPr>
-              <w:t xml:space="preserve">16,3</w:t>
-            </w:r>
-          </w:p>
-        </w:tc>
-        <w:tc>
-          <w:p>
-            <w:pPr>
-              <w:jc w:val="center"/>
-            </w:pPr>
-            <w:r>
-              <w:rPr>
-                <w:rFonts w:ascii="Times New Roman" w:cs="Times New Roman" w:eastAsia="Times New Roman" w:hAnsi="Times New Roman"/>
-                <w:b w:val="false"/>
-                <w:bCs w:val="false"/>
-                <w:noProof/>
-                <w:sz w:val="18"/>
-                <w:szCs w:val="18"/>
-                <w:lang w:val="vi-VN"/>
-              </w:rPr>
-              <w:t xml:space="preserve">83,4</w:t>
-            </w:r>
-          </w:p>
-        </w:tc>
-        <w:tc>
-          <w:p>
-            <w:pPr>
-              <w:jc w:val="center"/>
-            </w:pPr>
-            <w:r>
-              <w:rPr>
-                <w:rFonts w:ascii="Times New Roman" w:cs="Times New Roman" w:eastAsia="Times New Roman" w:hAnsi="Times New Roman"/>
-                <w:b w:val="false"/>
-                <w:bCs w:val="false"/>
-                <w:noProof/>
-                <w:sz w:val="18"/>
-                <w:szCs w:val="18"/>
-                <w:lang w:val="vi-VN"/>
-              </w:rPr>
-              <w:t xml:space="preserve">0,71</w:t>
-            </w:r>
-          </w:p>
-        </w:tc>
-        <w:tc>
-          <w:p>
-            <w:pPr>
-              <w:jc w:val="center"/>
-            </w:pPr>
-            <w:r>
-              <w:rPr>
-                <w:rFonts w:ascii="Times New Roman" w:cs="Times New Roman" w:eastAsia="Times New Roman" w:hAnsi="Times New Roman"/>
-                <w:b w:val="false"/>
-                <w:bCs w:val="false"/>
-                <w:noProof/>
-                <w:sz w:val="18"/>
-                <w:szCs w:val="18"/>
-                <w:lang w:val="vi-VN"/>
-              </w:rPr>
-              <w:t xml:space="preserve">0,66</w:t>
-            </w:r>
-          </w:p>
-        </w:tc>
-        <w:tc>
-          <w:p>
-            <w:pPr>
-              <w:jc w:val="center"/>
-            </w:pPr>
-            <w:r>
-              <w:rPr>
-                <w:rFonts w:ascii="Times New Roman" w:cs="Times New Roman" w:eastAsia="Times New Roman" w:hAnsi="Times New Roman"/>
-                <w:b w:val="false"/>
-                <w:bCs w:val="false"/>
-                <w:noProof/>
-                <w:sz w:val="18"/>
-                <w:szCs w:val="18"/>
-                <w:lang w:val="vi-VN"/>
-              </w:rPr>
-              <w:t xml:space="preserve">0,96</w:t>
-            </w:r>
-          </w:p>
-        </w:tc>
-        <w:tc>
-          <w:p>
-            <w:pPr>
-              <w:jc w:val="center"/>
-            </w:pPr>
-            <w:r>
-              <w:rPr>
-                <w:rFonts w:ascii="Times New Roman" w:cs="Times New Roman" w:eastAsia="Times New Roman" w:hAnsi="Times New Roman"/>
-                <w:b w:val="false"/>
-                <w:bCs w:val="false"/>
-                <w:noProof/>
-                <w:sz w:val="18"/>
-                <w:szCs w:val="18"/>
-                <w:lang w:val="vi-VN"/>
-              </w:rPr>
-              <w:t xml:space="preserve">0,53</w:t>
-            </w:r>
-          </w:p>
-        </w:tc>
-        <w:tc>
-          <w:p>
-            <w:pPr>
-              <w:jc w:val="center"/>
-            </w:pPr>
-            <w:r>
-              <w:rPr>
-                <w:rFonts w:ascii="Times New Roman" w:cs="Times New Roman" w:eastAsia="Times New Roman" w:hAnsi="Times New Roman"/>
-                <w:b w:val="false"/>
-                <w:bCs w:val="false"/>
-                <w:noProof/>
-                <w:sz w:val="18"/>
-                <w:szCs w:val="18"/>
-                <w:lang w:val="vi-VN"/>
-              </w:rPr>
-              <w:t xml:space="preserve">ĐẠT</w:t>
-            </w:r>
-          </w:p>
-        </w:tc>
-      </w:tr>
-      <w:tr>
-        <w:trPr>
-          <w:tblHeader w:val="false"/>
-        </w:trPr>
-        <w:tc>
-          <w:p>
-            <w:pPr>
-              <w:jc w:val="center"/>
-            </w:pPr>
-            <w:r>
-              <w:rPr>
-                <w:rFonts w:ascii="Times New Roman" w:cs="Times New Roman" w:eastAsia="Times New Roman" w:hAnsi="Times New Roman"/>
-                <w:b w:val="false"/>
-                <w:bCs w:val="false"/>
-                <w:noProof/>
-                <w:sz w:val="18"/>
-                <w:szCs w:val="18"/>
-                <w:lang w:val="vi-VN"/>
-              </w:rPr>
               <w:t xml:space="preserve">TỔNG</w:t>
             </w:r>
           </w:p>
@@ -11351,7 +10886,7 @@
                 <w:szCs w:val="18"/>
                 <w:lang w:val="vi-VN"/>
               </w:rPr>
-              <w:t xml:space="preserve">17 đế, 68 vít</w:t>
+              <w:t xml:space="preserve">15 đế, 60 vít</w:t>
             </w:r>
           </w:p>
         </w:tc>
@@ -11408,7 +10943,7 @@
                 <w:szCs w:val="18"/>
                 <w:lang w:val="vi-VN"/>
               </w:rPr>
-              <w:t xml:space="preserve">128,3</w:t>
+              <w:t xml:space="preserve">104,4</w:t>
             </w:r>
           </w:p>
         </w:tc>
@@ -11446,7 +10981,7 @@
                 <w:szCs w:val="18"/>
                 <w:lang w:val="vi-VN"/>
               </w:rPr>
-              <w:t xml:space="preserve">1.746</w:t>
+              <w:t xml:space="preserve">1.436</w:t>
             </w:r>
           </w:p>
         </w:tc>
@@ -11559,7 +11094,7 @@
           <w:szCs w:val="20"/>
           <w:lang w:val="vi-VN"/>
         </w:rPr>
-        <w:t xml:space="preserve">Mỗi đế có 4 vít ống Ø89×5 ren Ø105, ngàm 3 m; tổng 68 vít, 253 m. Tổng sức chống nhổ 2.275 kN. Các cột Nhổ, Trượt, Lật, 1 vít là mức sử dụng lớn nhất trên mọi tổ hợp.</w:t>
+        <w:t xml:space="preserve">Mỗi đế có 4 vít ống Ø89×5 ren Ø105, ngàm 3 m; tổng 60 vít, 224 m. Tổng sức chống nhổ 1.888 kN. Các cột Nhổ, Trượt, Lật, 1 vít là mức sử dụng lớn nhất trên mọi tổ hợp.</w:t>
       </w:r>
     </w:p>
     <w:p>
@@ -11954,7 +11489,7 @@
                 <w:szCs w:val="18"/>
                 <w:lang w:val="vi-VN"/>
               </w:rPr>
-              <w:t xml:space="preserve">128,3</w:t>
+              <w:t xml:space="preserve">104,4</w:t>
             </w:r>
           </w:p>
         </w:tc>
@@ -12092,7 +11627,7 @@
                 <w:szCs w:val="18"/>
                 <w:lang w:val="vi-VN"/>
               </w:rPr>
-              <w:t xml:space="preserve">5.620,0</w:t>
+              <w:t xml:space="preserve">4.510,6</w:t>
             </w:r>
           </w:p>
         </w:tc>
@@ -12230,7 +11765,7 @@
                 <w:szCs w:val="18"/>
                 <w:lang w:val="vi-VN"/>
               </w:rPr>
-              <w:t xml:space="preserve">253,2</w:t>
+              <w:t xml:space="preserve">223,6</w:t>
             </w:r>
           </w:p>
         </w:tc>
@@ -12368,7 +11903,7 @@
                 <w:szCs w:val="18"/>
                 <w:lang w:val="vi-VN"/>
               </w:rPr>
-              <w:t xml:space="preserve">17,0</w:t>
+              <w:t xml:space="preserve">15,0</w:t>
             </w:r>
           </w:p>
         </w:tc>
@@ -13148,7 +12683,7 @@
           <w:szCs w:val="20"/>
           <w:lang w:val="vi-VN"/>
         </w:rPr>
-        <w:t xml:space="preserve">Bảng từng cọc khoan nhồi (188 cọc), từng bước tính của mỗi đế và chiều dài cắt 215 dây: xem file HOBANMONG_BANG_TINH_NEO.xlsx.</w:t>
+        <w:t xml:space="preserve">Bảng từng cọc khoan nhồi (188 cọc), từng bước tính của mỗi đế và chiều dài cắt 211 dây: xem file HOBANMONG_BANG_TINH_NEO.xlsx.</w:t>
       </w:r>
     </w:p>
     <w:sectPr>

</xml_diff>